<commit_message>
Docs: update Research Portal docs to v3.2.0 with all April 2026 features
</commit_message>
<xml_diff>
--- a/ahgResearchPlugin/docs/AtoM_Heratio_Research_Portal_Feature_Overview.docx
+++ b/ahgResearchPlugin/docs/AtoM_Heratio_Research_Portal_Feature_Overview.docx
@@ -7,7 +7,7 @@
         <w:pStyle w:val="Title"/>
       </w:pPr>
       <w:r>
-        <w:t xml:space="preserve">AtoM Heratio Research Portal — Feature Overview</w:t>
+        <w:t xml:space="preserve">AtoM Heratio Research Portal Feature Overview</w:t>
       </w:r>
     </w:p>
     <w:p>
@@ -18,15 +18,7 @@
         <w:t xml:space="preserve">The Archive and Heritage Group (Pty) Ltd</w:t>
       </w:r>
     </w:p>
-    <w:p>
-      <w:pPr>
-        <w:pStyle w:val="Date"/>
-      </w:pPr>
-      <w:r>
-        <w:t xml:space="preserve">February 2026</w:t>
-      </w:r>
-    </w:p>
-    <w:bookmarkStart w:id="39" w:name="Xda22e62a7895c8082526974830cb0c70ed7d866"/>
+    <w:bookmarkStart w:id="43" w:name="Xda22e62a7895c8082526974830cb0c70ed7d866"/>
     <w:p>
       <w:pPr>
         <w:pStyle w:val="Heading1"/>
@@ -66,7 +58,7 @@
         <w:t xml:space="preserve"> </w:t>
       </w:r>
       <w:r>
-        <w:t xml:space="preserve">3.1.0</w:t>
+        <w:t xml:space="preserve">3.2.0</w:t>
       </w:r>
       <w:r>
         <w:t xml:space="preserve"> </w:t>
@@ -114,7 +106,7 @@
         <w:t xml:space="preserve"> </w:t>
       </w:r>
       <w:r>
-        <w:t xml:space="preserve">February 2026</w:t>
+        <w:t xml:space="preserve">April 2026</w:t>
       </w:r>
     </w:p>
     <w:p>
@@ -157,7 +149,7 @@
       </w:r>
     </w:p>
     <w:bookmarkEnd w:id="20"/>
-    <w:bookmarkStart w:id="33" w:name="key-feature-areas"/>
+    <w:bookmarkStart w:id="37" w:name="key-feature-areas"/>
     <w:p>
       <w:pPr>
         <w:pStyle w:val="Heading2"/>
@@ -976,21 +968,13 @@
       </w:tr>
     </w:tbl>
     <w:bookmarkEnd w:id="24"/>
-    <w:bookmarkStart w:id="25" w:name="request-lifecycle-and-sla"/>
+    <w:bookmarkStart w:id="25" w:name="a.-equipment-management"/>
     <w:p>
       <w:pPr>
         <w:pStyle w:val="Heading3"/>
       </w:pPr>
       <w:r>
-        <w:t xml:space="preserve">5. Request Lifecycle and SLA</w:t>
-      </w:r>
-    </w:p>
-    <w:p>
-      <w:pPr>
-        <w:pStyle w:val="FirstParagraph"/>
-      </w:pPr>
-      <w:r>
-        <w:t xml:space="preserve">End-to-end lifecycle management for material and reproduction requests:</w:t>
+        <w:t xml:space="preserve">4a. Equipment Management</w:t>
       </w:r>
     </w:p>
     <w:tbl>
@@ -1042,226 +1026,144 @@
               <w:jc w:val="left"/>
             </w:pPr>
             <w:r>
-              <w:t xml:space="preserve">Requests dashboard</w:t>
-            </w:r>
-          </w:p>
-        </w:tc>
-        <w:tc>
-          <w:tcPr/>
-          <w:p>
-            <w:pPr>
-              <w:pStyle w:val="Compact"/>
-              <w:jc w:val="left"/>
-            </w:pPr>
-            <w:r>
-              <w:t xml:space="preserve">Combined view of all material and reproduction requests with SLA status badges</w:t>
-            </w:r>
-          </w:p>
-        </w:tc>
-      </w:tr>
-      <w:tr>
-        <w:tc>
-          <w:tcPr/>
-          <w:p>
-            <w:pPr>
-              <w:pStyle w:val="Compact"/>
-              <w:jc w:val="left"/>
-            </w:pPr>
-            <w:r>
-              <w:t xml:space="preserve">Triage workflow</w:t>
-            </w:r>
-          </w:p>
-        </w:tc>
-        <w:tc>
-          <w:tcPr/>
-          <w:p>
-            <w:pPr>
-              <w:pStyle w:val="Compact"/>
-              <w:jc w:val="left"/>
-            </w:pPr>
-            <w:r>
-              <w:t xml:space="preserve">Every request is triaged (approve, deny, needs information) before processing begins</w:t>
-            </w:r>
-          </w:p>
-        </w:tc>
-      </w:tr>
-      <w:tr>
-        <w:tc>
-          <w:tcPr/>
-          <w:p>
-            <w:pPr>
-              <w:pStyle w:val="Compact"/>
-              <w:jc w:val="left"/>
-            </w:pPr>
-            <w:r>
-              <w:t xml:space="preserve">SLA tracking</w:t>
-            </w:r>
-          </w:p>
-        </w:tc>
-        <w:tc>
-          <w:tcPr/>
-          <w:p>
-            <w:pPr>
-              <w:pStyle w:val="Compact"/>
-              <w:jc w:val="left"/>
-            </w:pPr>
-            <w:r>
-              <w:t xml:space="preserve">Configurable SLA policies with warning, due, and escalation thresholds</w:t>
-            </w:r>
-          </w:p>
-        </w:tc>
-      </w:tr>
-      <w:tr>
-        <w:tc>
-          <w:tcPr/>
-          <w:p>
-            <w:pPr>
-              <w:pStyle w:val="Compact"/>
-              <w:jc w:val="left"/>
-            </w:pPr>
-            <w:r>
-              <w:t xml:space="preserve">Staff assignment</w:t>
-            </w:r>
-          </w:p>
-        </w:tc>
-        <w:tc>
-          <w:tcPr/>
-          <w:p>
-            <w:pPr>
-              <w:pStyle w:val="Compact"/>
-              <w:jc w:val="left"/>
-            </w:pPr>
-            <w:r>
-              <w:t xml:space="preserve">Assign requests to specific staff members for fulfilment</w:t>
-            </w:r>
-          </w:p>
-        </w:tc>
-      </w:tr>
-      <w:tr>
-        <w:tc>
-          <w:tcPr/>
-          <w:p>
-            <w:pPr>
-              <w:pStyle w:val="Compact"/>
-              <w:jc w:val="left"/>
-            </w:pPr>
-            <w:r>
-              <w:t xml:space="preserve">Correspondence</w:t>
-            </w:r>
-          </w:p>
-        </w:tc>
-        <w:tc>
-          <w:tcPr/>
-          <w:p>
-            <w:pPr>
-              <w:pStyle w:val="Compact"/>
-              <w:jc w:val="left"/>
-            </w:pPr>
-            <w:r>
-              <w:t xml:space="preserve">Built-in threaded messaging between staff and researchers, with internal staff-only notes</w:t>
-            </w:r>
-          </w:p>
-        </w:tc>
-      </w:tr>
-      <w:tr>
-        <w:tc>
-          <w:tcPr/>
-          <w:p>
-            <w:pPr>
-              <w:pStyle w:val="Compact"/>
-              <w:jc w:val="left"/>
-            </w:pPr>
-            <w:r>
-              <w:t xml:space="preserve">Request closure</w:t>
-            </w:r>
-          </w:p>
-        </w:tc>
-        <w:tc>
-          <w:tcPr/>
-          <w:p>
-            <w:pPr>
-              <w:pStyle w:val="Compact"/>
-              <w:jc w:val="left"/>
-            </w:pPr>
-            <w:r>
-              <w:t xml:space="preserve">Close requests with a reason (fulfilled, cancelled, duplicate, unable to fulfil)</w:t>
-            </w:r>
-          </w:p>
-        </w:tc>
-      </w:tr>
-      <w:tr>
-        <w:tc>
-          <w:tcPr/>
-          <w:p>
-            <w:pPr>
-              <w:pStyle w:val="Compact"/>
-              <w:jc w:val="left"/>
-            </w:pPr>
-            <w:r>
-              <w:t xml:space="preserve">Audit trail</w:t>
-            </w:r>
-          </w:p>
-        </w:tc>
-        <w:tc>
-          <w:tcPr/>
-          <w:p>
-            <w:pPr>
-              <w:pStyle w:val="Compact"/>
-              <w:jc w:val="left"/>
-            </w:pPr>
-            <w:r>
-              <w:t xml:space="preserve">Every status change, triage decision, assignment, and correspondence entry is logged</w:t>
-            </w:r>
-          </w:p>
-        </w:tc>
-      </w:tr>
-      <w:tr>
-        <w:tc>
-          <w:tcPr/>
-          <w:p>
-            <w:pPr>
-              <w:pStyle w:val="Compact"/>
-              <w:jc w:val="left"/>
-            </w:pPr>
-            <w:r>
-              <w:t xml:space="preserve">“</w:t>
-            </w:r>
-            <w:r>
-              <w:t xml:space="preserve">Request this item</w:t>
-            </w:r>
-            <w:r>
-              <w:t xml:space="preserve">”</w:t>
-            </w:r>
-            <w:r>
-              <w:t xml:space="preserve"> </w:t>
-            </w:r>
-            <w:r>
-              <w:t xml:space="preserve">button</w:t>
-            </w:r>
-          </w:p>
-        </w:tc>
-        <w:tc>
-          <w:tcPr/>
-          <w:p>
-            <w:pPr>
-              <w:pStyle w:val="Compact"/>
-              <w:jc w:val="left"/>
-            </w:pPr>
-            <w:r>
-              <w:t xml:space="preserve">Researchers can request materials directly from catalogue description pages</w:t>
+              <w:t xml:space="preserve">Equipment inventory</w:t>
+            </w:r>
+          </w:p>
+        </w:tc>
+        <w:tc>
+          <w:tcPr/>
+          <w:p>
+            <w:pPr>
+              <w:pStyle w:val="Compact"/>
+              <w:jc w:val="left"/>
+            </w:pPr>
+            <w:r>
+              <w:t xml:space="preserve">Track equipment per reading room with type, brand, model, serial number, and condition</w:t>
+            </w:r>
+          </w:p>
+        </w:tc>
+      </w:tr>
+      <w:tr>
+        <w:tc>
+          <w:tcPr/>
+          <w:p>
+            <w:pPr>
+              <w:pStyle w:val="Compact"/>
+              <w:jc w:val="left"/>
+            </w:pPr>
+            <w:r>
+              <w:t xml:space="preserve">Equipment types</w:t>
+            </w:r>
+          </w:p>
+        </w:tc>
+        <w:tc>
+          <w:tcPr/>
+          <w:p>
+            <w:pPr>
+              <w:pStyle w:val="Compact"/>
+              <w:jc w:val="left"/>
+            </w:pPr>
+            <w:r>
+              <w:t xml:space="preserve">Managed via Dropdown Manager — admin-configurable (Microfilm Reader, Scanner, Computer, etc.)</w:t>
+            </w:r>
+          </w:p>
+        </w:tc>
+      </w:tr>
+      <w:tr>
+        <w:tc>
+          <w:tcPr/>
+          <w:p>
+            <w:pPr>
+              <w:pStyle w:val="Compact"/>
+              <w:jc w:val="left"/>
+            </w:pPr>
+            <w:r>
+              <w:t xml:space="preserve">Equipment booking</w:t>
+            </w:r>
+          </w:p>
+        </w:tc>
+        <w:tc>
+          <w:tcPr/>
+          <w:p>
+            <w:pPr>
+              <w:pStyle w:val="Compact"/>
+              <w:jc w:val="left"/>
+            </w:pPr>
+            <w:r>
+              <w:t xml:space="preserve">Researchers book equipment alongside reading room sessions</w:t>
+            </w:r>
+          </w:p>
+        </w:tc>
+      </w:tr>
+      <w:tr>
+        <w:tc>
+          <w:tcPr/>
+          <w:p>
+            <w:pPr>
+              <w:pStyle w:val="Compact"/>
+              <w:jc w:val="left"/>
+            </w:pPr>
+            <w:r>
+              <w:t xml:space="preserve">Maintenance logging</w:t>
+            </w:r>
+          </w:p>
+        </w:tc>
+        <w:tc>
+          <w:tcPr/>
+          <w:p>
+            <w:pPr>
+              <w:pStyle w:val="Compact"/>
+              <w:jc w:val="left"/>
+            </w:pPr>
+            <w:r>
+              <w:t xml:space="preserve">Log maintenance actions with condition before/after, performer, and next maintenance date</w:t>
+            </w:r>
+          </w:p>
+        </w:tc>
+      </w:tr>
+      <w:tr>
+        <w:tc>
+          <w:tcPr/>
+          <w:p>
+            <w:pPr>
+              <w:pStyle w:val="Compact"/>
+              <w:jc w:val="left"/>
+            </w:pPr>
+            <w:r>
+              <w:t xml:space="preserve">Maintenance history</w:t>
+            </w:r>
+          </w:p>
+        </w:tc>
+        <w:tc>
+          <w:tcPr/>
+          <w:p>
+            <w:pPr>
+              <w:pStyle w:val="Compact"/>
+              <w:jc w:val="left"/>
+            </w:pPr>
+            <w:r>
+              <w:t xml:space="preserve">Full audit trail of all maintenance per equipment item with AJAX-loaded history viewer</w:t>
             </w:r>
           </w:p>
         </w:tc>
       </w:tr>
     </w:tbl>
     <w:bookmarkEnd w:id="25"/>
-    <w:bookmarkStart w:id="26" w:name="reproduction-requests"/>
+    <w:bookmarkStart w:id="26" w:name="request-lifecycle-and-sla"/>
     <w:p>
       <w:pPr>
         <w:pStyle w:val="Heading3"/>
       </w:pPr>
       <w:r>
-        <w:t xml:space="preserve">6. Reproduction Requests</w:t>
+        <w:t xml:space="preserve">5. Request Lifecycle and SLA</w:t>
+      </w:r>
+    </w:p>
+    <w:p>
+      <w:pPr>
+        <w:pStyle w:val="FirstParagraph"/>
+      </w:pPr>
+      <w:r>
+        <w:t xml:space="preserve">End-to-end lifecycle management for material and reproduction requests:</w:t>
       </w:r>
     </w:p>
     <w:tbl>
@@ -1313,162 +1215,226 @@
               <w:jc w:val="left"/>
             </w:pPr>
             <w:r>
-              <w:t xml:space="preserve">Online submission</w:t>
-            </w:r>
-          </w:p>
-        </w:tc>
-        <w:tc>
-          <w:tcPr/>
-          <w:p>
-            <w:pPr>
-              <w:pStyle w:val="Compact"/>
-              <w:jc w:val="left"/>
-            </w:pPr>
-            <w:r>
-              <w:t xml:space="preserve">Researchers submit reproduction requests with purpose, format, quality, and delivery preferences</w:t>
-            </w:r>
-          </w:p>
-        </w:tc>
-      </w:tr>
-      <w:tr>
-        <w:tc>
-          <w:tcPr/>
-          <w:p>
-            <w:pPr>
-              <w:pStyle w:val="Compact"/>
-              <w:jc w:val="left"/>
-            </w:pPr>
-            <w:r>
-              <w:t xml:space="preserve">Item-level detail</w:t>
-            </w:r>
-          </w:p>
-        </w:tc>
-        <w:tc>
-          <w:tcPr/>
-          <w:p>
-            <w:pPr>
-              <w:pStyle w:val="Compact"/>
-              <w:jc w:val="left"/>
-            </w:pPr>
-            <w:r>
-              <w:t xml:space="preserve">Add specific items with page/section requirements and per-item notes</w:t>
-            </w:r>
-          </w:p>
-        </w:tc>
-      </w:tr>
-      <w:tr>
-        <w:tc>
-          <w:tcPr/>
-          <w:p>
-            <w:pPr>
-              <w:pStyle w:val="Compact"/>
-              <w:jc w:val="left"/>
-            </w:pPr>
-            <w:r>
-              <w:t xml:space="preserve">Pricing engine</w:t>
-            </w:r>
-          </w:p>
-        </w:tc>
-        <w:tc>
-          <w:tcPr/>
-          <w:p>
-            <w:pPr>
-              <w:pStyle w:val="Compact"/>
-              <w:jc w:val="left"/>
-            </w:pPr>
-            <w:r>
-              <w:t xml:space="preserve">Costs calculated based on item count, format, quality, and urgency</w:t>
-            </w:r>
-          </w:p>
-        </w:tc>
-      </w:tr>
-      <w:tr>
-        <w:tc>
-          <w:tcPr/>
-          <w:p>
-            <w:pPr>
-              <w:pStyle w:val="Compact"/>
-              <w:jc w:val="left"/>
-            </w:pPr>
-            <w:r>
-              <w:t xml:space="preserve">Invoice generation</w:t>
-            </w:r>
-          </w:p>
-        </w:tc>
-        <w:tc>
-          <w:tcPr/>
-          <w:p>
-            <w:pPr>
-              <w:pStyle w:val="Compact"/>
-              <w:jc w:val="left"/>
-            </w:pPr>
-            <w:r>
-              <w:t xml:space="preserve">Staff generate invoices attached to reproduction requests</w:t>
-            </w:r>
-          </w:p>
-        </w:tc>
-      </w:tr>
-      <w:tr>
-        <w:tc>
-          <w:tcPr/>
-          <w:p>
-            <w:pPr>
-              <w:pStyle w:val="Compact"/>
-              <w:jc w:val="left"/>
-            </w:pPr>
-            <w:r>
-              <w:t xml:space="preserve">File delivery</w:t>
-            </w:r>
-          </w:p>
-        </w:tc>
-        <w:tc>
-          <w:tcPr/>
-          <w:p>
-            <w:pPr>
-              <w:pStyle w:val="Compact"/>
-              <w:jc w:val="left"/>
-            </w:pPr>
-            <w:r>
-              <w:t xml:space="preserve">Completed reproductions are uploaded with unique download tokens</w:t>
-            </w:r>
-          </w:p>
-        </w:tc>
-      </w:tr>
-      <w:tr>
-        <w:tc>
-          <w:tcPr/>
-          <w:p>
-            <w:pPr>
-              <w:pStyle w:val="Compact"/>
-              <w:jc w:val="left"/>
-            </w:pPr>
-            <w:r>
-              <w:t xml:space="preserve">Download audit</w:t>
-            </w:r>
-          </w:p>
-        </w:tc>
-        <w:tc>
-          <w:tcPr/>
-          <w:p>
-            <w:pPr>
-              <w:pStyle w:val="Compact"/>
-              <w:jc w:val="left"/>
-            </w:pPr>
-            <w:r>
-              <w:t xml:space="preserve">Every download is logged for compliance</w:t>
+              <w:t xml:space="preserve">Requests dashboard</w:t>
+            </w:r>
+          </w:p>
+        </w:tc>
+        <w:tc>
+          <w:tcPr/>
+          <w:p>
+            <w:pPr>
+              <w:pStyle w:val="Compact"/>
+              <w:jc w:val="left"/>
+            </w:pPr>
+            <w:r>
+              <w:t xml:space="preserve">Combined view of all material and reproduction requests with SLA status badges</w:t>
+            </w:r>
+          </w:p>
+        </w:tc>
+      </w:tr>
+      <w:tr>
+        <w:tc>
+          <w:tcPr/>
+          <w:p>
+            <w:pPr>
+              <w:pStyle w:val="Compact"/>
+              <w:jc w:val="left"/>
+            </w:pPr>
+            <w:r>
+              <w:t xml:space="preserve">Triage workflow</w:t>
+            </w:r>
+          </w:p>
+        </w:tc>
+        <w:tc>
+          <w:tcPr/>
+          <w:p>
+            <w:pPr>
+              <w:pStyle w:val="Compact"/>
+              <w:jc w:val="left"/>
+            </w:pPr>
+            <w:r>
+              <w:t xml:space="preserve">Every request is triaged (approve, deny, needs information) before processing begins</w:t>
+            </w:r>
+          </w:p>
+        </w:tc>
+      </w:tr>
+      <w:tr>
+        <w:tc>
+          <w:tcPr/>
+          <w:p>
+            <w:pPr>
+              <w:pStyle w:val="Compact"/>
+              <w:jc w:val="left"/>
+            </w:pPr>
+            <w:r>
+              <w:t xml:space="preserve">SLA tracking</w:t>
+            </w:r>
+          </w:p>
+        </w:tc>
+        <w:tc>
+          <w:tcPr/>
+          <w:p>
+            <w:pPr>
+              <w:pStyle w:val="Compact"/>
+              <w:jc w:val="left"/>
+            </w:pPr>
+            <w:r>
+              <w:t xml:space="preserve">Configurable SLA policies with warning, due, and escalation thresholds</w:t>
+            </w:r>
+          </w:p>
+        </w:tc>
+      </w:tr>
+      <w:tr>
+        <w:tc>
+          <w:tcPr/>
+          <w:p>
+            <w:pPr>
+              <w:pStyle w:val="Compact"/>
+              <w:jc w:val="left"/>
+            </w:pPr>
+            <w:r>
+              <w:t xml:space="preserve">Staff assignment</w:t>
+            </w:r>
+          </w:p>
+        </w:tc>
+        <w:tc>
+          <w:tcPr/>
+          <w:p>
+            <w:pPr>
+              <w:pStyle w:val="Compact"/>
+              <w:jc w:val="left"/>
+            </w:pPr>
+            <w:r>
+              <w:t xml:space="preserve">Assign requests to specific staff members for fulfilment</w:t>
+            </w:r>
+          </w:p>
+        </w:tc>
+      </w:tr>
+      <w:tr>
+        <w:tc>
+          <w:tcPr/>
+          <w:p>
+            <w:pPr>
+              <w:pStyle w:val="Compact"/>
+              <w:jc w:val="left"/>
+            </w:pPr>
+            <w:r>
+              <w:t xml:space="preserve">Correspondence</w:t>
+            </w:r>
+          </w:p>
+        </w:tc>
+        <w:tc>
+          <w:tcPr/>
+          <w:p>
+            <w:pPr>
+              <w:pStyle w:val="Compact"/>
+              <w:jc w:val="left"/>
+            </w:pPr>
+            <w:r>
+              <w:t xml:space="preserve">Built-in threaded messaging between staff and researchers, with internal staff-only notes</w:t>
+            </w:r>
+          </w:p>
+        </w:tc>
+      </w:tr>
+      <w:tr>
+        <w:tc>
+          <w:tcPr/>
+          <w:p>
+            <w:pPr>
+              <w:pStyle w:val="Compact"/>
+              <w:jc w:val="left"/>
+            </w:pPr>
+            <w:r>
+              <w:t xml:space="preserve">Request closure</w:t>
+            </w:r>
+          </w:p>
+        </w:tc>
+        <w:tc>
+          <w:tcPr/>
+          <w:p>
+            <w:pPr>
+              <w:pStyle w:val="Compact"/>
+              <w:jc w:val="left"/>
+            </w:pPr>
+            <w:r>
+              <w:t xml:space="preserve">Close requests with a reason (fulfilled, cancelled, duplicate, unable to fulfil)</w:t>
+            </w:r>
+          </w:p>
+        </w:tc>
+      </w:tr>
+      <w:tr>
+        <w:tc>
+          <w:tcPr/>
+          <w:p>
+            <w:pPr>
+              <w:pStyle w:val="Compact"/>
+              <w:jc w:val="left"/>
+            </w:pPr>
+            <w:r>
+              <w:t xml:space="preserve">Audit trail</w:t>
+            </w:r>
+          </w:p>
+        </w:tc>
+        <w:tc>
+          <w:tcPr/>
+          <w:p>
+            <w:pPr>
+              <w:pStyle w:val="Compact"/>
+              <w:jc w:val="left"/>
+            </w:pPr>
+            <w:r>
+              <w:t xml:space="preserve">Every status change, triage decision, assignment, and correspondence entry is logged</w:t>
+            </w:r>
+          </w:p>
+        </w:tc>
+      </w:tr>
+      <w:tr>
+        <w:tc>
+          <w:tcPr/>
+          <w:p>
+            <w:pPr>
+              <w:pStyle w:val="Compact"/>
+              <w:jc w:val="left"/>
+            </w:pPr>
+            <w:r>
+              <w:t xml:space="preserve">“</w:t>
+            </w:r>
+            <w:r>
+              <w:t xml:space="preserve">Request this item</w:t>
+            </w:r>
+            <w:r>
+              <w:t xml:space="preserve">”</w:t>
+            </w:r>
+            <w:r>
+              <w:t xml:space="preserve"> </w:t>
+            </w:r>
+            <w:r>
+              <w:t xml:space="preserve">button</w:t>
+            </w:r>
+          </w:p>
+        </w:tc>
+        <w:tc>
+          <w:tcPr/>
+          <w:p>
+            <w:pPr>
+              <w:pStyle w:val="Compact"/>
+              <w:jc w:val="left"/>
+            </w:pPr>
+            <w:r>
+              <w:t xml:space="preserve">Researchers can request materials directly from catalogue description pages</w:t>
             </w:r>
           </w:p>
         </w:tc>
       </w:tr>
     </w:tbl>
     <w:bookmarkEnd w:id="26"/>
-    <w:bookmarkStart w:id="27" w:name="collections-and-discovery"/>
+    <w:bookmarkStart w:id="27" w:name="reproduction-requests"/>
     <w:p>
       <w:pPr>
         <w:pStyle w:val="Heading3"/>
       </w:pPr>
       <w:r>
-        <w:t xml:space="preserve">7. Collections and Discovery</w:t>
+        <w:t xml:space="preserve">6. Reproduction Requests</w:t>
       </w:r>
     </w:p>
     <w:tbl>
@@ -1520,110 +1486,214 @@
               <w:jc w:val="left"/>
             </w:pPr>
             <w:r>
-              <w:t xml:space="preserve">Personal collections</w:t>
-            </w:r>
-          </w:p>
-        </w:tc>
-        <w:tc>
-          <w:tcPr/>
-          <w:p>
-            <w:pPr>
-              <w:pStyle w:val="Compact"/>
-              <w:jc w:val="left"/>
-            </w:pPr>
-            <w:r>
-              <w:t xml:space="preserve">Researchers create and manage personal groupings of archival items</w:t>
-            </w:r>
-          </w:p>
-        </w:tc>
-      </w:tr>
-      <w:tr>
-        <w:tc>
-          <w:tcPr/>
-          <w:p>
-            <w:pPr>
-              <w:pStyle w:val="Compact"/>
-              <w:jc w:val="left"/>
-            </w:pPr>
-            <w:r>
-              <w:t xml:space="preserve">Saved searches</w:t>
-            </w:r>
-          </w:p>
-        </w:tc>
-        <w:tc>
-          <w:tcPr/>
-          <w:p>
-            <w:pPr>
-              <w:pStyle w:val="Compact"/>
-              <w:jc w:val="left"/>
-            </w:pPr>
-            <w:r>
-              <w:t xml:space="preserve">Save search queries and receive notifications when new results appear</w:t>
-            </w:r>
-          </w:p>
-        </w:tc>
-      </w:tr>
-      <w:tr>
-        <w:tc>
-          <w:tcPr/>
-          <w:p>
-            <w:pPr>
-              <w:pStyle w:val="Compact"/>
-              <w:jc w:val="left"/>
-            </w:pPr>
-            <w:r>
-              <w:t xml:space="preserve">Search result diffing</w:t>
-            </w:r>
-          </w:p>
-        </w:tc>
-        <w:tc>
-          <w:tcPr/>
-          <w:p>
-            <w:pPr>
-              <w:pStyle w:val="Compact"/>
-              <w:jc w:val="left"/>
-            </w:pPr>
-            <w:r>
-              <w:t xml:space="preserve">Compare search results over time using snapshots</w:t>
-            </w:r>
-          </w:p>
-        </w:tc>
-      </w:tr>
-      <w:tr>
-        <w:tc>
-          <w:tcPr/>
-          <w:p>
-            <w:pPr>
-              <w:pStyle w:val="Compact"/>
-              <w:jc w:val="left"/>
-            </w:pPr>
-            <w:r>
-              <w:t xml:space="preserve">Citation generation</w:t>
-            </w:r>
-          </w:p>
-        </w:tc>
-        <w:tc>
-          <w:tcPr/>
-          <w:p>
-            <w:pPr>
-              <w:pStyle w:val="Compact"/>
-              <w:jc w:val="left"/>
-            </w:pPr>
-            <w:r>
-              <w:t xml:space="preserve">Generate citations in 6 academic styles (APA, MLA, Chicago, Harvard, Turabian, IEEE)</w:t>
+              <w:t xml:space="preserve">Online submission</w:t>
+            </w:r>
+          </w:p>
+        </w:tc>
+        <w:tc>
+          <w:tcPr/>
+          <w:p>
+            <w:pPr>
+              <w:pStyle w:val="Compact"/>
+              <w:jc w:val="left"/>
+            </w:pPr>
+            <w:r>
+              <w:t xml:space="preserve">Researchers submit reproduction requests with purpose, format, quality, and delivery preferences</w:t>
+            </w:r>
+          </w:p>
+        </w:tc>
+      </w:tr>
+      <w:tr>
+        <w:tc>
+          <w:tcPr/>
+          <w:p>
+            <w:pPr>
+              <w:pStyle w:val="Compact"/>
+              <w:jc w:val="left"/>
+            </w:pPr>
+            <w:r>
+              <w:t xml:space="preserve">Inline first item</w:t>
+            </w:r>
+          </w:p>
+        </w:tc>
+        <w:tc>
+          <w:tcPr/>
+          <w:p>
+            <w:pPr>
+              <w:pStyle w:val="Compact"/>
+              <w:jc w:val="left"/>
+            </w:pPr>
+            <w:r>
+              <w:t xml:space="preserve">Add the first archive item (with TomSelect autocomplete) directly on the creation form — type, format, specifications</w:t>
+            </w:r>
+          </w:p>
+        </w:tc>
+      </w:tr>
+      <w:tr>
+        <w:tc>
+          <w:tcPr/>
+          <w:p>
+            <w:pPr>
+              <w:pStyle w:val="Compact"/>
+              <w:jc w:val="left"/>
+            </w:pPr>
+            <w:r>
+              <w:t xml:space="preserve">ODRL enforcement</w:t>
+            </w:r>
+          </w:p>
+        </w:tc>
+        <w:tc>
+          <w:tcPr/>
+          <w:p>
+            <w:pPr>
+              <w:pStyle w:val="Compact"/>
+              <w:jc w:val="left"/>
+            </w:pPr>
+            <w:r>
+              <w:t xml:space="preserve">Reproduction requests are checked against ODRL policies before creation</w:t>
+            </w:r>
+          </w:p>
+        </w:tc>
+      </w:tr>
+      <w:tr>
+        <w:tc>
+          <w:tcPr/>
+          <w:p>
+            <w:pPr>
+              <w:pStyle w:val="Compact"/>
+              <w:jc w:val="left"/>
+            </w:pPr>
+            <w:r>
+              <w:t xml:space="preserve">Item-level detail</w:t>
+            </w:r>
+          </w:p>
+        </w:tc>
+        <w:tc>
+          <w:tcPr/>
+          <w:p>
+            <w:pPr>
+              <w:pStyle w:val="Compact"/>
+              <w:jc w:val="left"/>
+            </w:pPr>
+            <w:r>
+              <w:t xml:space="preserve">Add specific items with page/section requirements and per-item notes</w:t>
+            </w:r>
+          </w:p>
+        </w:tc>
+      </w:tr>
+      <w:tr>
+        <w:tc>
+          <w:tcPr/>
+          <w:p>
+            <w:pPr>
+              <w:pStyle w:val="Compact"/>
+              <w:jc w:val="left"/>
+            </w:pPr>
+            <w:r>
+              <w:t xml:space="preserve">Pricing engine</w:t>
+            </w:r>
+          </w:p>
+        </w:tc>
+        <w:tc>
+          <w:tcPr/>
+          <w:p>
+            <w:pPr>
+              <w:pStyle w:val="Compact"/>
+              <w:jc w:val="left"/>
+            </w:pPr>
+            <w:r>
+              <w:t xml:space="preserve">Costs calculated based on item count, format, quality, and urgency</w:t>
+            </w:r>
+          </w:p>
+        </w:tc>
+      </w:tr>
+      <w:tr>
+        <w:tc>
+          <w:tcPr/>
+          <w:p>
+            <w:pPr>
+              <w:pStyle w:val="Compact"/>
+              <w:jc w:val="left"/>
+            </w:pPr>
+            <w:r>
+              <w:t xml:space="preserve">Invoice generation</w:t>
+            </w:r>
+          </w:p>
+        </w:tc>
+        <w:tc>
+          <w:tcPr/>
+          <w:p>
+            <w:pPr>
+              <w:pStyle w:val="Compact"/>
+              <w:jc w:val="left"/>
+            </w:pPr>
+            <w:r>
+              <w:t xml:space="preserve">Staff generate invoices attached to reproduction requests</w:t>
+            </w:r>
+          </w:p>
+        </w:tc>
+      </w:tr>
+      <w:tr>
+        <w:tc>
+          <w:tcPr/>
+          <w:p>
+            <w:pPr>
+              <w:pStyle w:val="Compact"/>
+              <w:jc w:val="left"/>
+            </w:pPr>
+            <w:r>
+              <w:t xml:space="preserve">File delivery</w:t>
+            </w:r>
+          </w:p>
+        </w:tc>
+        <w:tc>
+          <w:tcPr/>
+          <w:p>
+            <w:pPr>
+              <w:pStyle w:val="Compact"/>
+              <w:jc w:val="left"/>
+            </w:pPr>
+            <w:r>
+              <w:t xml:space="preserve">Completed reproductions are uploaded with unique download tokens</w:t>
+            </w:r>
+          </w:p>
+        </w:tc>
+      </w:tr>
+      <w:tr>
+        <w:tc>
+          <w:tcPr/>
+          <w:p>
+            <w:pPr>
+              <w:pStyle w:val="Compact"/>
+              <w:jc w:val="left"/>
+            </w:pPr>
+            <w:r>
+              <w:t xml:space="preserve">Download audit</w:t>
+            </w:r>
+          </w:p>
+        </w:tc>
+        <w:tc>
+          <w:tcPr/>
+          <w:p>
+            <w:pPr>
+              <w:pStyle w:val="Compact"/>
+              <w:jc w:val="left"/>
+            </w:pPr>
+            <w:r>
+              <w:t xml:space="preserve">Every download is logged for compliance</w:t>
             </w:r>
           </w:p>
         </w:tc>
       </w:tr>
     </w:tbl>
     <w:bookmarkEnd w:id="27"/>
-    <w:bookmarkStart w:id="28" w:name="annotations-and-knowledge-management"/>
+    <w:bookmarkStart w:id="28" w:name="collections-and-discovery"/>
     <w:p>
       <w:pPr>
         <w:pStyle w:val="Heading3"/>
       </w:pPr>
       <w:r>
-        <w:t xml:space="preserve">8. Annotations and Knowledge Management</w:t>
+        <w:t xml:space="preserve">7. Collections and Discovery</w:t>
       </w:r>
     </w:p>
     <w:tbl>
@@ -1675,162 +1745,110 @@
               <w:jc w:val="left"/>
             </w:pPr>
             <w:r>
-              <w:t xml:space="preserve">W3C Web Annotations</w:t>
-            </w:r>
-          </w:p>
-        </w:tc>
-        <w:tc>
-          <w:tcPr/>
-          <w:p>
-            <w:pPr>
-              <w:pStyle w:val="Compact"/>
-              <w:jc w:val="left"/>
-            </w:pPr>
-            <w:r>
-              <w:t xml:space="preserve">Standards-compliant annotations on archival items with IIIF import/export</w:t>
-            </w:r>
-          </w:p>
-        </w:tc>
-      </w:tr>
-      <w:tr>
-        <w:tc>
-          <w:tcPr/>
-          <w:p>
-            <w:pPr>
-              <w:pStyle w:val="Compact"/>
-              <w:jc w:val="left"/>
-            </w:pPr>
-            <w:r>
-              <w:t xml:space="preserve">Annotation Studio</w:t>
-            </w:r>
-          </w:p>
-        </w:tc>
-        <w:tc>
-          <w:tcPr/>
-          <w:p>
-            <w:pPr>
-              <w:pStyle w:val="Compact"/>
-              <w:jc w:val="left"/>
-            </w:pPr>
-            <w:r>
-              <w:t xml:space="preserve">Rich text editor for creating and managing annotations</w:t>
-            </w:r>
-          </w:p>
-        </w:tc>
-      </w:tr>
-      <w:tr>
-        <w:tc>
-          <w:tcPr/>
-          <w:p>
-            <w:pPr>
-              <w:pStyle w:val="Compact"/>
-              <w:jc w:val="left"/>
-            </w:pPr>
-            <w:r>
-              <w:t xml:space="preserve">Research journal</w:t>
-            </w:r>
-          </w:p>
-        </w:tc>
-        <w:tc>
-          <w:tcPr/>
-          <w:p>
-            <w:pPr>
-              <w:pStyle w:val="Compact"/>
-              <w:jc w:val="left"/>
-            </w:pPr>
-            <w:r>
-              <w:t xml:space="preserve">Personal research journal with dated entries</w:t>
-            </w:r>
-          </w:p>
-        </w:tc>
-      </w:tr>
-      <w:tr>
-        <w:tc>
-          <w:tcPr/>
-          <w:p>
-            <w:pPr>
-              <w:pStyle w:val="Compact"/>
-              <w:jc w:val="left"/>
-            </w:pPr>
-            <w:r>
-              <w:t xml:space="preserve">Hypotheses</w:t>
-            </w:r>
-          </w:p>
-        </w:tc>
-        <w:tc>
-          <w:tcPr/>
-          <w:p>
-            <w:pPr>
-              <w:pStyle w:val="Compact"/>
-              <w:jc w:val="left"/>
-            </w:pPr>
-            <w:r>
-              <w:t xml:space="preserve">Formal hypothesis tracking with evidence linking</w:t>
-            </w:r>
-          </w:p>
-        </w:tc>
-      </w:tr>
-      <w:tr>
-        <w:tc>
-          <w:tcPr/>
-          <w:p>
-            <w:pPr>
-              <w:pStyle w:val="Compact"/>
-              <w:jc w:val="left"/>
-            </w:pPr>
-            <w:r>
-              <w:t xml:space="preserve">Assertions</w:t>
-            </w:r>
-          </w:p>
-        </w:tc>
-        <w:tc>
-          <w:tcPr/>
-          <w:p>
-            <w:pPr>
-              <w:pStyle w:val="Compact"/>
-              <w:jc w:val="left"/>
-            </w:pPr>
-            <w:r>
-              <w:t xml:space="preserve">Subject-Predicate-Object triples for building knowledge graphs</w:t>
-            </w:r>
-          </w:p>
-        </w:tc>
-      </w:tr>
-      <w:tr>
-        <w:tc>
-          <w:tcPr/>
-          <w:p>
-            <w:pPr>
-              <w:pStyle w:val="Compact"/>
-              <w:jc w:val="left"/>
-            </w:pPr>
-            <w:r>
-              <w:t xml:space="preserve">Source assessment</w:t>
-            </w:r>
-          </w:p>
-        </w:tc>
-        <w:tc>
-          <w:tcPr/>
-          <w:p>
-            <w:pPr>
-              <w:pStyle w:val="Compact"/>
-              <w:jc w:val="left"/>
-            </w:pPr>
-            <w:r>
-              <w:t xml:space="preserve">Trust scoring and source credibility evaluation</w:t>
+              <w:t xml:space="preserve">Personal collections</w:t>
+            </w:r>
+          </w:p>
+        </w:tc>
+        <w:tc>
+          <w:tcPr/>
+          <w:p>
+            <w:pPr>
+              <w:pStyle w:val="Compact"/>
+              <w:jc w:val="left"/>
+            </w:pPr>
+            <w:r>
+              <w:t xml:space="preserve">Researchers create and manage personal groupings of archival items</w:t>
+            </w:r>
+          </w:p>
+        </w:tc>
+      </w:tr>
+      <w:tr>
+        <w:tc>
+          <w:tcPr/>
+          <w:p>
+            <w:pPr>
+              <w:pStyle w:val="Compact"/>
+              <w:jc w:val="left"/>
+            </w:pPr>
+            <w:r>
+              <w:t xml:space="preserve">Saved searches</w:t>
+            </w:r>
+          </w:p>
+        </w:tc>
+        <w:tc>
+          <w:tcPr/>
+          <w:p>
+            <w:pPr>
+              <w:pStyle w:val="Compact"/>
+              <w:jc w:val="left"/>
+            </w:pPr>
+            <w:r>
+              <w:t xml:space="preserve">Save search queries and receive notifications when new results appear</w:t>
+            </w:r>
+          </w:p>
+        </w:tc>
+      </w:tr>
+      <w:tr>
+        <w:tc>
+          <w:tcPr/>
+          <w:p>
+            <w:pPr>
+              <w:pStyle w:val="Compact"/>
+              <w:jc w:val="left"/>
+            </w:pPr>
+            <w:r>
+              <w:t xml:space="preserve">Search result diffing</w:t>
+            </w:r>
+          </w:p>
+        </w:tc>
+        <w:tc>
+          <w:tcPr/>
+          <w:p>
+            <w:pPr>
+              <w:pStyle w:val="Compact"/>
+              <w:jc w:val="left"/>
+            </w:pPr>
+            <w:r>
+              <w:t xml:space="preserve">Compare search results over time using snapshots</w:t>
+            </w:r>
+          </w:p>
+        </w:tc>
+      </w:tr>
+      <w:tr>
+        <w:tc>
+          <w:tcPr/>
+          <w:p>
+            <w:pPr>
+              <w:pStyle w:val="Compact"/>
+              <w:jc w:val="left"/>
+            </w:pPr>
+            <w:r>
+              <w:t xml:space="preserve">Citation generation</w:t>
+            </w:r>
+          </w:p>
+        </w:tc>
+        <w:tc>
+          <w:tcPr/>
+          <w:p>
+            <w:pPr>
+              <w:pStyle w:val="Compact"/>
+              <w:jc w:val="left"/>
+            </w:pPr>
+            <w:r>
+              <w:t xml:space="preserve">Generate citations in 6 academic styles (APA, MLA, Chicago, Harvard, Turabian, IEEE)</w:t>
             </w:r>
           </w:p>
         </w:tc>
       </w:tr>
     </w:tbl>
     <w:bookmarkEnd w:id="28"/>
-    <w:bookmarkStart w:id="29" w:name="collaboration"/>
+    <w:bookmarkStart w:id="29" w:name="annotations-and-knowledge-management"/>
     <w:p>
       <w:pPr>
         <w:pStyle w:val="Heading3"/>
       </w:pPr>
       <w:r>
-        <w:t xml:space="preserve">9. Collaboration</w:t>
+        <w:t xml:space="preserve">8. Annotations and Knowledge Management</w:t>
       </w:r>
     </w:p>
     <w:tbl>
@@ -1882,110 +1900,162 @@
               <w:jc w:val="left"/>
             </w:pPr>
             <w:r>
-              <w:t xml:space="preserve">Research projects</w:t>
-            </w:r>
-          </w:p>
-        </w:tc>
-        <w:tc>
-          <w:tcPr/>
-          <w:p>
-            <w:pPr>
-              <w:pStyle w:val="Compact"/>
-              <w:jc w:val="left"/>
-            </w:pPr>
-            <w:r>
-              <w:t xml:space="preserve">Create projects with collaborators, shared collections, and milestones</w:t>
-            </w:r>
-          </w:p>
-        </w:tc>
-      </w:tr>
-      <w:tr>
-        <w:tc>
-          <w:tcPr/>
-          <w:p>
-            <w:pPr>
-              <w:pStyle w:val="Compact"/>
-              <w:jc w:val="left"/>
-            </w:pPr>
-            <w:r>
-              <w:t xml:space="preserve">Workspaces</w:t>
-            </w:r>
-          </w:p>
-        </w:tc>
-        <w:tc>
-          <w:tcPr/>
-          <w:p>
-            <w:pPr>
-              <w:pStyle w:val="Compact"/>
-              <w:jc w:val="left"/>
-            </w:pPr>
-            <w:r>
-              <w:t xml:space="preserve">Shared workspaces for team research</w:t>
-            </w:r>
-          </w:p>
-        </w:tc>
-      </w:tr>
-      <w:tr>
-        <w:tc>
-          <w:tcPr/>
-          <w:p>
-            <w:pPr>
-              <w:pStyle w:val="Compact"/>
-              <w:jc w:val="left"/>
-            </w:pPr>
-            <w:r>
-              <w:t xml:space="preserve">Peer review</w:t>
-            </w:r>
-          </w:p>
-        </w:tc>
-        <w:tc>
-          <w:tcPr/>
-          <w:p>
-            <w:pPr>
-              <w:pStyle w:val="Compact"/>
-              <w:jc w:val="left"/>
-            </w:pPr>
-            <w:r>
-              <w:t xml:space="preserve">Invite peers to review and comment on research outputs</w:t>
-            </w:r>
-          </w:p>
-        </w:tc>
-      </w:tr>
-      <w:tr>
-        <w:tc>
-          <w:tcPr/>
-          <w:p>
-            <w:pPr>
-              <w:pStyle w:val="Compact"/>
-              <w:jc w:val="left"/>
-            </w:pPr>
-            <w:r>
-              <w:t xml:space="preserve">Institutional sharing</w:t>
-            </w:r>
-          </w:p>
-        </w:tc>
-        <w:tc>
-          <w:tcPr/>
-          <w:p>
-            <w:pPr>
-              <w:pStyle w:val="Compact"/>
-              <w:jc w:val="left"/>
-            </w:pPr>
-            <w:r>
-              <w:t xml:space="preserve">Share research across partner institutions</w:t>
+              <w:t xml:space="preserve">W3C Web Annotations</w:t>
+            </w:r>
+          </w:p>
+        </w:tc>
+        <w:tc>
+          <w:tcPr/>
+          <w:p>
+            <w:pPr>
+              <w:pStyle w:val="Compact"/>
+              <w:jc w:val="left"/>
+            </w:pPr>
+            <w:r>
+              <w:t xml:space="preserve">Standards-compliant annotations on archival items with IIIF import/export</w:t>
+            </w:r>
+          </w:p>
+        </w:tc>
+      </w:tr>
+      <w:tr>
+        <w:tc>
+          <w:tcPr/>
+          <w:p>
+            <w:pPr>
+              <w:pStyle w:val="Compact"/>
+              <w:jc w:val="left"/>
+            </w:pPr>
+            <w:r>
+              <w:t xml:space="preserve">Annotation Studio</w:t>
+            </w:r>
+          </w:p>
+        </w:tc>
+        <w:tc>
+          <w:tcPr/>
+          <w:p>
+            <w:pPr>
+              <w:pStyle w:val="Compact"/>
+              <w:jc w:val="left"/>
+            </w:pPr>
+            <w:r>
+              <w:t xml:space="preserve">Rich text editor for creating and managing annotations</w:t>
+            </w:r>
+          </w:p>
+        </w:tc>
+      </w:tr>
+      <w:tr>
+        <w:tc>
+          <w:tcPr/>
+          <w:p>
+            <w:pPr>
+              <w:pStyle w:val="Compact"/>
+              <w:jc w:val="left"/>
+            </w:pPr>
+            <w:r>
+              <w:t xml:space="preserve">Research journal</w:t>
+            </w:r>
+          </w:p>
+        </w:tc>
+        <w:tc>
+          <w:tcPr/>
+          <w:p>
+            <w:pPr>
+              <w:pStyle w:val="Compact"/>
+              <w:jc w:val="left"/>
+            </w:pPr>
+            <w:r>
+              <w:t xml:space="preserve">Personal research journal with dated entries</w:t>
+            </w:r>
+          </w:p>
+        </w:tc>
+      </w:tr>
+      <w:tr>
+        <w:tc>
+          <w:tcPr/>
+          <w:p>
+            <w:pPr>
+              <w:pStyle w:val="Compact"/>
+              <w:jc w:val="left"/>
+            </w:pPr>
+            <w:r>
+              <w:t xml:space="preserve">Hypotheses</w:t>
+            </w:r>
+          </w:p>
+        </w:tc>
+        <w:tc>
+          <w:tcPr/>
+          <w:p>
+            <w:pPr>
+              <w:pStyle w:val="Compact"/>
+              <w:jc w:val="left"/>
+            </w:pPr>
+            <w:r>
+              <w:t xml:space="preserve">Formal hypothesis tracking with evidence linking</w:t>
+            </w:r>
+          </w:p>
+        </w:tc>
+      </w:tr>
+      <w:tr>
+        <w:tc>
+          <w:tcPr/>
+          <w:p>
+            <w:pPr>
+              <w:pStyle w:val="Compact"/>
+              <w:jc w:val="left"/>
+            </w:pPr>
+            <w:r>
+              <w:t xml:space="preserve">Assertions</w:t>
+            </w:r>
+          </w:p>
+        </w:tc>
+        <w:tc>
+          <w:tcPr/>
+          <w:p>
+            <w:pPr>
+              <w:pStyle w:val="Compact"/>
+              <w:jc w:val="left"/>
+            </w:pPr>
+            <w:r>
+              <w:t xml:space="preserve">Subject-Predicate-Object triples for building knowledge graphs</w:t>
+            </w:r>
+          </w:p>
+        </w:tc>
+      </w:tr>
+      <w:tr>
+        <w:tc>
+          <w:tcPr/>
+          <w:p>
+            <w:pPr>
+              <w:pStyle w:val="Compact"/>
+              <w:jc w:val="left"/>
+            </w:pPr>
+            <w:r>
+              <w:t xml:space="preserve">Source assessment</w:t>
+            </w:r>
+          </w:p>
+        </w:tc>
+        <w:tc>
+          <w:tcPr/>
+          <w:p>
+            <w:pPr>
+              <w:pStyle w:val="Compact"/>
+              <w:jc w:val="left"/>
+            </w:pPr>
+            <w:r>
+              <w:t xml:space="preserve">Trust scoring and source credibility evaluation</w:t>
             </w:r>
           </w:p>
         </w:tc>
       </w:tr>
     </w:tbl>
     <w:bookmarkEnd w:id="29"/>
-    <w:bookmarkStart w:id="30" w:name="publishing-and-reproducibility"/>
+    <w:bookmarkStart w:id="30" w:name="collaboration"/>
     <w:p>
       <w:pPr>
         <w:pStyle w:val="Heading3"/>
       </w:pPr>
       <w:r>
-        <w:t xml:space="preserve">10. Publishing and Reproducibility</w:t>
+        <w:t xml:space="preserve">9. Collaboration</w:t>
       </w:r>
     </w:p>
     <w:tbl>
@@ -2037,162 +2107,188 @@
               <w:jc w:val="left"/>
             </w:pPr>
             <w:r>
-              <w:t xml:space="preserve">Bibliographies</w:t>
-            </w:r>
-          </w:p>
-        </w:tc>
-        <w:tc>
-          <w:tcPr/>
-          <w:p>
-            <w:pPr>
-              <w:pStyle w:val="Compact"/>
-              <w:jc w:val="left"/>
-            </w:pPr>
-            <w:r>
-              <w:t xml:space="preserve">Manage bibliographies with RIS, BibTeX, and Zotero export</w:t>
-            </w:r>
-          </w:p>
-        </w:tc>
-      </w:tr>
-      <w:tr>
-        <w:tc>
-          <w:tcPr/>
-          <w:p>
-            <w:pPr>
-              <w:pStyle w:val="Compact"/>
-              <w:jc w:val="left"/>
-            </w:pPr>
-            <w:r>
-              <w:t xml:space="preserve">Reports</w:t>
-            </w:r>
-          </w:p>
-        </w:tc>
-        <w:tc>
-          <w:tcPr/>
-          <w:p>
-            <w:pPr>
-              <w:pStyle w:val="Compact"/>
-              <w:jc w:val="left"/>
-            </w:pPr>
-            <w:r>
-              <w:t xml:space="preserve">Generate research reports in PDF and DOCX format with rich text editing</w:t>
-            </w:r>
-          </w:p>
-        </w:tc>
-      </w:tr>
-      <w:tr>
-        <w:tc>
-          <w:tcPr/>
-          <w:p>
-            <w:pPr>
-              <w:pStyle w:val="Compact"/>
-              <w:jc w:val="left"/>
-            </w:pPr>
-            <w:r>
-              <w:t xml:space="preserve">Immutable snapshots</w:t>
-            </w:r>
-          </w:p>
-        </w:tc>
-        <w:tc>
-          <w:tcPr/>
-          <w:p>
-            <w:pPr>
-              <w:pStyle w:val="Compact"/>
-              <w:jc w:val="left"/>
-            </w:pPr>
-            <w:r>
-              <w:t xml:space="preserve">Create hash-verified snapshots of research state for reproducibility</w:t>
-            </w:r>
-          </w:p>
-        </w:tc>
-      </w:tr>
-      <w:tr>
-        <w:tc>
-          <w:tcPr/>
-          <w:p>
-            <w:pPr>
-              <w:pStyle w:val="Compact"/>
-              <w:jc w:val="left"/>
-            </w:pPr>
-            <w:r>
-              <w:t xml:space="preserve">RO-Crate packaging</w:t>
-            </w:r>
-          </w:p>
-        </w:tc>
-        <w:tc>
-          <w:tcPr/>
-          <w:p>
-            <w:pPr>
-              <w:pStyle w:val="Compact"/>
-              <w:jc w:val="left"/>
-            </w:pPr>
-            <w:r>
-              <w:t xml:space="preserve">Package research outputs as Research Object Crates</w:t>
-            </w:r>
-          </w:p>
-        </w:tc>
-      </w:tr>
-      <w:tr>
-        <w:tc>
-          <w:tcPr/>
-          <w:p>
-            <w:pPr>
-              <w:pStyle w:val="Compact"/>
-              <w:jc w:val="left"/>
-            </w:pPr>
-            <w:r>
-              <w:t xml:space="preserve">DOI minting</w:t>
-            </w:r>
-          </w:p>
-        </w:tc>
-        <w:tc>
-          <w:tcPr/>
-          <w:p>
-            <w:pPr>
-              <w:pStyle w:val="Compact"/>
-              <w:jc w:val="left"/>
-            </w:pPr>
-            <w:r>
-              <w:t xml:space="preserve">Mint DOIs for published research outputs via DataCite</w:t>
-            </w:r>
-          </w:p>
-        </w:tc>
-      </w:tr>
-      <w:tr>
-        <w:tc>
-          <w:tcPr/>
-          <w:p>
-            <w:pPr>
-              <w:pStyle w:val="Compact"/>
-              <w:jc w:val="left"/>
-            </w:pPr>
-            <w:r>
-              <w:t xml:space="preserve">ORCID integration</w:t>
-            </w:r>
-          </w:p>
-        </w:tc>
-        <w:tc>
-          <w:tcPr/>
-          <w:p>
-            <w:pPr>
-              <w:pStyle w:val="Compact"/>
-              <w:jc w:val="left"/>
-            </w:pPr>
-            <w:r>
-              <w:t xml:space="preserve">Link researcher profiles to ORCID identifiers</w:t>
+              <w:t xml:space="preserve">Research projects</w:t>
+            </w:r>
+          </w:p>
+        </w:tc>
+        <w:tc>
+          <w:tcPr/>
+          <w:p>
+            <w:pPr>
+              <w:pStyle w:val="Compact"/>
+              <w:jc w:val="left"/>
+            </w:pPr>
+            <w:r>
+              <w:t xml:space="preserve">Create projects with collaborators, shared collections, and milestones</w:t>
+            </w:r>
+          </w:p>
+        </w:tc>
+      </w:tr>
+      <w:tr>
+        <w:tc>
+          <w:tcPr/>
+          <w:p>
+            <w:pPr>
+              <w:pStyle w:val="Compact"/>
+              <w:jc w:val="left"/>
+            </w:pPr>
+            <w:r>
+              <w:t xml:space="preserve">Ethics milestones</w:t>
+            </w:r>
+          </w:p>
+        </w:tc>
+        <w:tc>
+          <w:tcPr/>
+          <w:p>
+            <w:pPr>
+              <w:pStyle w:val="Compact"/>
+              <w:jc w:val="left"/>
+            </w:pPr>
+            <w:r>
+              <w:t xml:space="preserve">Track ethics review steps with type (IRB, consent, risk assessment), status, due date, and inline editing</w:t>
+            </w:r>
+          </w:p>
+        </w:tc>
+      </w:tr>
+      <w:tr>
+        <w:tc>
+          <w:tcPr/>
+          <w:p>
+            <w:pPr>
+              <w:pStyle w:val="Compact"/>
+              <w:jc w:val="left"/>
+            </w:pPr>
+            <w:r>
+              <w:t xml:space="preserve">Workspaces</w:t>
+            </w:r>
+          </w:p>
+        </w:tc>
+        <w:tc>
+          <w:tcPr/>
+          <w:p>
+            <w:pPr>
+              <w:pStyle w:val="Compact"/>
+              <w:jc w:val="left"/>
+            </w:pPr>
+            <w:r>
+              <w:t xml:space="preserve">Shared workspaces with discussions, shared resources, member management, and role-based access</w:t>
+            </w:r>
+          </w:p>
+        </w:tc>
+      </w:tr>
+      <w:tr>
+        <w:tc>
+          <w:tcPr/>
+          <w:p>
+            <w:pPr>
+              <w:pStyle w:val="Compact"/>
+              <w:jc w:val="left"/>
+            </w:pPr>
+            <w:r>
+              <w:t xml:space="preserve">Workspace CRUD</w:t>
+            </w:r>
+          </w:p>
+        </w:tc>
+        <w:tc>
+          <w:tcPr/>
+          <w:p>
+            <w:pPr>
+              <w:pStyle w:val="Compact"/>
+              <w:jc w:val="left"/>
+            </w:pPr>
+            <w:r>
+              <w:t xml:space="preserve">Full edit/delete for workspace details, discussions, resources (with TomSelect search), and members (role change, remove)</w:t>
+            </w:r>
+          </w:p>
+        </w:tc>
+      </w:tr>
+      <w:tr>
+        <w:tc>
+          <w:tcPr/>
+          <w:p>
+            <w:pPr>
+              <w:pStyle w:val="Compact"/>
+              <w:jc w:val="left"/>
+            </w:pPr>
+            <w:r>
+              <w:t xml:space="preserve">Shared collections</w:t>
+            </w:r>
+          </w:p>
+        </w:tc>
+        <w:tc>
+          <w:tcPr/>
+          <w:p>
+            <w:pPr>
+              <w:pStyle w:val="Compact"/>
+              <w:jc w:val="left"/>
+            </w:pPr>
+            <w:r>
+              <w:t xml:space="preserve">Workspace-linked collections with item counts and owner display</w:t>
+            </w:r>
+          </w:p>
+        </w:tc>
+      </w:tr>
+      <w:tr>
+        <w:tc>
+          <w:tcPr/>
+          <w:p>
+            <w:pPr>
+              <w:pStyle w:val="Compact"/>
+              <w:jc w:val="left"/>
+            </w:pPr>
+            <w:r>
+              <w:t xml:space="preserve">Peer review</w:t>
+            </w:r>
+          </w:p>
+        </w:tc>
+        <w:tc>
+          <w:tcPr/>
+          <w:p>
+            <w:pPr>
+              <w:pStyle w:val="Compact"/>
+              <w:jc w:val="left"/>
+            </w:pPr>
+            <w:r>
+              <w:t xml:space="preserve">Invite peers to review and comment on research outputs</w:t>
+            </w:r>
+          </w:p>
+        </w:tc>
+      </w:tr>
+      <w:tr>
+        <w:tc>
+          <w:tcPr/>
+          <w:p>
+            <w:pPr>
+              <w:pStyle w:val="Compact"/>
+              <w:jc w:val="left"/>
+            </w:pPr>
+            <w:r>
+              <w:t xml:space="preserve">Institutional sharing</w:t>
+            </w:r>
+          </w:p>
+        </w:tc>
+        <w:tc>
+          <w:tcPr/>
+          <w:p>
+            <w:pPr>
+              <w:pStyle w:val="Compact"/>
+              <w:jc w:val="left"/>
+            </w:pPr>
+            <w:r>
+              <w:t xml:space="preserve">Share research across partner institutions</w:t>
             </w:r>
           </w:p>
         </w:tc>
       </w:tr>
     </w:tbl>
     <w:bookmarkEnd w:id="30"/>
-    <w:bookmarkStart w:id="31" w:name="ai-powered-tools"/>
+    <w:bookmarkStart w:id="31" w:name="publishing-and-reproducibility"/>
     <w:p>
       <w:pPr>
         <w:pStyle w:val="Heading3"/>
       </w:pPr>
       <w:r>
-        <w:t xml:space="preserve">11. AI-Powered Tools</w:t>
+        <w:t xml:space="preserve">10. Publishing and Reproducibility</w:t>
       </w:r>
     </w:p>
     <w:tbl>
@@ -2244,110 +2340,188 @@
               <w:jc w:val="left"/>
             </w:pPr>
             <w:r>
-              <w:t xml:space="preserve">Entity extraction</w:t>
-            </w:r>
-          </w:p>
-        </w:tc>
-        <w:tc>
-          <w:tcPr/>
-          <w:p>
-            <w:pPr>
-              <w:pStyle w:val="Compact"/>
-              <w:jc w:val="left"/>
-            </w:pPr>
-            <w:r>
-              <w:t xml:space="preserve">AI-powered Named Entity Recognition from archival documents</w:t>
-            </w:r>
-          </w:p>
-        </w:tc>
-      </w:tr>
-      <w:tr>
-        <w:tc>
-          <w:tcPr/>
-          <w:p>
-            <w:pPr>
-              <w:pStyle w:val="Compact"/>
-              <w:jc w:val="left"/>
-            </w:pPr>
-            <w:r>
-              <w:t xml:space="preserve">Summarisation</w:t>
-            </w:r>
-          </w:p>
-        </w:tc>
-        <w:tc>
-          <w:tcPr/>
-          <w:p>
-            <w:pPr>
-              <w:pStyle w:val="Compact"/>
-              <w:jc w:val="left"/>
-            </w:pPr>
-            <w:r>
-              <w:t xml:space="preserve">Automatic text summarisation of archival descriptions</w:t>
-            </w:r>
-          </w:p>
-        </w:tc>
-      </w:tr>
-      <w:tr>
-        <w:tc>
-          <w:tcPr/>
-          <w:p>
-            <w:pPr>
-              <w:pStyle w:val="Compact"/>
-              <w:jc w:val="left"/>
-            </w:pPr>
-            <w:r>
-              <w:t xml:space="preserve">Validation queue</w:t>
-            </w:r>
-          </w:p>
-        </w:tc>
-        <w:tc>
-          <w:tcPr/>
-          <w:p>
-            <w:pPr>
-              <w:pStyle w:val="Compact"/>
-              <w:jc w:val="left"/>
-            </w:pPr>
-            <w:r>
-              <w:t xml:space="preserve">Staff review and validate AI-generated extractions</w:t>
-            </w:r>
-          </w:p>
-        </w:tc>
-      </w:tr>
-      <w:tr>
-        <w:tc>
-          <w:tcPr/>
-          <w:p>
-            <w:pPr>
-              <w:pStyle w:val="Compact"/>
-              <w:jc w:val="left"/>
-            </w:pPr>
-            <w:r>
-              <w:t xml:space="preserve">Entity resolution</w:t>
-            </w:r>
-          </w:p>
-        </w:tc>
-        <w:tc>
-          <w:tcPr/>
-          <w:p>
-            <w:pPr>
-              <w:pStyle w:val="Compact"/>
-              <w:jc w:val="left"/>
-            </w:pPr>
-            <w:r>
-              <w:t xml:space="preserve">Disambiguate and link extracted entities to authority records</w:t>
+              <w:t xml:space="preserve">Bibliographies</w:t>
+            </w:r>
+          </w:p>
+        </w:tc>
+        <w:tc>
+          <w:tcPr/>
+          <w:p>
+            <w:pPr>
+              <w:pStyle w:val="Compact"/>
+              <w:jc w:val="left"/>
+            </w:pPr>
+            <w:r>
+              <w:t xml:space="preserve">Manage bibliographies with RIS, BibTeX, and Zotero export</w:t>
+            </w:r>
+          </w:p>
+        </w:tc>
+      </w:tr>
+      <w:tr>
+        <w:tc>
+          <w:tcPr/>
+          <w:p>
+            <w:pPr>
+              <w:pStyle w:val="Compact"/>
+              <w:jc w:val="left"/>
+            </w:pPr>
+            <w:r>
+              <w:t xml:space="preserve">Reports</w:t>
+            </w:r>
+          </w:p>
+        </w:tc>
+        <w:tc>
+          <w:tcPr/>
+          <w:p>
+            <w:pPr>
+              <w:pStyle w:val="Compact"/>
+              <w:jc w:val="left"/>
+            </w:pPr>
+            <w:r>
+              <w:t xml:space="preserve">Generate research reports in PDF and DOCX format with rich text editing</w:t>
+            </w:r>
+          </w:p>
+        </w:tc>
+      </w:tr>
+      <w:tr>
+        <w:tc>
+          <w:tcPr/>
+          <w:p>
+            <w:pPr>
+              <w:pStyle w:val="Compact"/>
+              <w:jc w:val="left"/>
+            </w:pPr>
+            <w:r>
+              <w:t xml:space="preserve">Reproducibility pack</w:t>
+            </w:r>
+          </w:p>
+        </w:tc>
+        <w:tc>
+          <w:tcPr/>
+          <w:p>
+            <w:pPr>
+              <w:pStyle w:val="Compact"/>
+              <w:jc w:val="left"/>
+            </w:pPr>
+            <w:r>
+              <w:t xml:space="preserve">Comprehensive pack with summary cards (milestones, snapshots, resources, assertions, hypotheses, extraction jobs), computed integrity hash, and JSON download</w:t>
+            </w:r>
+          </w:p>
+        </w:tc>
+      </w:tr>
+      <w:tr>
+        <w:tc>
+          <w:tcPr/>
+          <w:p>
+            <w:pPr>
+              <w:pStyle w:val="Compact"/>
+              <w:jc w:val="left"/>
+            </w:pPr>
+            <w:r>
+              <w:t xml:space="preserve">Immutable snapshots</w:t>
+            </w:r>
+          </w:p>
+        </w:tc>
+        <w:tc>
+          <w:tcPr/>
+          <w:p>
+            <w:pPr>
+              <w:pStyle w:val="Compact"/>
+              <w:jc w:val="left"/>
+            </w:pPr>
+            <w:r>
+              <w:t xml:space="preserve">Create hash-verified snapshots of research state for reproducibility</w:t>
+            </w:r>
+          </w:p>
+        </w:tc>
+      </w:tr>
+      <w:tr>
+        <w:tc>
+          <w:tcPr/>
+          <w:p>
+            <w:pPr>
+              <w:pStyle w:val="Compact"/>
+              <w:jc w:val="left"/>
+            </w:pPr>
+            <w:r>
+              <w:t xml:space="preserve">RO-Crate packaging</w:t>
+            </w:r>
+          </w:p>
+        </w:tc>
+        <w:tc>
+          <w:tcPr/>
+          <w:p>
+            <w:pPr>
+              <w:pStyle w:val="Compact"/>
+              <w:jc w:val="left"/>
+            </w:pPr>
+            <w:r>
+              <w:t xml:space="preserve">Package research outputs as Research Object Crates</w:t>
+            </w:r>
+          </w:p>
+        </w:tc>
+      </w:tr>
+      <w:tr>
+        <w:tc>
+          <w:tcPr/>
+          <w:p>
+            <w:pPr>
+              <w:pStyle w:val="Compact"/>
+              <w:jc w:val="left"/>
+            </w:pPr>
+            <w:r>
+              <w:t xml:space="preserve">DOI minting</w:t>
+            </w:r>
+          </w:p>
+        </w:tc>
+        <w:tc>
+          <w:tcPr/>
+          <w:p>
+            <w:pPr>
+              <w:pStyle w:val="Compact"/>
+              <w:jc w:val="left"/>
+            </w:pPr>
+            <w:r>
+              <w:t xml:space="preserve">Mint DOIs for published research outputs via DataCite</w:t>
+            </w:r>
+          </w:p>
+        </w:tc>
+      </w:tr>
+      <w:tr>
+        <w:tc>
+          <w:tcPr/>
+          <w:p>
+            <w:pPr>
+              <w:pStyle w:val="Compact"/>
+              <w:jc w:val="left"/>
+            </w:pPr>
+            <w:r>
+              <w:t xml:space="preserve">ORCID integration</w:t>
+            </w:r>
+          </w:p>
+        </w:tc>
+        <w:tc>
+          <w:tcPr/>
+          <w:p>
+            <w:pPr>
+              <w:pStyle w:val="Compact"/>
+              <w:jc w:val="left"/>
+            </w:pPr>
+            <w:r>
+              <w:t xml:space="preserve">Link researcher profiles to ORCID identifiers</w:t>
             </w:r>
           </w:p>
         </w:tc>
       </w:tr>
     </w:tbl>
     <w:bookmarkEnd w:id="31"/>
-    <w:bookmarkStart w:id="32" w:name="visualisation"/>
+    <w:bookmarkStart w:id="32" w:name="ai-powered-tools"/>
     <w:p>
       <w:pPr>
         <w:pStyle w:val="Heading3"/>
       </w:pPr>
       <w:r>
-        <w:t xml:space="preserve">12. Visualisation</w:t>
+        <w:t xml:space="preserve">11. AI-Powered Tools</w:t>
       </w:r>
     </w:p>
     <w:tbl>
@@ -2399,6 +2573,161 @@
               <w:jc w:val="left"/>
             </w:pPr>
             <w:r>
+              <w:t xml:space="preserve">Entity extraction</w:t>
+            </w:r>
+          </w:p>
+        </w:tc>
+        <w:tc>
+          <w:tcPr/>
+          <w:p>
+            <w:pPr>
+              <w:pStyle w:val="Compact"/>
+              <w:jc w:val="left"/>
+            </w:pPr>
+            <w:r>
+              <w:t xml:space="preserve">AI-powered Named Entity Recognition from archival documents</w:t>
+            </w:r>
+          </w:p>
+        </w:tc>
+      </w:tr>
+      <w:tr>
+        <w:tc>
+          <w:tcPr/>
+          <w:p>
+            <w:pPr>
+              <w:pStyle w:val="Compact"/>
+              <w:jc w:val="left"/>
+            </w:pPr>
+            <w:r>
+              <w:t xml:space="preserve">Summarisation</w:t>
+            </w:r>
+          </w:p>
+        </w:tc>
+        <w:tc>
+          <w:tcPr/>
+          <w:p>
+            <w:pPr>
+              <w:pStyle w:val="Compact"/>
+              <w:jc w:val="left"/>
+            </w:pPr>
+            <w:r>
+              <w:t xml:space="preserve">Automatic text summarisation of archival descriptions</w:t>
+            </w:r>
+          </w:p>
+        </w:tc>
+      </w:tr>
+      <w:tr>
+        <w:tc>
+          <w:tcPr/>
+          <w:p>
+            <w:pPr>
+              <w:pStyle w:val="Compact"/>
+              <w:jc w:val="left"/>
+            </w:pPr>
+            <w:r>
+              <w:t xml:space="preserve">Validation queue</w:t>
+            </w:r>
+          </w:p>
+        </w:tc>
+        <w:tc>
+          <w:tcPr/>
+          <w:p>
+            <w:pPr>
+              <w:pStyle w:val="Compact"/>
+              <w:jc w:val="left"/>
+            </w:pPr>
+            <w:r>
+              <w:t xml:space="preserve">Staff review and validate AI-generated extractions</w:t>
+            </w:r>
+          </w:p>
+        </w:tc>
+      </w:tr>
+      <w:tr>
+        <w:tc>
+          <w:tcPr/>
+          <w:p>
+            <w:pPr>
+              <w:pStyle w:val="Compact"/>
+              <w:jc w:val="left"/>
+            </w:pPr>
+            <w:r>
+              <w:t xml:space="preserve">Entity resolution</w:t>
+            </w:r>
+          </w:p>
+        </w:tc>
+        <w:tc>
+          <w:tcPr/>
+          <w:p>
+            <w:pPr>
+              <w:pStyle w:val="Compact"/>
+              <w:jc w:val="left"/>
+            </w:pPr>
+            <w:r>
+              <w:t xml:space="preserve">Disambiguate and link extracted entities to authority records</w:t>
+            </w:r>
+          </w:p>
+        </w:tc>
+      </w:tr>
+    </w:tbl>
+    <w:bookmarkEnd w:id="32"/>
+    <w:bookmarkStart w:id="33" w:name="visualisation"/>
+    <w:p>
+      <w:pPr>
+        <w:pStyle w:val="Heading3"/>
+      </w:pPr>
+      <w:r>
+        <w:t xml:space="preserve">12. Visualisation</w:t>
+      </w:r>
+    </w:p>
+    <w:tbl>
+      <w:tblPr>
+        <w:tblStyle w:val="Table"/>
+        <w:tblW w:type="pct" w:w="5000"/>
+        <w:tblLook w:firstRow="1" w:lastRow="0" w:firstColumn="0" w:lastColumn="0" w:noHBand="0" w:noVBand="0" w:val="0020"/>
+        <w:jc w:val="start"/>
+      </w:tblPr>
+      <w:tblGrid>
+        <w:gridCol w:w="3240"/>
+        <w:gridCol w:w="4680"/>
+      </w:tblGrid>
+      <w:tr>
+        <w:trPr>
+          <w:tblHeader w:val="true"/>
+        </w:trPr>
+        <w:tc>
+          <w:tcPr/>
+          <w:p>
+            <w:pPr>
+              <w:pStyle w:val="Compact"/>
+              <w:jc w:val="left"/>
+            </w:pPr>
+            <w:r>
+              <w:t xml:space="preserve">Feature</w:t>
+            </w:r>
+          </w:p>
+        </w:tc>
+        <w:tc>
+          <w:tcPr/>
+          <w:p>
+            <w:pPr>
+              <w:pStyle w:val="Compact"/>
+              <w:jc w:val="left"/>
+            </w:pPr>
+            <w:r>
+              <w:t xml:space="preserve">Description</w:t>
+            </w:r>
+          </w:p>
+        </w:tc>
+      </w:tr>
+      <w:tr>
+        <w:tc>
+          <w:tcPr/>
+          <w:p>
+            <w:pPr>
+              <w:pStyle w:val="Compact"/>
+              <w:jc w:val="left"/>
+            </w:pPr>
+            <w:r>
               <w:t xml:space="preserve">Timeline builder</w:t>
             </w:r>
           </w:p>
@@ -2490,6 +2819,724 @@
             </w:pPr>
             <w:r>
               <w:t xml:space="preserve">Explore assertions and hypotheses as an interactive graph</w:t>
+            </w:r>
+          </w:p>
+        </w:tc>
+      </w:tr>
+    </w:tbl>
+    <w:bookmarkEnd w:id="33"/>
+    <w:bookmarkStart w:id="34" w:name="odrl-policy-enforcement"/>
+    <w:p>
+      <w:pPr>
+        <w:pStyle w:val="Heading3"/>
+      </w:pPr>
+      <w:r>
+        <w:t xml:space="preserve">13. ODRL Policy Enforcement</w:t>
+      </w:r>
+    </w:p>
+    <w:tbl>
+      <w:tblPr>
+        <w:tblStyle w:val="Table"/>
+        <w:tblW w:type="pct" w:w="5000"/>
+        <w:tblLook w:firstRow="1" w:lastRow="0" w:firstColumn="0" w:lastColumn="0" w:noHBand="0" w:noVBand="0" w:val="0020"/>
+        <w:jc w:val="start"/>
+      </w:tblPr>
+      <w:tblGrid>
+        <w:gridCol w:w="3240"/>
+        <w:gridCol w:w="4680"/>
+      </w:tblGrid>
+      <w:tr>
+        <w:trPr>
+          <w:tblHeader w:val="true"/>
+        </w:trPr>
+        <w:tc>
+          <w:tcPr/>
+          <w:p>
+            <w:pPr>
+              <w:pStyle w:val="Compact"/>
+              <w:jc w:val="left"/>
+            </w:pPr>
+            <w:r>
+              <w:t xml:space="preserve">Feature</w:t>
+            </w:r>
+          </w:p>
+        </w:tc>
+        <w:tc>
+          <w:tcPr/>
+          <w:p>
+            <w:pPr>
+              <w:pStyle w:val="Compact"/>
+              <w:jc w:val="left"/>
+            </w:pPr>
+            <w:r>
+              <w:t xml:space="preserve">Description</w:t>
+            </w:r>
+          </w:p>
+        </w:tc>
+      </w:tr>
+      <w:tr>
+        <w:tc>
+          <w:tcPr/>
+          <w:p>
+            <w:pPr>
+              <w:pStyle w:val="Compact"/>
+              <w:jc w:val="left"/>
+            </w:pPr>
+            <w:r>
+              <w:t xml:space="preserve">Policy management</w:t>
+            </w:r>
+          </w:p>
+        </w:tc>
+        <w:tc>
+          <w:tcPr/>
+          <w:p>
+            <w:pPr>
+              <w:pStyle w:val="Compact"/>
+              <w:jc w:val="left"/>
+            </w:pPr>
+            <w:r>
+              <w:t xml:space="preserve">Create, edit, and delete ODRL policies via a full-featured admin UI</w:t>
+            </w:r>
+          </w:p>
+        </w:tc>
+      </w:tr>
+      <w:tr>
+        <w:tc>
+          <w:tcPr/>
+          <w:p>
+            <w:pPr>
+              <w:pStyle w:val="Compact"/>
+              <w:jc w:val="left"/>
+            </w:pPr>
+            <w:r>
+              <w:t xml:space="preserve">Target types</w:t>
+            </w:r>
+          </w:p>
+        </w:tc>
+        <w:tc>
+          <w:tcPr/>
+          <w:p>
+            <w:pPr>
+              <w:pStyle w:val="Compact"/>
+              <w:jc w:val="left"/>
+            </w:pPr>
+            <w:r>
+              <w:t xml:space="preserve">Policies can target archival descriptions, collections, projects, snapshots, annotations, and assertions</w:t>
+            </w:r>
+          </w:p>
+        </w:tc>
+      </w:tr>
+      <w:tr>
+        <w:tc>
+          <w:tcPr/>
+          <w:p>
+            <w:pPr>
+              <w:pStyle w:val="Compact"/>
+              <w:jc w:val="left"/>
+            </w:pPr>
+            <w:r>
+              <w:t xml:space="preserve">Target autocomplete</w:t>
+            </w:r>
+          </w:p>
+        </w:tc>
+        <w:tc>
+          <w:tcPr/>
+          <w:p>
+            <w:pPr>
+              <w:pStyle w:val="Compact"/>
+              <w:jc w:val="left"/>
+            </w:pPr>
+            <w:r>
+              <w:t xml:space="preserve">TomSelect-powered search for all target types — shows names, not IDs</w:t>
+            </w:r>
+          </w:p>
+        </w:tc>
+      </w:tr>
+      <w:tr>
+        <w:tc>
+          <w:tcPr/>
+          <w:p>
+            <w:pPr>
+              <w:pStyle w:val="Compact"/>
+              <w:jc w:val="left"/>
+            </w:pPr>
+            <w:r>
+              <w:t xml:space="preserve">Policy types</w:t>
+            </w:r>
+          </w:p>
+        </w:tc>
+        <w:tc>
+          <w:tcPr/>
+          <w:p>
+            <w:pPr>
+              <w:pStyle w:val="Compact"/>
+              <w:jc w:val="left"/>
+            </w:pPr>
+            <w:r>
+              <w:t xml:space="preserve">Permission, Prohibition, and Obligation with constraint support</w:t>
+            </w:r>
+          </w:p>
+        </w:tc>
+      </w:tr>
+      <w:tr>
+        <w:tc>
+          <w:tcPr/>
+          <w:p>
+            <w:pPr>
+              <w:pStyle w:val="Compact"/>
+              <w:jc w:val="left"/>
+            </w:pPr>
+            <w:r>
+              <w:t xml:space="preserve">Constraints</w:t>
+            </w:r>
+          </w:p>
+        </w:tc>
+        <w:tc>
+          <w:tcPr/>
+          <w:p>
+            <w:pPr>
+              <w:pStyle w:val="Compact"/>
+              <w:jc w:val="left"/>
+            </w:pPr>
+            <w:r>
+              <w:t xml:space="preserve">Researcher whitelist (multi-select), date windows (from/to), and usage limits (max uses)</w:t>
+            </w:r>
+          </w:p>
+        </w:tc>
+      </w:tr>
+      <w:tr>
+        <w:tc>
+          <w:tcPr/>
+          <w:p>
+            <w:pPr>
+              <w:pStyle w:val="Compact"/>
+              <w:jc w:val="left"/>
+            </w:pPr>
+            <w:r>
+              <w:t xml:space="preserve">Enforcement layer</w:t>
+            </w:r>
+          </w:p>
+        </w:tc>
+        <w:tc>
+          <w:tcPr/>
+          <w:p>
+            <w:pPr>
+              <w:pStyle w:val="Compact"/>
+              <w:jc w:val="left"/>
+            </w:pPr>
+            <w:r>
+              <w:t xml:space="preserve">Policies enforced at 6 access points: view project, view collection, view snapshot, share project, reproducibility pack, reproduction requests</w:t>
+            </w:r>
+          </w:p>
+        </w:tc>
+      </w:tr>
+      <w:tr>
+        <w:tc>
+          <w:tcPr/>
+          <w:p>
+            <w:pPr>
+              <w:pStyle w:val="Compact"/>
+              <w:jc w:val="left"/>
+            </w:pPr>
+            <w:r>
+              <w:t xml:space="preserve">Default-allow</w:t>
+            </w:r>
+          </w:p>
+        </w:tc>
+        <w:tc>
+          <w:tcPr/>
+          <w:p>
+            <w:pPr>
+              <w:pStyle w:val="Compact"/>
+              <w:jc w:val="left"/>
+            </w:pPr>
+            <w:r>
+              <w:t xml:space="preserve">Resources with no policies are accessible by default — only explicit prohibitions block access</w:t>
+            </w:r>
+          </w:p>
+        </w:tc>
+      </w:tr>
+      <w:tr>
+        <w:tc>
+          <w:tcPr/>
+          <w:p>
+            <w:pPr>
+              <w:pStyle w:val="Compact"/>
+              <w:jc w:val="left"/>
+            </w:pPr>
+            <w:r>
+              <w:t xml:space="preserve">Audit logging</w:t>
+            </w:r>
+          </w:p>
+        </w:tc>
+        <w:tc>
+          <w:tcPr/>
+          <w:p>
+            <w:pPr>
+              <w:pStyle w:val="Compact"/>
+              <w:jc w:val="left"/>
+            </w:pPr>
+            <w:r>
+              <w:t xml:space="preserve">Every access evaluation is logged to</w:t>
+            </w:r>
+            <w:r>
+              <w:t xml:space="preserve"> </w:t>
+            </w:r>
+            <w:r>
+              <w:rPr>
+                <w:rStyle w:val="VerbatimChar"/>
+              </w:rPr>
+              <w:t xml:space="preserve">research_access_decision</w:t>
+            </w:r>
+            <w:r>
+              <w:t xml:space="preserve"> </w:t>
+            </w:r>
+            <w:r>
+              <w:t xml:space="preserve">with rationale</w:t>
+            </w:r>
+          </w:p>
+        </w:tc>
+      </w:tr>
+    </w:tbl>
+    <w:bookmarkEnd w:id="34"/>
+    <w:bookmarkStart w:id="35" w:name="api-keys-and-research-api"/>
+    <w:p>
+      <w:pPr>
+        <w:pStyle w:val="Heading3"/>
+      </w:pPr>
+      <w:r>
+        <w:t xml:space="preserve">14. API Keys and Research API</w:t>
+      </w:r>
+    </w:p>
+    <w:tbl>
+      <w:tblPr>
+        <w:tblStyle w:val="Table"/>
+        <w:tblW w:type="pct" w:w="5000"/>
+        <w:tblLook w:firstRow="1" w:lastRow="0" w:firstColumn="0" w:lastColumn="0" w:noHBand="0" w:noVBand="0" w:val="0020"/>
+        <w:jc w:val="start"/>
+      </w:tblPr>
+      <w:tblGrid>
+        <w:gridCol w:w="3240"/>
+        <w:gridCol w:w="4680"/>
+      </w:tblGrid>
+      <w:tr>
+        <w:trPr>
+          <w:tblHeader w:val="true"/>
+        </w:trPr>
+        <w:tc>
+          <w:tcPr/>
+          <w:p>
+            <w:pPr>
+              <w:pStyle w:val="Compact"/>
+              <w:jc w:val="left"/>
+            </w:pPr>
+            <w:r>
+              <w:t xml:space="preserve">Feature</w:t>
+            </w:r>
+          </w:p>
+        </w:tc>
+        <w:tc>
+          <w:tcPr/>
+          <w:p>
+            <w:pPr>
+              <w:pStyle w:val="Compact"/>
+              <w:jc w:val="left"/>
+            </w:pPr>
+            <w:r>
+              <w:t xml:space="preserve">Description</w:t>
+            </w:r>
+          </w:p>
+        </w:tc>
+      </w:tr>
+      <w:tr>
+        <w:tc>
+          <w:tcPr/>
+          <w:p>
+            <w:pPr>
+              <w:pStyle w:val="Compact"/>
+              <w:jc w:val="left"/>
+            </w:pPr>
+            <w:r>
+              <w:t xml:space="preserve">API key management</w:t>
+            </w:r>
+          </w:p>
+        </w:tc>
+        <w:tc>
+          <w:tcPr/>
+          <w:p>
+            <w:pPr>
+              <w:pStyle w:val="Compact"/>
+              <w:jc w:val="left"/>
+            </w:pPr>
+            <w:r>
+              <w:t xml:space="preserve">Generate, list, and revoke API keys from the researcher profile</w:t>
+            </w:r>
+          </w:p>
+        </w:tc>
+      </w:tr>
+      <w:tr>
+        <w:tc>
+          <w:tcPr/>
+          <w:p>
+            <w:pPr>
+              <w:pStyle w:val="Compact"/>
+              <w:jc w:val="left"/>
+            </w:pPr>
+            <w:r>
+              <w:t xml:space="preserve">Scope-based permissions</w:t>
+            </w:r>
+          </w:p>
+        </w:tc>
+        <w:tc>
+          <w:tcPr/>
+          <w:p>
+            <w:pPr>
+              <w:pStyle w:val="Compact"/>
+              <w:jc w:val="left"/>
+            </w:pPr>
+            <w:r>
+              <w:t xml:space="preserve">Keys support Read, Write, and Search scopes — enforced by the API middleware</w:t>
+            </w:r>
+          </w:p>
+        </w:tc>
+      </w:tr>
+      <w:tr>
+        <w:tc>
+          <w:tcPr/>
+          <w:p>
+            <w:pPr>
+              <w:pStyle w:val="Compact"/>
+              <w:jc w:val="left"/>
+            </w:pPr>
+            <w:r>
+              <w:t xml:space="preserve">Unified key system</w:t>
+            </w:r>
+          </w:p>
+        </w:tc>
+        <w:tc>
+          <w:tcPr/>
+          <w:p>
+            <w:pPr>
+              <w:pStyle w:val="Compact"/>
+              <w:jc w:val="left"/>
+            </w:pPr>
+            <w:r>
+              <w:t xml:space="preserve">Research API keys are stored in the central</w:t>
+            </w:r>
+            <w:r>
+              <w:t xml:space="preserve"> </w:t>
+            </w:r>
+            <w:r>
+              <w:rPr>
+                <w:rStyle w:val="VerbatimChar"/>
+              </w:rPr>
+              <w:t xml:space="preserve">ahg_api_key</w:t>
+            </w:r>
+            <w:r>
+              <w:t xml:space="preserve"> </w:t>
+            </w:r>
+            <w:r>
+              <w:t xml:space="preserve">table with full scope enforcement</w:t>
+            </w:r>
+          </w:p>
+        </w:tc>
+      </w:tr>
+      <w:tr>
+        <w:tc>
+          <w:tcPr/>
+          <w:p>
+            <w:pPr>
+              <w:pStyle w:val="Compact"/>
+              <w:jc w:val="left"/>
+            </w:pPr>
+            <w:r>
+              <w:t xml:space="preserve">REST endpoints</w:t>
+            </w:r>
+          </w:p>
+        </w:tc>
+        <w:tc>
+          <w:tcPr/>
+          <w:p>
+            <w:pPr>
+              <w:pStyle w:val="Compact"/>
+              <w:jc w:val="left"/>
+            </w:pPr>
+            <w:r>
+              <w:t xml:space="preserve">Profile, projects, collections, bookings, bibliographies, annotations, statistics, citations</w:t>
+            </w:r>
+          </w:p>
+        </w:tc>
+      </w:tr>
+      <w:tr>
+        <w:tc>
+          <w:tcPr/>
+          <w:p>
+            <w:pPr>
+              <w:pStyle w:val="Compact"/>
+              <w:jc w:val="left"/>
+            </w:pPr>
+            <w:r>
+              <w:t xml:space="preserve">Rate limiting</w:t>
+            </w:r>
+          </w:p>
+        </w:tc>
+        <w:tc>
+          <w:tcPr/>
+          <w:p>
+            <w:pPr>
+              <w:pStyle w:val="Compact"/>
+              <w:jc w:val="left"/>
+            </w:pPr>
+            <w:r>
+              <w:t xml:space="preserve">Per-key rate limits with usage tracking</w:t>
+            </w:r>
+          </w:p>
+        </w:tc>
+      </w:tr>
+    </w:tbl>
+    <w:bookmarkEnd w:id="35"/>
+    <w:bookmarkStart w:id="36" w:name="admin-tools"/>
+    <w:p>
+      <w:pPr>
+        <w:pStyle w:val="Heading3"/>
+      </w:pPr>
+      <w:r>
+        <w:t xml:space="preserve">15. Admin Tools</w:t>
+      </w:r>
+    </w:p>
+    <w:tbl>
+      <w:tblPr>
+        <w:tblStyle w:val="Table"/>
+        <w:tblW w:type="pct" w:w="5000"/>
+        <w:tblLook w:firstRow="1" w:lastRow="0" w:firstColumn="0" w:lastColumn="0" w:noHBand="0" w:noVBand="0" w:val="0020"/>
+        <w:jc w:val="start"/>
+      </w:tblPr>
+      <w:tblGrid>
+        <w:gridCol w:w="3240"/>
+        <w:gridCol w:w="4680"/>
+      </w:tblGrid>
+      <w:tr>
+        <w:trPr>
+          <w:tblHeader w:val="true"/>
+        </w:trPr>
+        <w:tc>
+          <w:tcPr/>
+          <w:p>
+            <w:pPr>
+              <w:pStyle w:val="Compact"/>
+              <w:jc w:val="left"/>
+            </w:pPr>
+            <w:r>
+              <w:t xml:space="preserve">Feature</w:t>
+            </w:r>
+          </w:p>
+        </w:tc>
+        <w:tc>
+          <w:tcPr/>
+          <w:p>
+            <w:pPr>
+              <w:pStyle w:val="Compact"/>
+              <w:jc w:val="left"/>
+            </w:pPr>
+            <w:r>
+              <w:t xml:space="preserve">Description</w:t>
+            </w:r>
+          </w:p>
+        </w:tc>
+      </w:tr>
+      <w:tr>
+        <w:tc>
+          <w:tcPr/>
+          <w:p>
+            <w:pPr>
+              <w:pStyle w:val="Compact"/>
+              <w:jc w:val="left"/>
+            </w:pPr>
+            <w:r>
+              <w:t xml:space="preserve">Researcher management</w:t>
+            </w:r>
+          </w:p>
+        </w:tc>
+        <w:tc>
+          <w:tcPr/>
+          <w:p>
+            <w:pPr>
+              <w:pStyle w:val="Compact"/>
+              <w:jc w:val="left"/>
+            </w:pPr>
+            <w:r>
+              <w:t xml:space="preserve">Status tabs (All, Pending, Approved, Suspended, Expired) with live counts</w:t>
+            </w:r>
+          </w:p>
+        </w:tc>
+      </w:tr>
+      <w:tr>
+        <w:tc>
+          <w:tcPr/>
+          <w:p>
+            <w:pPr>
+              <w:pStyle w:val="Compact"/>
+              <w:jc w:val="left"/>
+            </w:pPr>
+            <w:r>
+              <w:t xml:space="preserve">Researcher types</w:t>
+            </w:r>
+          </w:p>
+        </w:tc>
+        <w:tc>
+          <w:tcPr/>
+          <w:p>
+            <w:pPr>
+              <w:pStyle w:val="Compact"/>
+              <w:jc w:val="left"/>
+            </w:pPr>
+            <w:r>
+              <w:t xml:space="preserve">CRUD with delete protection (cannot delete types assigned to researchers)</w:t>
+            </w:r>
+          </w:p>
+        </w:tc>
+      </w:tr>
+      <w:tr>
+        <w:tc>
+          <w:tcPr/>
+          <w:p>
+            <w:pPr>
+              <w:pStyle w:val="Compact"/>
+              <w:jc w:val="left"/>
+            </w:pPr>
+            <w:r>
+              <w:t xml:space="preserve">Statistics dashboard</w:t>
+            </w:r>
+          </w:p>
+        </w:tc>
+        <w:tc>
+          <w:tcPr/>
+          <w:p>
+            <w:pPr>
+              <w:pStyle w:val="Compact"/>
+              <w:jc w:val="left"/>
+            </w:pPr>
+            <w:r>
+              <w:t xml:space="preserve">Summary cards, registrations chart, bookings by room chart, breakdown by status</w:t>
+            </w:r>
+          </w:p>
+        </w:tc>
+      </w:tr>
+      <w:tr>
+        <w:tc>
+          <w:tcPr/>
+          <w:p>
+            <w:pPr>
+              <w:pStyle w:val="Compact"/>
+              <w:jc w:val="left"/>
+            </w:pPr>
+            <w:r>
+              <w:t xml:space="preserve">Activity log</w:t>
+            </w:r>
+          </w:p>
+        </w:tc>
+        <w:tc>
+          <w:tcPr/>
+          <w:p>
+            <w:pPr>
+              <w:pStyle w:val="Compact"/>
+              <w:jc w:val="left"/>
+            </w:pPr>
+            <w:r>
+              <w:t xml:space="preserve">All research actions logged and viewable with type filtering</w:t>
+            </w:r>
+          </w:p>
+        </w:tc>
+      </w:tr>
+      <w:tr>
+        <w:tc>
+          <w:tcPr/>
+          <w:p>
+            <w:pPr>
+              <w:pStyle w:val="Compact"/>
+              <w:jc w:val="left"/>
+            </w:pPr>
+            <w:r>
+              <w:t xml:space="preserve">Compliance dashboard</w:t>
+            </w:r>
+          </w:p>
+        </w:tc>
+        <w:tc>
+          <w:tcPr/>
+          <w:p>
+            <w:pPr>
+              <w:pStyle w:val="Compact"/>
+              <w:jc w:val="left"/>
+            </w:pPr>
+            <w:r>
+              <w:t xml:space="preserve">Ethics milestones, ODRL policies, security classification, trust scores per project</w:t>
+            </w:r>
+          </w:p>
+        </w:tc>
+      </w:tr>
+      <w:tr>
+        <w:tc>
+          <w:tcPr/>
+          <w:p>
+            <w:pPr>
+              <w:pStyle w:val="Compact"/>
+              <w:jc w:val="left"/>
+            </w:pPr>
+            <w:r>
+              <w:t xml:space="preserve">Dropdown Manager integration</w:t>
+            </w:r>
+          </w:p>
+        </w:tc>
+        <w:tc>
+          <w:tcPr/>
+          <w:p>
+            <w:pPr>
+              <w:pStyle w:val="Compact"/>
+              <w:jc w:val="left"/>
+            </w:pPr>
+            <w:r>
+              <w:t xml:space="preserve">Seat types, equipment types, ID types managed via Dropdown Manager</w:t>
+            </w:r>
+          </w:p>
+        </w:tc>
+      </w:tr>
+      <w:tr>
+        <w:tc>
+          <w:tcPr/>
+          <w:p>
+            <w:pPr>
+              <w:pStyle w:val="Compact"/>
+              <w:jc w:val="left"/>
+            </w:pPr>
+            <w:r>
+              <w:t xml:space="preserve">Seed data</w:t>
+            </w:r>
+          </w:p>
+        </w:tc>
+        <w:tc>
+          <w:tcPr/>
+          <w:p>
+            <w:pPr>
+              <w:pStyle w:val="Compact"/>
+              <w:jc w:val="left"/>
+            </w:pPr>
+            <w:r>
+              <w:t xml:space="preserve">All dropdown taxonomies included in</w:t>
+            </w:r>
+            <w:r>
+              <w:t xml:space="preserve"> </w:t>
+            </w:r>
+            <w:r>
+              <w:rPr>
+                <w:rStyle w:val="VerbatimChar"/>
+              </w:rPr>
+              <w:t xml:space="preserve">install.sql</w:t>
+            </w:r>
+            <w:r>
+              <w:t xml:space="preserve"> </w:t>
+            </w:r>
+            <w:r>
+              <w:t xml:space="preserve">for new installations</w:t>
             </w:r>
           </w:p>
         </w:tc>
@@ -2502,9 +3549,9 @@
         </w:pict>
       </w:r>
     </w:p>
-    <w:bookmarkEnd w:id="32"/>
-    <w:bookmarkEnd w:id="33"/>
-    <w:bookmarkStart w:id="34" w:name="accessibility-wcag-2.1-aa"/>
+    <w:bookmarkEnd w:id="36"/>
+    <w:bookmarkEnd w:id="37"/>
+    <w:bookmarkStart w:id="38" w:name="accessibility-wcag-2.1-aa"/>
     <w:p>
       <w:pPr>
         <w:pStyle w:val="Heading2"/>
@@ -2691,8 +3738,8 @@
         </w:pict>
       </w:r>
     </w:p>
-    <w:bookmarkEnd w:id="34"/>
-    <w:bookmarkStart w:id="35" w:name="compliance-and-standards"/>
+    <w:bookmarkEnd w:id="38"/>
+    <w:bookmarkStart w:id="39" w:name="compliance-and-standards"/>
     <w:p>
       <w:pPr>
         <w:pStyle w:val="Heading2"/>
@@ -2931,8 +3978,8 @@
         </w:pict>
       </w:r>
     </w:p>
-    <w:bookmarkEnd w:id="35"/>
-    <w:bookmarkStart w:id="36" w:name="technical-requirements"/>
+    <w:bookmarkEnd w:id="39"/>
+    <w:bookmarkStart w:id="40" w:name="technical-requirements"/>
     <w:p>
       <w:pPr>
         <w:pStyle w:val="Heading2"/>
@@ -3119,8 +4166,8 @@
         </w:pict>
       </w:r>
     </w:p>
-    <w:bookmarkEnd w:id="36"/>
-    <w:bookmarkStart w:id="37" w:name="database-footprint"/>
+    <w:bookmarkEnd w:id="40"/>
+    <w:bookmarkStart w:id="41" w:name="database-footprint"/>
     <w:p>
       <w:pPr>
         <w:pStyle w:val="Heading2"/>
@@ -3134,7 +4181,7 @@
         <w:pStyle w:val="FirstParagraph"/>
       </w:pPr>
       <w:r>
-        <w:t xml:space="preserve">The Research Portal uses 66 dedicated database tables (no modifications to core AtoM tables). Key tables include:</w:t>
+        <w:t xml:space="preserve">The Research Portal uses 80+ dedicated database tables (no modifications to core AtoM tables). Key tables include:</w:t>
       </w:r>
     </w:p>
     <w:p>
@@ -3158,7 +4205,7 @@
         <w:pStyle w:val="Compact"/>
       </w:pPr>
       <w:r>
-        <w:t xml:space="preserve">Reading room configuration (rooms, seats, bookings, equipment)</w:t>
+        <w:t xml:space="preserve">Reading room configuration (rooms, seats, bookings, equipment, equipment maintenance)</w:t>
       </w:r>
     </w:p>
     <w:p>
@@ -3254,7 +4301,43 @@
         <w:pStyle w:val="Compact"/>
       </w:pPr>
       <w:r>
-        <w:t xml:space="preserve">ODRL policies, API keys, notification preferences</w:t>
+        <w:t xml:space="preserve">ODRL policies and access decisions (enforcement audit trail)</w:t>
+      </w:r>
+    </w:p>
+    <w:p>
+      <w:pPr>
+        <w:numPr>
+          <w:ilvl w:val="0"/>
+          <w:numId w:val="1002"/>
+        </w:numPr>
+        <w:pStyle w:val="Compact"/>
+      </w:pPr>
+      <w:r>
+        <w:t xml:space="preserve">API keys (integrated with central ahg_api_key table)</w:t>
+      </w:r>
+    </w:p>
+    <w:p>
+      <w:pPr>
+        <w:numPr>
+          <w:ilvl w:val="0"/>
+          <w:numId w:val="1002"/>
+        </w:numPr>
+        <w:pStyle w:val="Compact"/>
+      </w:pPr>
+      <w:r>
+        <w:t xml:space="preserve">Notification preferences and activity log</w:t>
+      </w:r>
+    </w:p>
+    <w:p>
+      <w:pPr>
+        <w:numPr>
+          <w:ilvl w:val="0"/>
+          <w:numId w:val="1002"/>
+        </w:numPr>
+        <w:pStyle w:val="Compact"/>
+      </w:pPr>
+      <w:r>
+        <w:t xml:space="preserve">Dropdown Manager seed data (7 taxonomies: seat_type, booking_status, researcher_status, researcher_type, material_request_status, reproduction_type, reproduction_request_status, equipment_type)</w:t>
       </w:r>
     </w:p>
     <w:p>
@@ -3264,8 +4347,8 @@
         </w:pict>
       </w:r>
     </w:p>
-    <w:bookmarkEnd w:id="37"/>
-    <w:bookmarkStart w:id="38" w:name="getting-started"/>
+    <w:bookmarkEnd w:id="41"/>
+    <w:bookmarkStart w:id="42" w:name="getting-started"/>
     <w:p>
       <w:pPr>
         <w:pStyle w:val="Heading2"/>
@@ -3451,8 +4534,8 @@
         <w:t xml:space="preserve">https://theahg.co.za</w:t>
       </w:r>
     </w:p>
-    <w:bookmarkEnd w:id="38"/>
-    <w:bookmarkEnd w:id="39"/>
+    <w:bookmarkEnd w:id="42"/>
+    <w:bookmarkEnd w:id="43"/>
     <w:sectPr/>
   </w:body>
 </w:document>

</xml_diff>

<commit_message>
v3.33.1: ahgResearchPlugin v3.1.1 docs: sync internal Feature Overview + Training Manual copies with catalog v3.3.0.
</commit_message>
<xml_diff>
--- a/ahgResearchPlugin/docs/AtoM_Heratio_Research_Portal_Feature_Overview.docx
+++ b/ahgResearchPlugin/docs/AtoM_Heratio_Research_Portal_Feature_Overview.docx
@@ -7,7 +7,7 @@
         <w:pStyle w:val="Title"/>
       </w:pPr>
       <w:r>
-        <w:t xml:space="preserve">AtoM Heratio Research Portal Feature Overview</w:t>
+        <w:t xml:space="preserve">AtoM Heratio Research Portal — Feature Overview v3.3.0</w:t>
       </w:r>
     </w:p>
     <w:p>
@@ -18,7 +18,7 @@
         <w:t xml:space="preserve">The Archive and Heritage Group (Pty) Ltd</w:t>
       </w:r>
     </w:p>
-    <w:bookmarkStart w:id="43" w:name="Xda22e62a7895c8082526974830cb0c70ed7d866"/>
+    <w:bookmarkStart w:id="57" w:name="Xda22e62a7895c8082526974830cb0c70ed7d866"/>
     <w:p>
       <w:pPr>
         <w:pStyle w:val="Heading1"/>
@@ -58,7 +58,7 @@
         <w:t xml:space="preserve"> </w:t>
       </w:r>
       <w:r>
-        <w:t xml:space="preserve">3.2.0</w:t>
+        <w:t xml:space="preserve">3.3.0 (Research Enhancements release, 2026-05-16)</w:t>
       </w:r>
       <w:r>
         <w:t xml:space="preserve"> </w:t>
@@ -106,7 +106,7 @@
         <w:t xml:space="preserve"> </w:t>
       </w:r>
       <w:r>
-        <w:t xml:space="preserve">April 2026</w:t>
+        <w:t xml:space="preserve">May 2026</w:t>
       </w:r>
     </w:p>
     <w:p>
@@ -3551,13 +3551,13 @@
     </w:p>
     <w:bookmarkEnd w:id="36"/>
     <w:bookmarkEnd w:id="37"/>
-    <w:bookmarkStart w:id="38" w:name="accessibility-wcag-2.1-aa"/>
+    <w:bookmarkStart w:id="51" w:name="Xe134a2d8b1283d377cffe32021a04333b5489c8"/>
     <w:p>
       <w:pPr>
         <w:pStyle w:val="Heading2"/>
       </w:pPr>
       <w:r>
-        <w:t xml:space="preserve">Accessibility (WCAG 2.1 AA)</w:t>
+        <w:t xml:space="preserve">What’s New in 3.3.0 — Research Enhancements (May 2026)</w:t>
       </w:r>
     </w:p>
     <w:p>
@@ -3565,161 +3565,79 @@
         <w:pStyle w:val="FirstParagraph"/>
       </w:pPr>
       <w:r>
-        <w:t xml:space="preserve">The Research Portal is designed for accessibility compliance across all screens:</w:t>
-      </w:r>
-    </w:p>
-    <w:p>
-      <w:pPr>
-        <w:numPr>
-          <w:ilvl w:val="0"/>
-          <w:numId w:val="1001"/>
-        </w:numPr>
-        <w:pStyle w:val="Compact"/>
-      </w:pPr>
+        <w:t xml:space="preserve">This release adds thirteen new researcher-facing features under a single bundled</w:t>
+      </w:r>
+      <w:r>
+        <w:t xml:space="preserve"> </w:t>
+      </w:r>
+      <w:r>
+        <w:t xml:space="preserve">update. They were ported from the Laravel Heratio reference implementation</w:t>
+      </w:r>
+      <w:r>
+        <w:t xml:space="preserve"> </w:t>
+      </w:r>
+      <w:r>
+        <w:t xml:space="preserve">(</w:t>
+      </w:r>
+      <w:r>
+        <w:rPr>
+          <w:rStyle w:val="VerbatimChar"/>
+        </w:rPr>
+        <w:t xml:space="preserve">docs/research-enhancements-roadmap.md</w:t>
+      </w:r>
+      <w:r>
+        <w:t xml:space="preserve">) into the Symfony 1.4 AtoM Heratio</w:t>
+      </w:r>
+      <w:r>
+        <w:t xml:space="preserve"> </w:t>
+      </w:r>
+      <w:r>
+        <w:t xml:space="preserve">fork to give cross-instance researchers the same workflow on both platforms.</w:t>
+      </w:r>
+    </w:p>
+    <w:bookmarkStart w:id="38" w:name="studio-grounded-ai-artefact-generator"/>
+    <w:p>
+      <w:pPr>
+        <w:pStyle w:val="Heading3"/>
+      </w:pPr>
+      <w:r>
+        <w:t xml:space="preserve">Studio — grounded AI artefact generator</w:t>
+      </w:r>
+    </w:p>
+    <w:p>
+      <w:pPr>
+        <w:pStyle w:val="FirstParagraph"/>
+      </w:pPr>
+      <w:r>
+        <w:t xml:space="preserve">Every research project now has a</w:t>
+      </w:r>
+      <w:r>
+        <w:t xml:space="preserve"> </w:t>
+      </w:r>
       <w:r>
         <w:rPr>
           <w:bCs/>
           <w:b/>
         </w:rPr>
-        <w:t xml:space="preserve">Skip navigation</w:t>
-      </w:r>
-      <w:r>
-        <w:t xml:space="preserve"> </w:t>
-      </w:r>
-      <w:r>
-        <w:t xml:space="preserve">on every page for keyboard and screen reader users</w:t>
-      </w:r>
-    </w:p>
-    <w:p>
-      <w:pPr>
-        <w:numPr>
-          <w:ilvl w:val="0"/>
-          <w:numId w:val="1001"/>
-        </w:numPr>
-        <w:pStyle w:val="Compact"/>
-      </w:pPr>
-      <w:r>
-        <w:rPr>
-          <w:bCs/>
-          <w:b/>
-        </w:rPr>
-        <w:t xml:space="preserve">ARIA live regions</w:t>
-      </w:r>
-      <w:r>
-        <w:t xml:space="preserve"> </w:t>
-      </w:r>
-      <w:r>
-        <w:t xml:space="preserve">announce dynamic content changes to screen readers</w:t>
-      </w:r>
-    </w:p>
-    <w:p>
-      <w:pPr>
-        <w:numPr>
-          <w:ilvl w:val="0"/>
-          <w:numId w:val="1001"/>
-        </w:numPr>
-        <w:pStyle w:val="Compact"/>
-      </w:pPr>
-      <w:r>
-        <w:rPr>
-          <w:bCs/>
-          <w:b/>
-        </w:rPr>
-        <w:t xml:space="preserve">Data tables</w:t>
-      </w:r>
-      <w:r>
-        <w:t xml:space="preserve"> </w:t>
-      </w:r>
-      <w:r>
-        <w:t xml:space="preserve">with proper headers, captions, and scope attributes</w:t>
-      </w:r>
-    </w:p>
-    <w:p>
-      <w:pPr>
-        <w:numPr>
-          <w:ilvl w:val="0"/>
-          <w:numId w:val="1001"/>
-        </w:numPr>
-        <w:pStyle w:val="Compact"/>
-      </w:pPr>
-      <w:r>
-        <w:rPr>
-          <w:bCs/>
-          <w:b/>
-        </w:rPr>
-        <w:t xml:space="preserve">Status badges</w:t>
-      </w:r>
-      <w:r>
-        <w:t xml:space="preserve"> </w:t>
-      </w:r>
-      <w:r>
-        <w:t xml:space="preserve">use icons and text alongside colour (never colour alone)</w:t>
-      </w:r>
-    </w:p>
-    <w:p>
-      <w:pPr>
-        <w:numPr>
-          <w:ilvl w:val="0"/>
-          <w:numId w:val="1001"/>
-        </w:numPr>
-        <w:pStyle w:val="Compact"/>
-      </w:pPr>
-      <w:r>
-        <w:rPr>
-          <w:bCs/>
-          <w:b/>
-        </w:rPr>
-        <w:t xml:space="preserve">Keyboard navigation</w:t>
-      </w:r>
-      <w:r>
-        <w:t xml:space="preserve"> </w:t>
-      </w:r>
-      <w:r>
-        <w:t xml:space="preserve">for all interactive elements with visible focus indicators</w:t>
-      </w:r>
-    </w:p>
-    <w:p>
-      <w:pPr>
-        <w:numPr>
-          <w:ilvl w:val="0"/>
-          <w:numId w:val="1001"/>
-        </w:numPr>
-        <w:pStyle w:val="Compact"/>
-      </w:pPr>
-      <w:r>
-        <w:rPr>
-          <w:bCs/>
-          <w:b/>
-        </w:rPr>
-        <w:t xml:space="preserve">Form validation</w:t>
-      </w:r>
-      <w:r>
-        <w:t xml:space="preserve"> </w:t>
-      </w:r>
-      <w:r>
-        <w:t xml:space="preserve">with programmatic error association and alert roles</w:t>
-      </w:r>
-    </w:p>
-    <w:p>
-      <w:pPr>
-        <w:numPr>
-          <w:ilvl w:val="0"/>
-          <w:numId w:val="1001"/>
-        </w:numPr>
-        <w:pStyle w:val="Compact"/>
-      </w:pPr>
-      <w:r>
-        <w:rPr>
-          <w:bCs/>
-          <w:b/>
-        </w:rPr>
-        <w:t xml:space="preserve">Decorative icons</w:t>
-      </w:r>
-      <w:r>
-        <w:t xml:space="preserve"> </w:t>
-      </w:r>
-      <w:r>
-        <w:t xml:space="preserve">hidden from screen readers via</w:t>
+        <w:t xml:space="preserve">Studio</w:t>
+      </w:r>
+      <w:r>
+        <w:t xml:space="preserve"> </w:t>
+      </w:r>
+      <w:r>
+        <w:t xml:space="preserve">tab. Researchers drop in items</w:t>
+      </w:r>
+      <w:r>
+        <w:t xml:space="preserve"> </w:t>
+      </w:r>
+      <w:r>
+        <w:t xml:space="preserve">from their evidence sets, pick an output type, and the platform generates an</w:t>
+      </w:r>
+      <w:r>
+        <w:t xml:space="preserve"> </w:t>
+      </w:r>
+      <w:r>
+        <w:t xml:space="preserve">LLM-grounded artefact with</w:t>
       </w:r>
       <w:r>
         <w:t xml:space="preserve"> </w:t>
@@ -3728,24 +3646,19 @@
         <w:rPr>
           <w:rStyle w:val="VerbatimChar"/>
         </w:rPr>
-        <w:t xml:space="preserve">aria-hidden</w:t>
-      </w:r>
-    </w:p>
-    <w:p>
-      <w:r>
-        <w:pict>
-          <v:rect style="width:0;height:1.5pt" o:hralign="center" o:hrstd="t" o:hr="t"/>
-        </w:pict>
-      </w:r>
-    </w:p>
-    <w:bookmarkEnd w:id="38"/>
-    <w:bookmarkStart w:id="39" w:name="compliance-and-standards"/>
-    <w:p>
-      <w:pPr>
-        <w:pStyle w:val="Heading2"/>
-      </w:pPr>
-      <w:r>
-        <w:t xml:space="preserve">Compliance and Standards</w:t>
+        <w:t xml:space="preserve">[N]</w:t>
+      </w:r>
+      <w:r>
+        <w:t xml:space="preserve"> </w:t>
+      </w:r>
+      <w:r>
+        <w:t xml:space="preserve">citation markers tied to the source list.</w:t>
+      </w:r>
+      <w:r>
+        <w:t xml:space="preserve"> </w:t>
+      </w:r>
+      <w:r>
+        <w:t xml:space="preserve">Eight output types are supported:</w:t>
       </w:r>
     </w:p>
     <w:tbl>
@@ -3771,221 +3684,1266 @@
               <w:jc w:val="left"/>
             </w:pPr>
             <w:r>
-              <w:t xml:space="preserve">Standard</w:t>
-            </w:r>
-          </w:p>
-        </w:tc>
-        <w:tc>
-          <w:tcPr/>
-          <w:p>
-            <w:pPr>
-              <w:pStyle w:val="Compact"/>
-              <w:jc w:val="left"/>
-            </w:pPr>
-            <w:r>
-              <w:t xml:space="preserve">Coverage</w:t>
-            </w:r>
-          </w:p>
-        </w:tc>
-      </w:tr>
-      <w:tr>
-        <w:tc>
-          <w:tcPr/>
-          <w:p>
-            <w:pPr>
-              <w:pStyle w:val="Compact"/>
-              <w:jc w:val="left"/>
-            </w:pPr>
-            <w:r>
-              <w:t xml:space="preserve">WCAG 2.1 Level AA</w:t>
-            </w:r>
-          </w:p>
-        </w:tc>
-        <w:tc>
-          <w:tcPr/>
-          <w:p>
-            <w:pPr>
-              <w:pStyle w:val="Compact"/>
-              <w:jc w:val="left"/>
-            </w:pPr>
-            <w:r>
-              <w:t xml:space="preserve">All screens</w:t>
-            </w:r>
-          </w:p>
-        </w:tc>
-      </w:tr>
-      <w:tr>
-        <w:tc>
-          <w:tcPr/>
-          <w:p>
-            <w:pPr>
-              <w:pStyle w:val="Compact"/>
-              <w:jc w:val="left"/>
-            </w:pPr>
-            <w:r>
-              <w:t xml:space="preserve">Spectrum 5.1</w:t>
-            </w:r>
-          </w:p>
-        </w:tc>
-        <w:tc>
-          <w:tcPr/>
-          <w:p>
-            <w:pPr>
-              <w:pStyle w:val="Compact"/>
-              <w:jc w:val="left"/>
-            </w:pPr>
-            <w:r>
-              <w:t xml:space="preserve">Object Location and Movement Control (via custody/movement integration)</w:t>
-            </w:r>
-          </w:p>
-        </w:tc>
-      </w:tr>
-      <w:tr>
-        <w:tc>
-          <w:tcPr/>
-          <w:p>
-            <w:pPr>
-              <w:pStyle w:val="Compact"/>
-              <w:jc w:val="left"/>
-            </w:pPr>
-            <w:r>
-              <w:t xml:space="preserve">W3C Web Annotation</w:t>
-            </w:r>
-          </w:p>
-        </w:tc>
-        <w:tc>
-          <w:tcPr/>
-          <w:p>
-            <w:pPr>
-              <w:pStyle w:val="Compact"/>
-              <w:jc w:val="left"/>
-            </w:pPr>
-            <w:r>
-              <w:t xml:space="preserve">Annotation data model</w:t>
-            </w:r>
-          </w:p>
-        </w:tc>
-      </w:tr>
-      <w:tr>
-        <w:tc>
-          <w:tcPr/>
-          <w:p>
-            <w:pPr>
-              <w:pStyle w:val="Compact"/>
-              <w:jc w:val="left"/>
-            </w:pPr>
-            <w:r>
-              <w:t xml:space="preserve">IIIF</w:t>
-            </w:r>
-          </w:p>
-        </w:tc>
-        <w:tc>
-          <w:tcPr/>
-          <w:p>
-            <w:pPr>
-              <w:pStyle w:val="Compact"/>
-              <w:jc w:val="left"/>
-            </w:pPr>
-            <w:r>
-              <w:t xml:space="preserve">Manifest and annotation interoperability</w:t>
-            </w:r>
-          </w:p>
-        </w:tc>
-      </w:tr>
-      <w:tr>
-        <w:tc>
-          <w:tcPr/>
-          <w:p>
-            <w:pPr>
-              <w:pStyle w:val="Compact"/>
-              <w:jc w:val="left"/>
-            </w:pPr>
-            <w:r>
-              <w:t xml:space="preserve">RO-Crate</w:t>
-            </w:r>
-          </w:p>
-        </w:tc>
-        <w:tc>
-          <w:tcPr/>
-          <w:p>
-            <w:pPr>
-              <w:pStyle w:val="Compact"/>
-              <w:jc w:val="left"/>
-            </w:pPr>
-            <w:r>
-              <w:t xml:space="preserve">Research object packaging</w:t>
-            </w:r>
-          </w:p>
-        </w:tc>
-      </w:tr>
-      <w:tr>
-        <w:tc>
-          <w:tcPr/>
-          <w:p>
-            <w:pPr>
-              <w:pStyle w:val="Compact"/>
-              <w:jc w:val="left"/>
-            </w:pPr>
-            <w:r>
-              <w:t xml:space="preserve">DataCite</w:t>
-            </w:r>
-          </w:p>
-        </w:tc>
-        <w:tc>
-          <w:tcPr/>
-          <w:p>
-            <w:pPr>
-              <w:pStyle w:val="Compact"/>
-              <w:jc w:val="left"/>
-            </w:pPr>
-            <w:r>
-              <w:t xml:space="preserve">DOI minting</w:t>
-            </w:r>
-          </w:p>
-        </w:tc>
-      </w:tr>
-      <w:tr>
-        <w:tc>
-          <w:tcPr/>
-          <w:p>
-            <w:pPr>
-              <w:pStyle w:val="Compact"/>
-              <w:jc w:val="left"/>
-            </w:pPr>
-            <w:r>
-              <w:t xml:space="preserve">ODRL</w:t>
-            </w:r>
-          </w:p>
-        </w:tc>
-        <w:tc>
-          <w:tcPr/>
-          <w:p>
-            <w:pPr>
-              <w:pStyle w:val="Compact"/>
-              <w:jc w:val="left"/>
-            </w:pPr>
-            <w:r>
-              <w:t xml:space="preserve">Digital rights policy language</w:t>
+              <w:t xml:space="preserve">Type</w:t>
+            </w:r>
+          </w:p>
+        </w:tc>
+        <w:tc>
+          <w:tcPr/>
+          <w:p>
+            <w:pPr>
+              <w:pStyle w:val="Compact"/>
+              <w:jc w:val="left"/>
+            </w:pPr>
+            <w:r>
+              <w:t xml:space="preserve">Output</w:t>
+            </w:r>
+          </w:p>
+        </w:tc>
+      </w:tr>
+      <w:tr>
+        <w:tc>
+          <w:tcPr/>
+          <w:p>
+            <w:pPr>
+              <w:pStyle w:val="Compact"/>
+              <w:jc w:val="left"/>
+            </w:pPr>
+            <w:r>
+              <w:t xml:space="preserve">Briefing</w:t>
+            </w:r>
+          </w:p>
+        </w:tc>
+        <w:tc>
+          <w:tcPr/>
+          <w:p>
+            <w:pPr>
+              <w:pStyle w:val="Compact"/>
+              <w:jc w:val="left"/>
+            </w:pPr>
+            <w:r>
+              <w:t xml:space="preserve">400–700 word markdown brief with overview, key facts, people, themes, open questions</w:t>
+            </w:r>
+          </w:p>
+        </w:tc>
+      </w:tr>
+      <w:tr>
+        <w:tc>
+          <w:tcPr/>
+          <w:p>
+            <w:pPr>
+              <w:pStyle w:val="Compact"/>
+              <w:jc w:val="left"/>
+            </w:pPr>
+            <w:r>
+              <w:t xml:space="preserve">Study guide</w:t>
+            </w:r>
+          </w:p>
+        </w:tc>
+        <w:tc>
+          <w:tcPr/>
+          <w:p>
+            <w:pPr>
+              <w:pStyle w:val="Compact"/>
+              <w:jc w:val="left"/>
+            </w:pPr>
+            <w:r>
+              <w:t xml:space="preserve">600–1 000 word guide for graduate students with reading guide and discussion questions</w:t>
+            </w:r>
+          </w:p>
+        </w:tc>
+      </w:tr>
+      <w:tr>
+        <w:tc>
+          <w:tcPr/>
+          <w:p>
+            <w:pPr>
+              <w:pStyle w:val="Compact"/>
+              <w:jc w:val="left"/>
+            </w:pPr>
+            <w:r>
+              <w:t xml:space="preserve">FAQ</w:t>
+            </w:r>
+          </w:p>
+        </w:tc>
+        <w:tc>
+          <w:tcPr/>
+          <w:p>
+            <w:pPr>
+              <w:pStyle w:val="Compact"/>
+              <w:jc w:val="left"/>
+            </w:pPr>
+            <w:r>
+              <w:t xml:space="preserve">6–10 Q&amp;A pairs, each citing the supporting source</w:t>
+            </w:r>
+          </w:p>
+        </w:tc>
+      </w:tr>
+      <w:tr>
+        <w:tc>
+          <w:tcPr/>
+          <w:p>
+            <w:pPr>
+              <w:pStyle w:val="Compact"/>
+              <w:jc w:val="left"/>
+            </w:pPr>
+            <w:r>
+              <w:t xml:space="preserve">Timeline</w:t>
+            </w:r>
+          </w:p>
+        </w:tc>
+        <w:tc>
+          <w:tcPr/>
+          <w:p>
+            <w:pPr>
+              <w:pStyle w:val="Compact"/>
+              <w:jc w:val="left"/>
+            </w:pPr>
+            <w:r>
+              <w:t xml:space="preserve">Chronological event list with year-precision dates and source citations</w:t>
+            </w:r>
+          </w:p>
+        </w:tc>
+      </w:tr>
+      <w:tr>
+        <w:tc>
+          <w:tcPr/>
+          <w:p>
+            <w:pPr>
+              <w:pStyle w:val="Compact"/>
+              <w:jc w:val="left"/>
+            </w:pPr>
+            <w:r>
+              <w:t xml:space="preserve">Diagram</w:t>
+            </w:r>
+          </w:p>
+        </w:tc>
+        <w:tc>
+          <w:tcPr/>
+          <w:p>
+            <w:pPr>
+              <w:pStyle w:val="Compact"/>
+              <w:jc w:val="left"/>
+            </w:pPr>
+            <w:r>
+              <w:t xml:space="preserve">Mermaid graph showing entity relationships, plus a citation legend</w:t>
+            </w:r>
+          </w:p>
+        </w:tc>
+      </w:tr>
+      <w:tr>
+        <w:tc>
+          <w:tcPr/>
+          <w:p>
+            <w:pPr>
+              <w:pStyle w:val="Compact"/>
+              <w:jc w:val="left"/>
+            </w:pPr>
+            <w:r>
+              <w:t xml:space="preserve">Video script</w:t>
+            </w:r>
+          </w:p>
+        </w:tc>
+        <w:tc>
+          <w:tcPr/>
+          <w:p>
+            <w:pPr>
+              <w:pStyle w:val="Compact"/>
+              <w:jc w:val="left"/>
+            </w:pPr>
+            <w:r>
+              <w:t xml:space="preserve">Two-voice (Host/Expert) script for short documentary segments</w:t>
+            </w:r>
+          </w:p>
+        </w:tc>
+      </w:tr>
+      <w:tr>
+        <w:tc>
+          <w:tcPr/>
+          <w:p>
+            <w:pPr>
+              <w:pStyle w:val="Compact"/>
+              <w:jc w:val="left"/>
+            </w:pPr>
+            <w:r>
+              <w:t xml:space="preserve">Spreadsheet</w:t>
+            </w:r>
+          </w:p>
+        </w:tc>
+        <w:tc>
+          <w:tcPr/>
+          <w:p>
+            <w:pPr>
+              <w:pStyle w:val="Compact"/>
+              <w:jc w:val="left"/>
+            </w:pPr>
+            <w:r>
+              <w:t xml:space="preserve">Strict-JSON tabular extraction rendered to a downloadable</w:t>
+            </w:r>
+            <w:r>
+              <w:t xml:space="preserve"> </w:t>
+            </w:r>
+            <w:r>
+              <w:rPr>
+                <w:rStyle w:val="VerbatimChar"/>
+              </w:rPr>
+              <w:t xml:space="preserve">.xlsx</w:t>
+            </w:r>
+            <w:r>
+              <w:t xml:space="preserve"> </w:t>
+            </w:r>
+            <w:r>
+              <w:t xml:space="preserve">(via PhpSpreadsheet)</w:t>
+            </w:r>
+          </w:p>
+        </w:tc>
+      </w:tr>
+      <w:tr>
+        <w:tc>
+          <w:tcPr/>
+          <w:p>
+            <w:pPr>
+              <w:pStyle w:val="Compact"/>
+              <w:jc w:val="left"/>
+            </w:pPr>
+            <w:r>
+              <w:t xml:space="preserve">Audio</w:t>
+            </w:r>
+          </w:p>
+        </w:tc>
+        <w:tc>
+          <w:tcPr/>
+          <w:p>
+            <w:pPr>
+              <w:pStyle w:val="Compact"/>
+              <w:jc w:val="left"/>
+            </w:pPr>
+            <w:r>
+              <w:t xml:space="preserve">Two-voice podcast script; posted to a configurable TTS endpoint for</w:t>
+            </w:r>
+            <w:r>
+              <w:t xml:space="preserve"> </w:t>
+            </w:r>
+            <w:r>
+              <w:rPr>
+                <w:rStyle w:val="VerbatimChar"/>
+              </w:rPr>
+              <w:t xml:space="preserve">.mp3</w:t>
+            </w:r>
+            <w:r>
+              <w:t xml:space="preserve"> </w:t>
+            </w:r>
+            <w:r>
+              <w:t xml:space="preserve">rendering</w:t>
             </w:r>
           </w:p>
         </w:tc>
       </w:tr>
     </w:tbl>
     <w:p>
-      <w:r>
-        <w:pict>
-          <v:rect style="width:0;height:1.5pt" o:hralign="center" o:hrstd="t" o:hr="t"/>
-        </w:pict>
+      <w:pPr>
+        <w:pStyle w:val="BodyText"/>
+      </w:pPr>
+      <w:r>
+        <w:t xml:space="preserve">All AI calls flow through the existing AHG AI gateway via the</w:t>
+      </w:r>
+      <w:r>
+        <w:t xml:space="preserve"> </w:t>
+      </w:r>
+      <w:r>
+        <w:rPr>
+          <w:rStyle w:val="VerbatimChar"/>
+        </w:rPr>
+        <w:t xml:space="preserve">ahgAIPlugin</w:t>
+      </w:r>
+      <w:r>
+        <w:t xml:space="preserve"> </w:t>
+      </w:r>
+      <w:r>
+        <w:rPr>
+          <w:rStyle w:val="VerbatimChar"/>
+        </w:rPr>
+        <w:t xml:space="preserve">LlmService</w:t>
+      </w:r>
+      <w:r>
+        <w:t xml:space="preserve"> </w:t>
+      </w:r>
+      <w:r>
+        <w:t xml:space="preserve">— no new provider keys, no new infrastructure. Generation status,</w:t>
+      </w:r>
+      <w:r>
+        <w:t xml:space="preserve"> </w:t>
+      </w:r>
+      <w:r>
+        <w:t xml:space="preserve">token usage, model name, and elapsed time are tracked on each artefact.</w:t>
+      </w:r>
+    </w:p>
+    <w:bookmarkEnd w:id="38"/>
+    <w:bookmarkStart w:id="39" w:name="citation-hover-popovers"/>
+    <w:p>
+      <w:pPr>
+        <w:pStyle w:val="Heading3"/>
+      </w:pPr>
+      <w:r>
+        <w:t xml:space="preserve">Citation hover popovers</w:t>
+      </w:r>
+    </w:p>
+    <w:p>
+      <w:pPr>
+        <w:pStyle w:val="FirstParagraph"/>
+      </w:pPr>
+      <w:r>
+        <w:t xml:space="preserve">Any</w:t>
+      </w:r>
+      <w:r>
+        <w:t xml:space="preserve"> </w:t>
+      </w:r>
+      <w:r>
+        <w:rPr>
+          <w:rStyle w:val="VerbatimChar"/>
+        </w:rPr>
+        <w:t xml:space="preserve">[N]</w:t>
+      </w:r>
+      <w:r>
+        <w:t xml:space="preserve"> </w:t>
+      </w:r>
+      <w:r>
+        <w:t xml:space="preserve">marker in a Studio artefact, report, or research output now renders</w:t>
+      </w:r>
+      <w:r>
+        <w:t xml:space="preserve"> </w:t>
+      </w:r>
+      <w:r>
+        <w:t xml:space="preserve">as a hover popover: source title, a 220-character snippet, and an</w:t>
+      </w:r>
+      <w:r>
+        <w:t xml:space="preserve"> </w:t>
+      </w:r>
+      <w:r>
+        <w:t xml:space="preserve">“</w:t>
+      </w:r>
+      <w:r>
+        <w:t xml:space="preserve">Open</w:t>
+      </w:r>
+      <w:r>
+        <w:t xml:space="preserve"> </w:t>
+      </w:r>
+      <w:r>
+        <w:t xml:space="preserve">source</w:t>
+      </w:r>
+      <w:r>
+        <w:t xml:space="preserve">”</w:t>
+      </w:r>
+      <w:r>
+        <w:t xml:space="preserve"> </w:t>
+      </w:r>
+      <w:r>
+        <w:t xml:space="preserve">link. Clicking the marker scrolls to the matching source list entry.</w:t>
+      </w:r>
+      <w:r>
+        <w:t xml:space="preserve"> </w:t>
+      </w:r>
+      <w:r>
+        <w:t xml:space="preserve">Implemented as a single vanilla-JS file (</w:t>
+      </w:r>
+      <w:r>
+        <w:rPr>
+          <w:rStyle w:val="VerbatimChar"/>
+        </w:rPr>
+        <w:t xml:space="preserve">citation-popover.js</w:t>
+      </w:r>
+      <w:r>
+        <w:t xml:space="preserve">) with no build</w:t>
+      </w:r>
+      <w:r>
+        <w:t xml:space="preserve"> </w:t>
+      </w:r>
+      <w:r>
+        <w:t xml:space="preserve">step; uses Bootstrap 5 popovers (already in the theme).</w:t>
       </w:r>
     </w:p>
     <w:bookmarkEnd w:id="39"/>
-    <w:bookmarkStart w:id="40" w:name="technical-requirements"/>
-    <w:p>
-      <w:pPr>
-        <w:pStyle w:val="Heading2"/>
-      </w:pPr>
-      <w:r>
-        <w:t xml:space="preserve">Technical Requirements</w:t>
+    <w:bookmarkStart w:id="40" w:name="researcher-notebooks"/>
+    <w:p>
+      <w:pPr>
+        <w:pStyle w:val="Heading3"/>
+      </w:pPr>
+      <w:r>
+        <w:t xml:space="preserve">Researcher notebooks</w:t>
+      </w:r>
+    </w:p>
+    <w:p>
+      <w:pPr>
+        <w:pStyle w:val="FirstParagraph"/>
+      </w:pPr>
+      <w:r>
+        <w:t xml:space="preserve">A new researcher-owned scratchpad. Each notebook collects:</w:t>
+      </w:r>
+    </w:p>
+    <w:p>
+      <w:pPr>
+        <w:numPr>
+          <w:ilvl w:val="0"/>
+          <w:numId w:val="1001"/>
+        </w:numPr>
+        <w:pStyle w:val="Compact"/>
+      </w:pPr>
+      <w:r>
+        <w:rPr>
+          <w:bCs/>
+          <w:b/>
+        </w:rPr>
+        <w:t xml:space="preserve">Saved queries</w:t>
+      </w:r>
+      <w:r>
+        <w:t xml:space="preserve"> </w:t>
+      </w:r>
+      <w:r>
+        <w:t xml:space="preserve">(search expressions worth re-running)</w:t>
+      </w:r>
+    </w:p>
+    <w:p>
+      <w:pPr>
+        <w:numPr>
+          <w:ilvl w:val="0"/>
+          <w:numId w:val="1001"/>
+        </w:numPr>
+        <w:pStyle w:val="Compact"/>
+      </w:pPr>
+      <w:r>
+        <w:rPr>
+          <w:bCs/>
+          <w:b/>
+        </w:rPr>
+        <w:t xml:space="preserve">AI outputs</w:t>
+      </w:r>
+      <w:r>
+        <w:t xml:space="preserve"> </w:t>
+      </w:r>
+      <w:r>
+        <w:t xml:space="preserve">(raw model responses worth keeping)</w:t>
+      </w:r>
+    </w:p>
+    <w:p>
+      <w:pPr>
+        <w:numPr>
+          <w:ilvl w:val="0"/>
+          <w:numId w:val="1001"/>
+        </w:numPr>
+        <w:pStyle w:val="Compact"/>
+      </w:pPr>
+      <w:r>
+        <w:rPr>
+          <w:bCs/>
+          <w:b/>
+        </w:rPr>
+        <w:t xml:space="preserve">Source pins</w:t>
+      </w:r>
+      <w:r>
+        <w:t xml:space="preserve"> </w:t>
+      </w:r>
+      <w:r>
+        <w:t xml:space="preserve">(information objects to revisit)</w:t>
+      </w:r>
+    </w:p>
+    <w:p>
+      <w:pPr>
+        <w:numPr>
+          <w:ilvl w:val="0"/>
+          <w:numId w:val="1001"/>
+        </w:numPr>
+        <w:pStyle w:val="Compact"/>
+      </w:pPr>
+      <w:r>
+        <w:rPr>
+          <w:bCs/>
+          <w:b/>
+        </w:rPr>
+        <w:t xml:space="preserve">Freeform notes</w:t>
+      </w:r>
+    </w:p>
+    <w:p>
+      <w:pPr>
+        <w:pStyle w:val="FirstParagraph"/>
+      </w:pPr>
+      <w:r>
+        <w:t xml:space="preserve">Items can be pinned to the top, reordered, and removed. A one-click</w:t>
+      </w:r>
+      <w:r>
+        <w:t xml:space="preserve"> </w:t>
+      </w:r>
+      <w:r>
+        <w:rPr>
+          <w:bCs/>
+          <w:b/>
+        </w:rPr>
+        <w:t xml:space="preserve">Promote to project</w:t>
+      </w:r>
+      <w:r>
+        <w:t xml:space="preserve"> </w:t>
+      </w:r>
+      <w:r>
+        <w:t xml:space="preserve">action turns a notebook into a public research</w:t>
+      </w:r>
+      <w:r>
+        <w:t xml:space="preserve"> </w:t>
+      </w:r>
+      <w:r>
+        <w:t xml:space="preserve">project: it creates the</w:t>
+      </w:r>
+      <w:r>
+        <w:t xml:space="preserve"> </w:t>
+      </w:r>
+      <w:r>
+        <w:rPr>
+          <w:rStyle w:val="VerbatimChar"/>
+        </w:rPr>
+        <w:t xml:space="preserve">research_project</w:t>
+      </w:r>
+      <w:r>
+        <w:t xml:space="preserve"> </w:t>
+      </w:r>
+      <w:r>
+        <w:t xml:space="preserve">row, the owner-collaborator</w:t>
+      </w:r>
+      <w:r>
+        <w:t xml:space="preserve"> </w:t>
+      </w:r>
+      <w:r>
+        <w:t xml:space="preserve">record, a new collection seeded with the pinned sources, and marks the</w:t>
+      </w:r>
+      <w:r>
+        <w:t xml:space="preserve"> </w:t>
+      </w:r>
+      <w:r>
+        <w:t xml:space="preserve">notebook as promoted (idempotent — re-promotion returns the original</w:t>
+      </w:r>
+      <w:r>
+        <w:t xml:space="preserve"> </w:t>
+      </w:r>
+      <w:r>
+        <w:t xml:space="preserve">project id).</w:t>
+      </w:r>
+    </w:p>
+    <w:bookmarkEnd w:id="40"/>
+    <w:bookmarkStart w:id="41" w:name="cross-fonds-reasoning-queries"/>
+    <w:p>
+      <w:pPr>
+        <w:pStyle w:val="Heading3"/>
+      </w:pPr>
+      <w:r>
+        <w:t xml:space="preserve">Cross-fonds reasoning queries</w:t>
+      </w:r>
+    </w:p>
+    <w:p>
+      <w:pPr>
+        <w:pStyle w:val="FirstParagraph"/>
+      </w:pPr>
+      <w:r>
+        <w:t xml:space="preserve">A single query is fanned out across N selected fonds in parallel. Each</w:t>
+      </w:r>
+      <w:r>
+        <w:t xml:space="preserve"> </w:t>
+      </w:r>
+      <w:r>
+        <w:t xml:space="preserve">fonds is queried via its</w:t>
+      </w:r>
+      <w:r>
+        <w:t xml:space="preserve"> </w:t>
+      </w:r>
+      <w:r>
+        <w:rPr>
+          <w:rStyle w:val="VerbatimChar"/>
+        </w:rPr>
+        <w:t xml:space="preserve">lft</w:t>
+      </w:r>
+      <w:r>
+        <w:t xml:space="preserve">/</w:t>
+      </w:r>
+      <w:r>
+        <w:rPr>
+          <w:rStyle w:val="VerbatimChar"/>
+        </w:rPr>
+        <w:t xml:space="preserve">rgt</w:t>
+      </w:r>
+      <w:r>
+        <w:t xml:space="preserve"> </w:t>
+      </w:r>
+      <w:r>
+        <w:t xml:space="preserve">MPTT range; per-fonds top-K hits are</w:t>
+      </w:r>
+      <w:r>
+        <w:t xml:space="preserve"> </w:t>
+      </w:r>
+      <w:r>
+        <w:t xml:space="preserve">merged and reranked by score; a single ranked list is returned. Optional</w:t>
+      </w:r>
+      <w:r>
+        <w:t xml:space="preserve"> </w:t>
+      </w:r>
+      <w:r>
+        <w:t xml:space="preserve">thesaurus expansion via</w:t>
+      </w:r>
+      <w:r>
+        <w:t xml:space="preserve"> </w:t>
+      </w:r>
+      <w:r>
+        <w:rPr>
+          <w:rStyle w:val="VerbatimChar"/>
+        </w:rPr>
+        <w:t xml:space="preserve">SemanticSearchService::expandQuery()</w:t>
+      </w:r>
+      <w:r>
+        <w:t xml:space="preserve"> </w:t>
+      </w:r>
+      <w:r>
+        <w:t xml:space="preserve">widens</w:t>
+      </w:r>
+      <w:r>
+        <w:t xml:space="preserve"> </w:t>
+      </w:r>
+      <w:r>
+        <w:t xml:space="preserve">queries when enabled.</w:t>
+      </w:r>
+    </w:p>
+    <w:p>
+      <w:pPr>
+        <w:pStyle w:val="BodyText"/>
+      </w:pPr>
+      <w:r>
+        <w:t xml:space="preserve">Per-fonds K is 10; final K is 30 — both configurable. Query history is</w:t>
+      </w:r>
+      <w:r>
+        <w:t xml:space="preserve"> </w:t>
+      </w:r>
+      <w:r>
+        <w:t xml:space="preserve">persisted to</w:t>
+      </w:r>
+      <w:r>
+        <w:t xml:space="preserve"> </w:t>
+      </w:r>
+      <w:r>
+        <w:rPr>
+          <w:rStyle w:val="VerbatimChar"/>
+        </w:rPr>
+        <w:t xml:space="preserve">research_cross_fonds_query</w:t>
+      </w:r>
+      <w:r>
+        <w:t xml:space="preserve"> </w:t>
+      </w:r>
+      <w:r>
+        <w:t xml:space="preserve">for analytics and audit.</w:t>
+      </w:r>
+    </w:p>
+    <w:bookmarkEnd w:id="41"/>
+    <w:bookmarkStart w:id="42" w:name="research-analytics-dashboard"/>
+    <w:p>
+      <w:pPr>
+        <w:pStyle w:val="Heading3"/>
+      </w:pPr>
+      <w:r>
+        <w:t xml:space="preserve">Research analytics dashboard</w:t>
+      </w:r>
+    </w:p>
+    <w:p>
+      <w:pPr>
+        <w:pStyle w:val="FirstParagraph"/>
+      </w:pPr>
+      <w:r>
+        <w:t xml:space="preserve">A new date-filtered dashboard at</w:t>
+      </w:r>
+      <w:r>
+        <w:t xml:space="preserve"> </w:t>
+      </w:r>
+      <w:r>
+        <w:rPr>
+          <w:rStyle w:val="VerbatimChar"/>
+        </w:rPr>
+        <w:t xml:space="preserve">/research/analytics</w:t>
+      </w:r>
+      <w:r>
+        <w:t xml:space="preserve"> </w:t>
+      </w:r>
+      <w:r>
+        <w:t xml:space="preserve">aggregates the</w:t>
+      </w:r>
+      <w:r>
+        <w:t xml:space="preserve"> </w:t>
+      </w:r>
+      <w:r>
+        <w:t xml:space="preserve">already-logged</w:t>
+      </w:r>
+      <w:r>
+        <w:t xml:space="preserve"> </w:t>
+      </w:r>
+      <w:r>
+        <w:rPr>
+          <w:rStyle w:val="VerbatimChar"/>
+        </w:rPr>
+        <w:t xml:space="preserve">research_activity_log</w:t>
+      </w:r>
+      <w:r>
+        <w:t xml:space="preserve"> </w:t>
+      </w:r>
+      <w:r>
+        <w:t xml:space="preserve">and</w:t>
+      </w:r>
+      <w:r>
+        <w:t xml:space="preserve"> </w:t>
+      </w:r>
+      <w:r>
+        <w:rPr>
+          <w:rStyle w:val="VerbatimChar"/>
+        </w:rPr>
+        <w:t xml:space="preserve">research_citation_log</w:t>
+      </w:r>
+      <w:r>
+        <w:t xml:space="preserve"> </w:t>
+      </w:r>
+      <w:r>
+        <w:t xml:space="preserve">tables</w:t>
+      </w:r>
+      <w:r>
+        <w:t xml:space="preserve"> </w:t>
+      </w:r>
+      <w:r>
+        <w:t xml:space="preserve">into:</w:t>
+      </w:r>
+    </w:p>
+    <w:p>
+      <w:pPr>
+        <w:numPr>
+          <w:ilvl w:val="0"/>
+          <w:numId w:val="1002"/>
+        </w:numPr>
+        <w:pStyle w:val="Compact"/>
+      </w:pPr>
+      <w:r>
+        <w:rPr>
+          <w:bCs/>
+          <w:b/>
+        </w:rPr>
+        <w:t xml:space="preserve">Eight KPI tiles</w:t>
+      </w:r>
+      <w:r>
+        <w:t xml:space="preserve">: total events, researchers, objects, views, searches, citations, downloads, annotations</w:t>
+      </w:r>
+    </w:p>
+    <w:p>
+      <w:pPr>
+        <w:numPr>
+          <w:ilvl w:val="0"/>
+          <w:numId w:val="1002"/>
+        </w:numPr>
+        <w:pStyle w:val="Compact"/>
+      </w:pPr>
+      <w:r>
+        <w:rPr>
+          <w:bCs/>
+          <w:b/>
+        </w:rPr>
+        <w:t xml:space="preserve">Daily volume bar chart</w:t>
+      </w:r>
+      <w:r>
+        <w:t xml:space="preserve"> </w:t>
+      </w:r>
+      <w:r>
+        <w:t xml:space="preserve">(inline divs — no Chart.js dependency)</w:t>
+      </w:r>
+    </w:p>
+    <w:p>
+      <w:pPr>
+        <w:numPr>
+          <w:ilvl w:val="0"/>
+          <w:numId w:val="1002"/>
+        </w:numPr>
+        <w:pStyle w:val="Compact"/>
+      </w:pPr>
+      <w:r>
+        <w:rPr>
+          <w:bCs/>
+          <w:b/>
+        </w:rPr>
+        <w:t xml:space="preserve">Top researchers</w:t>
+      </w:r>
+      <w:r>
+        <w:t xml:space="preserve">,</w:t>
+      </w:r>
+      <w:r>
+        <w:t xml:space="preserve"> </w:t>
+      </w:r>
+      <w:r>
+        <w:rPr>
+          <w:bCs/>
+          <w:b/>
+        </w:rPr>
+        <w:t xml:space="preserve">popular descriptions</w:t>
+      </w:r>
+      <w:r>
+        <w:t xml:space="preserve">,</w:t>
+      </w:r>
+      <w:r>
+        <w:t xml:space="preserve"> </w:t>
+      </w:r>
+      <w:r>
+        <w:rPr>
+          <w:bCs/>
+          <w:b/>
+        </w:rPr>
+        <w:t xml:space="preserve">popular collections</w:t>
+      </w:r>
+    </w:p>
+    <w:p>
+      <w:pPr>
+        <w:numPr>
+          <w:ilvl w:val="0"/>
+          <w:numId w:val="1002"/>
+        </w:numPr>
+        <w:pStyle w:val="Compact"/>
+      </w:pPr>
+      <w:r>
+        <w:rPr>
+          <w:bCs/>
+          <w:b/>
+        </w:rPr>
+        <w:t xml:space="preserve">Top search terms</w:t>
+      </w:r>
+      <w:r>
+        <w:t xml:space="preserve">,</w:t>
+      </w:r>
+      <w:r>
+        <w:t xml:space="preserve"> </w:t>
+      </w:r>
+      <w:r>
+        <w:rPr>
+          <w:bCs/>
+          <w:b/>
+        </w:rPr>
+        <w:t xml:space="preserve">citations by style/format</w:t>
+      </w:r>
+    </w:p>
+    <w:p>
+      <w:pPr>
+        <w:numPr>
+          <w:ilvl w:val="0"/>
+          <w:numId w:val="1002"/>
+        </w:numPr>
+        <w:pStyle w:val="Compact"/>
+      </w:pPr>
+      <w:r>
+        <w:rPr>
+          <w:bCs/>
+          <w:b/>
+        </w:rPr>
+        <w:t xml:space="preserve">Day-of-week distribution</w:t>
+      </w:r>
+    </w:p>
+    <w:p>
+      <w:pPr>
+        <w:pStyle w:val="FirstParagraph"/>
+      </w:pPr>
+      <w:r>
+        <w:t xml:space="preserve">No new audit tables; the data is already being logged by existing actions.</w:t>
+      </w:r>
+      <w:r>
+        <w:t xml:space="preserve"> </w:t>
+      </w:r>
+      <w:r>
+        <w:t xml:space="preserve">New activity types added:</w:t>
+      </w:r>
+      <w:r>
+        <w:t xml:space="preserve"> </w:t>
+      </w:r>
+      <w:r>
+        <w:rPr>
+          <w:rStyle w:val="VerbatimChar"/>
+        </w:rPr>
+        <w:t xml:space="preserve">ai_studio</w:t>
+      </w:r>
+      <w:r>
+        <w:t xml:space="preserve">,</w:t>
+      </w:r>
+      <w:r>
+        <w:t xml:space="preserve"> </w:t>
+      </w:r>
+      <w:r>
+        <w:rPr>
+          <w:rStyle w:val="VerbatimChar"/>
+        </w:rPr>
+        <w:t xml:space="preserve">search_cross_fonds</w:t>
+      </w:r>
+      <w:r>
+        <w:t xml:space="preserve">,</w:t>
+      </w:r>
+      <w:r>
+        <w:t xml:space="preserve"> </w:t>
+      </w:r>
+      <w:r>
+        <w:rPr>
+          <w:rStyle w:val="VerbatimChar"/>
+        </w:rPr>
+        <w:t xml:space="preserve">notebook_item_added</w:t>
+      </w:r>
+      <w:r>
+        <w:t xml:space="preserve">,</w:t>
+      </w:r>
+      <w:r>
+        <w:t xml:space="preserve"> </w:t>
+      </w:r>
+      <w:r>
+        <w:rPr>
+          <w:rStyle w:val="VerbatimChar"/>
+        </w:rPr>
+        <w:t xml:space="preserve">cite_export</w:t>
+      </w:r>
+      <w:r>
+        <w:t xml:space="preserve">.</w:t>
+      </w:r>
+    </w:p>
+    <w:bookmarkEnd w:id="42"/>
+    <w:bookmarkStart w:id="43" w:name="real-time-collaboration-polling"/>
+    <w:p>
+      <w:pPr>
+        <w:pStyle w:val="Heading3"/>
+      </w:pPr>
+      <w:r>
+        <w:t xml:space="preserve">Real-time collaboration (polling)</w:t>
+      </w:r>
+    </w:p>
+    <w:p>
+      <w:pPr>
+        <w:pStyle w:val="FirstParagraph"/>
+      </w:pPr>
+      <w:r>
+        <w:t xml:space="preserve">Project-scoped live collaboration without a WebSocket broker:</w:t>
+      </w:r>
+    </w:p>
+    <w:p>
+      <w:pPr>
+        <w:numPr>
+          <w:ilvl w:val="0"/>
+          <w:numId w:val="1003"/>
+        </w:numPr>
+        <w:pStyle w:val="Compact"/>
+      </w:pPr>
+      <w:r>
+        <w:rPr>
+          <w:bCs/>
+          <w:b/>
+        </w:rPr>
+        <w:t xml:space="preserve">Presence indicators</w:t>
+      </w:r>
+      <w:r>
+        <w:t xml:space="preserve"> </w:t>
+      </w:r>
+      <w:r>
+        <w:t xml:space="preserve">— each active collaborator gets a distinct colour</w:t>
+      </w:r>
+      <w:r>
+        <w:t xml:space="preserve"> </w:t>
+      </w:r>
+      <w:r>
+        <w:t xml:space="preserve">and appears in the</w:t>
+      </w:r>
+      <w:r>
+        <w:t xml:space="preserve"> </w:t>
+      </w:r>
+      <w:r>
+        <w:t xml:space="preserve">“</w:t>
+      </w:r>
+      <w:r>
+        <w:t xml:space="preserve">Online now</w:t>
+      </w:r>
+      <w:r>
+        <w:t xml:space="preserve">”</w:t>
+      </w:r>
+      <w:r>
+        <w:t xml:space="preserve"> </w:t>
+      </w:r>
+      <w:r>
+        <w:t xml:space="preserve">list. Stale entries (90 s without a</w:t>
+      </w:r>
+      <w:r>
+        <w:t xml:space="preserve"> </w:t>
+      </w:r>
+      <w:r>
+        <w:t xml:space="preserve">heartbeat) are dropped automatically.</w:t>
+      </w:r>
+    </w:p>
+    <w:p>
+      <w:pPr>
+        <w:numPr>
+          <w:ilvl w:val="0"/>
+          <w:numId w:val="1003"/>
+        </w:numPr>
+        <w:pStyle w:val="Compact"/>
+      </w:pPr>
+      <w:r>
+        <w:rPr>
+          <w:bCs/>
+          <w:b/>
+        </w:rPr>
+        <w:t xml:space="preserve">Threaded project comments</w:t>
+      </w:r>
+      <w:r>
+        <w:t xml:space="preserve"> </w:t>
+      </w:r>
+      <w:r>
+        <w:t xml:space="preserve">with</w:t>
+      </w:r>
+      <w:r>
+        <w:t xml:space="preserve"> </w:t>
+      </w:r>
+      <w:r>
+        <w:rPr>
+          <w:bCs/>
+          <w:b/>
+        </w:rPr>
+        <w:t xml:space="preserve">resolve</w:t>
+      </w:r>
+      <w:r>
+        <w:t xml:space="preserve"> </w:t>
+      </w:r>
+      <w:r>
+        <w:t xml:space="preserve">workflow. Reuses the</w:t>
+      </w:r>
+      <w:r>
+        <w:t xml:space="preserve"> </w:t>
+      </w:r>
+      <w:r>
+        <w:t xml:space="preserve">existing</w:t>
+      </w:r>
+      <w:r>
+        <w:t xml:space="preserve"> </w:t>
+      </w:r>
+      <w:r>
+        <w:rPr>
+          <w:rStyle w:val="VerbatimChar"/>
+        </w:rPr>
+        <w:t xml:space="preserve">research_comment</w:t>
+      </w:r>
+      <w:r>
+        <w:t xml:space="preserve"> </w:t>
+      </w:r>
+      <w:r>
+        <w:t xml:space="preserve">polymorphic table (</w:t>
+      </w:r>
+      <w:r>
+        <w:rPr>
+          <w:rStyle w:val="VerbatimChar"/>
+        </w:rPr>
+        <w:t xml:space="preserve">entity_type='project'</w:t>
+      </w:r>
+      <w:r>
+        <w:t xml:space="preserve">).</w:t>
+      </w:r>
+    </w:p>
+    <w:p>
+      <w:pPr>
+        <w:numPr>
+          <w:ilvl w:val="0"/>
+          <w:numId w:val="1003"/>
+        </w:numPr>
+        <w:pStyle w:val="Compact"/>
+      </w:pPr>
+      <w:r>
+        <w:rPr>
+          <w:bCs/>
+          <w:b/>
+        </w:rPr>
+        <w:t xml:space="preserve">3 s polling cadence</w:t>
+      </w:r>
+      <w:r>
+        <w:t xml:space="preserve"> </w:t>
+      </w:r>
+      <w:r>
+        <w:t xml:space="preserve">with a comment-id cursor; both presence and new</w:t>
+      </w:r>
+      <w:r>
+        <w:t xml:space="preserve"> </w:t>
+      </w:r>
+      <w:r>
+        <w:t xml:space="preserve">comments come back in a single round-trip.</w:t>
+      </w:r>
+    </w:p>
+    <w:p>
+      <w:pPr>
+        <w:numPr>
+          <w:ilvl w:val="0"/>
+          <w:numId w:val="1003"/>
+        </w:numPr>
+        <w:pStyle w:val="Compact"/>
+      </w:pPr>
+      <w:r>
+        <w:rPr>
+          <w:bCs/>
+          <w:b/>
+        </w:rPr>
+        <w:t xml:space="preserve">Shared IIIF annotations</w:t>
+      </w:r>
+      <w:r>
+        <w:t xml:space="preserve"> </w:t>
+      </w:r>
+      <w:r>
+        <w:t xml:space="preserve">—</w:t>
+      </w:r>
+      <w:r>
+        <w:t xml:space="preserve"> </w:t>
+      </w:r>
+      <w:r>
+        <w:rPr>
+          <w:rStyle w:val="VerbatimChar"/>
+        </w:rPr>
+        <w:t xml:space="preserve">research_annotation</w:t>
+      </w:r>
+      <w:r>
+        <w:t xml:space="preserve"> </w:t>
+      </w:r>
+      <w:r>
+        <w:t xml:space="preserve">already has</w:t>
+      </w:r>
+      <w:r>
+        <w:t xml:space="preserve"> </w:t>
+      </w:r>
+      <w:r>
+        <w:rPr>
+          <w:rStyle w:val="VerbatimChar"/>
+        </w:rPr>
+        <w:t xml:space="preserve">project_id</w:t>
+      </w:r>
+    </w:p>
+    <w:p>
+      <w:pPr>
+        <w:numPr>
+          <w:ilvl w:val="1"/>
+          <w:numId w:val="1004"/>
+        </w:numPr>
+        <w:pStyle w:val="Compact"/>
+      </w:pPr>
+      <w:r>
+        <w:rPr>
+          <w:rStyle w:val="VerbatimChar"/>
+        </w:rPr>
+        <w:t xml:space="preserve">visibility</w:t>
+      </w:r>
+      <w:r>
+        <w:t xml:space="preserve"> </w:t>
+      </w:r>
+      <w:r>
+        <w:t xml:space="preserve">(</w:t>
+      </w:r>
+      <w:r>
+        <w:rPr>
+          <w:rStyle w:val="VerbatimChar"/>
+        </w:rPr>
+        <w:t xml:space="preserve">private</w:t>
+      </w:r>
+      <w:r>
+        <w:t xml:space="preserve"> </w:t>
+      </w:r>
+      <w:r>
+        <w:t xml:space="preserve">/</w:t>
+      </w:r>
+      <w:r>
+        <w:t xml:space="preserve"> </w:t>
+      </w:r>
+      <w:r>
+        <w:rPr>
+          <w:rStyle w:val="VerbatimChar"/>
+        </w:rPr>
+        <w:t xml:space="preserve">shared</w:t>
+      </w:r>
+      <w:r>
+        <w:t xml:space="preserve"> </w:t>
+      </w:r>
+      <w:r>
+        <w:t xml:space="preserve">/</w:t>
+      </w:r>
+      <w:r>
+        <w:t xml:space="preserve"> </w:t>
+      </w:r>
+      <w:r>
+        <w:rPr>
+          <w:rStyle w:val="VerbatimChar"/>
+        </w:rPr>
+        <w:t xml:space="preserve">public</w:t>
+      </w:r>
+      <w:r>
+        <w:t xml:space="preserve">), so collaborators on the</w:t>
+      </w:r>
+      <w:r>
+        <w:t xml:space="preserve"> </w:t>
+      </w:r>
+      <w:r>
+        <w:t xml:space="preserve">same project see each other’s shared annotations on the same canvas.</w:t>
+      </w:r>
+    </w:p>
+    <w:p>
+      <w:pPr>
+        <w:pStyle w:val="FirstParagraph"/>
+      </w:pPr>
+      <w:r>
+        <w:t xml:space="preserve">The polling architecture allows a Reverb/Pusher swap-in later if a broker</w:t>
+      </w:r>
+      <w:r>
+        <w:t xml:space="preserve"> </w:t>
+      </w:r>
+      <w:r>
+        <w:t xml:space="preserve">becomes available.</w:t>
+      </w:r>
+    </w:p>
+    <w:bookmarkEnd w:id="43"/>
+    <w:bookmarkStart w:id="44" w:name="per-record-citation-manager-export"/>
+    <w:p>
+      <w:pPr>
+        <w:pStyle w:val="Heading3"/>
+      </w:pPr>
+      <w:r>
+        <w:t xml:space="preserve">Per-record citation manager export</w:t>
+      </w:r>
+    </w:p>
+    <w:p>
+      <w:pPr>
+        <w:pStyle w:val="FirstParagraph"/>
+      </w:pPr>
+      <w:r>
+        <w:t xml:space="preserve">In addition to the existing styled citation card (Chicago / MLA / Turabian</w:t>
+      </w:r>
+      <w:r>
+        <w:t xml:space="preserve"> </w:t>
+      </w:r>
+      <w:r>
+        <w:t xml:space="preserve">/ APA / Harvard / UNISA), each record now has a</w:t>
+      </w:r>
+      <w:r>
+        <w:t xml:space="preserve"> </w:t>
+      </w:r>
+      <w:r>
+        <w:rPr>
+          <w:bCs/>
+          <w:b/>
+        </w:rPr>
+        <w:t xml:space="preserve">Copy in citation</w:t>
+      </w:r>
+      <w:r>
+        <w:rPr>
+          <w:bCs/>
+          <w:b/>
+        </w:rPr>
+        <w:t xml:space="preserve"> </w:t>
+      </w:r>
+      <w:r>
+        <w:rPr>
+          <w:bCs/>
+          <w:b/>
+        </w:rPr>
+        <w:t xml:space="preserve">manager format</w:t>
+      </w:r>
+      <w:r>
+        <w:t xml:space="preserve"> </w:t>
+      </w:r>
+      <w:r>
+        <w:t xml:space="preserve">card with six file-format downloads:</w:t>
       </w:r>
     </w:p>
     <w:tbl>
@@ -4011,154 +4969,1362 @@
               <w:jc w:val="left"/>
             </w:pPr>
             <w:r>
-              <w:t xml:space="preserve">Requirement</w:t>
-            </w:r>
-          </w:p>
-        </w:tc>
-        <w:tc>
-          <w:tcPr/>
-          <w:p>
-            <w:pPr>
-              <w:pStyle w:val="Compact"/>
-              <w:jc w:val="left"/>
-            </w:pPr>
-            <w:r>
-              <w:t xml:space="preserve">Specification</w:t>
-            </w:r>
-          </w:p>
-        </w:tc>
-      </w:tr>
-      <w:tr>
-        <w:tc>
-          <w:tcPr/>
-          <w:p>
-            <w:pPr>
-              <w:pStyle w:val="Compact"/>
-              <w:jc w:val="left"/>
-            </w:pPr>
-            <w:r>
-              <w:t xml:space="preserve">Platform</w:t>
-            </w:r>
-          </w:p>
-        </w:tc>
-        <w:tc>
-          <w:tcPr/>
-          <w:p>
-            <w:pPr>
-              <w:pStyle w:val="Compact"/>
-              <w:jc w:val="left"/>
-            </w:pPr>
-            <w:r>
-              <w:t xml:space="preserve">AtoM 2.10 with AtoM Heratio Framework v2.8.2+</w:t>
-            </w:r>
-          </w:p>
-        </w:tc>
-      </w:tr>
-      <w:tr>
-        <w:tc>
-          <w:tcPr/>
-          <w:p>
-            <w:pPr>
-              <w:pStyle w:val="Compact"/>
-              <w:jc w:val="left"/>
-            </w:pPr>
-            <w:r>
-              <w:t xml:space="preserve">PHP</w:t>
-            </w:r>
-          </w:p>
-        </w:tc>
-        <w:tc>
-          <w:tcPr/>
-          <w:p>
-            <w:pPr>
-              <w:pStyle w:val="Compact"/>
-              <w:jc w:val="left"/>
-            </w:pPr>
-            <w:r>
-              <w:t xml:space="preserve">8.3+</w:t>
-            </w:r>
-          </w:p>
-        </w:tc>
-      </w:tr>
-      <w:tr>
-        <w:tc>
-          <w:tcPr/>
-          <w:p>
-            <w:pPr>
-              <w:pStyle w:val="Compact"/>
-              <w:jc w:val="left"/>
-            </w:pPr>
-            <w:r>
-              <w:t xml:space="preserve">Database</w:t>
-            </w:r>
-          </w:p>
-        </w:tc>
-        <w:tc>
-          <w:tcPr/>
-          <w:p>
-            <w:pPr>
-              <w:pStyle w:val="Compact"/>
-              <w:jc w:val="left"/>
-            </w:pPr>
-            <w:r>
-              <w:t xml:space="preserve">MySQL 8.0+</w:t>
-            </w:r>
-          </w:p>
-        </w:tc>
-      </w:tr>
-      <w:tr>
-        <w:tc>
-          <w:tcPr/>
-          <w:p>
-            <w:pPr>
-              <w:pStyle w:val="Compact"/>
-              <w:jc w:val="left"/>
-            </w:pPr>
-            <w:r>
-              <w:t xml:space="preserve">Browser</w:t>
-            </w:r>
-          </w:p>
-        </w:tc>
-        <w:tc>
-          <w:tcPr/>
-          <w:p>
-            <w:pPr>
-              <w:pStyle w:val="Compact"/>
-              <w:jc w:val="left"/>
-            </w:pPr>
-            <w:r>
-              <w:t xml:space="preserve">Chrome 90+, Firefox 90+, Safari 14+, Edge 90+</w:t>
-            </w:r>
-          </w:p>
-        </w:tc>
-      </w:tr>
-      <w:tr>
-        <w:tc>
-          <w:tcPr/>
-          <w:p>
-            <w:pPr>
-              <w:pStyle w:val="Compact"/>
-              <w:jc w:val="left"/>
-            </w:pPr>
-            <w:r>
-              <w:t xml:space="preserve">Dependencies</w:t>
-            </w:r>
-          </w:p>
-        </w:tc>
-        <w:tc>
-          <w:tcPr/>
-          <w:p>
-            <w:pPr>
-              <w:pStyle w:val="Compact"/>
-              <w:jc w:val="left"/>
-            </w:pPr>
-            <w:r>
-              <w:t xml:space="preserve">Bootstrap 5 (included), Font Awesome 6 (included)</w:t>
+              <w:t xml:space="preserve">Format</w:t>
+            </w:r>
+          </w:p>
+        </w:tc>
+        <w:tc>
+          <w:tcPr/>
+          <w:p>
+            <w:pPr>
+              <w:pStyle w:val="Compact"/>
+              <w:jc w:val="left"/>
+            </w:pPr>
+            <w:r>
+              <w:t xml:space="preserve">Use case</w:t>
+            </w:r>
+          </w:p>
+        </w:tc>
+      </w:tr>
+      <w:tr>
+        <w:tc>
+          <w:tcPr/>
+          <w:p>
+            <w:pPr>
+              <w:pStyle w:val="Compact"/>
+              <w:jc w:val="left"/>
+            </w:pPr>
+            <w:r>
+              <w:t xml:space="preserve">RIS</w:t>
+            </w:r>
+          </w:p>
+        </w:tc>
+        <w:tc>
+          <w:tcPr/>
+          <w:p>
+            <w:pPr>
+              <w:pStyle w:val="Compact"/>
+              <w:jc w:val="left"/>
+            </w:pPr>
+            <w:r>
+              <w:t xml:space="preserve">Zotero, Mendeley, EndNote import</w:t>
+            </w:r>
+          </w:p>
+        </w:tc>
+      </w:tr>
+      <w:tr>
+        <w:tc>
+          <w:tcPr/>
+          <w:p>
+            <w:pPr>
+              <w:pStyle w:val="Compact"/>
+              <w:jc w:val="left"/>
+            </w:pPr>
+            <w:r>
+              <w:t xml:space="preserve">BibTeX</w:t>
+            </w:r>
+          </w:p>
+        </w:tc>
+        <w:tc>
+          <w:tcPr/>
+          <w:p>
+            <w:pPr>
+              <w:pStyle w:val="Compact"/>
+              <w:jc w:val="left"/>
+            </w:pPr>
+            <w:r>
+              <w:t xml:space="preserve">LaTeX, JabRef</w:t>
+            </w:r>
+          </w:p>
+        </w:tc>
+      </w:tr>
+      <w:tr>
+        <w:tc>
+          <w:tcPr/>
+          <w:p>
+            <w:pPr>
+              <w:pStyle w:val="Compact"/>
+              <w:jc w:val="left"/>
+            </w:pPr>
+            <w:r>
+              <w:t xml:space="preserve">EndNote XML</w:t>
+            </w:r>
+          </w:p>
+        </w:tc>
+        <w:tc>
+          <w:tcPr/>
+          <w:p>
+            <w:pPr>
+              <w:pStyle w:val="Compact"/>
+              <w:jc w:val="left"/>
+            </w:pPr>
+            <w:r>
+              <w:t xml:space="preserve">EndNote desktop</w:t>
+            </w:r>
+          </w:p>
+        </w:tc>
+      </w:tr>
+      <w:tr>
+        <w:tc>
+          <w:tcPr/>
+          <w:p>
+            <w:pPr>
+              <w:pStyle w:val="Compact"/>
+              <w:jc w:val="left"/>
+            </w:pPr>
+            <w:r>
+              <w:t xml:space="preserve">APA 7</w:t>
+            </w:r>
+          </w:p>
+        </w:tc>
+        <w:tc>
+          <w:tcPr/>
+          <w:p>
+            <w:pPr>
+              <w:pStyle w:val="Compact"/>
+              <w:jc w:val="left"/>
+            </w:pPr>
+            <w:r>
+              <w:t xml:space="preserve">Plain-text APA citation for paste-into-essay</w:t>
+            </w:r>
+          </w:p>
+        </w:tc>
+      </w:tr>
+      <w:tr>
+        <w:tc>
+          <w:tcPr/>
+          <w:p>
+            <w:pPr>
+              <w:pStyle w:val="Compact"/>
+              <w:jc w:val="left"/>
+            </w:pPr>
+            <w:r>
+              <w:t xml:space="preserve">MLA 9</w:t>
+            </w:r>
+          </w:p>
+        </w:tc>
+        <w:tc>
+          <w:tcPr/>
+          <w:p>
+            <w:pPr>
+              <w:pStyle w:val="Compact"/>
+              <w:jc w:val="left"/>
+            </w:pPr>
+            <w:r>
+              <w:t xml:space="preserve">Plain-text MLA citation</w:t>
+            </w:r>
+          </w:p>
+        </w:tc>
+      </w:tr>
+      <w:tr>
+        <w:tc>
+          <w:tcPr/>
+          <w:p>
+            <w:pPr>
+              <w:pStyle w:val="Compact"/>
+              <w:jc w:val="left"/>
+            </w:pPr>
+            <w:r>
+              <w:t xml:space="preserve">Chicago 17</w:t>
+            </w:r>
+          </w:p>
+        </w:tc>
+        <w:tc>
+          <w:tcPr/>
+          <w:p>
+            <w:pPr>
+              <w:pStyle w:val="Compact"/>
+              <w:jc w:val="left"/>
+            </w:pPr>
+            <w:r>
+              <w:t xml:space="preserve">Plain-text Chicago Notes-Bibliography</w:t>
             </w:r>
           </w:p>
         </w:tc>
       </w:tr>
     </w:tbl>
+    <w:p>
+      <w:pPr>
+        <w:pStyle w:val="BodyText"/>
+      </w:pPr>
+      <w:r>
+        <w:t xml:space="preserve">Each download is a real file with the correct MIME type</w:t>
+      </w:r>
+      <w:r>
+        <w:t xml:space="preserve"> </w:t>
+      </w:r>
+      <w:r>
+        <w:t xml:space="preserve">(</w:t>
+      </w:r>
+      <w:r>
+        <w:rPr>
+          <w:rStyle w:val="VerbatimChar"/>
+        </w:rPr>
+        <w:t xml:space="preserve">application/x-research-info-systems</w:t>
+      </w:r>
+      <w:r>
+        <w:t xml:space="preserve">,</w:t>
+      </w:r>
+      <w:r>
+        <w:t xml:space="preserve"> </w:t>
+      </w:r>
+      <w:r>
+        <w:rPr>
+          <w:rStyle w:val="VerbatimChar"/>
+        </w:rPr>
+        <w:t xml:space="preserve">application/x-bibtex</w:t>
+      </w:r>
+      <w:r>
+        <w:t xml:space="preserve">,</w:t>
+      </w:r>
+      <w:r>
+        <w:t xml:space="preserve"> </w:t>
+      </w:r>
+      <w:r>
+        <w:rPr>
+          <w:rStyle w:val="VerbatimChar"/>
+        </w:rPr>
+        <w:t xml:space="preserve">application/xml</w:t>
+      </w:r>
+      <w:r>
+        <w:t xml:space="preserve">,</w:t>
+      </w:r>
+      <w:r>
+        <w:t xml:space="preserve"> </w:t>
+      </w:r>
+      <w:r>
+        <w:rPr>
+          <w:rStyle w:val="VerbatimChar"/>
+        </w:rPr>
+        <w:t xml:space="preserve">text/plain</w:t>
+      </w:r>
+      <w:r>
+        <w:t xml:space="preserve">) and a slug-derived filename.</w:t>
+      </w:r>
+    </w:p>
+    <w:bookmarkEnd w:id="44"/>
+    <w:bookmarkStart w:id="45" w:name="orcid-works-push-and-pull"/>
+    <w:p>
+      <w:pPr>
+        <w:pStyle w:val="Heading3"/>
+      </w:pPr>
+      <w:r>
+        <w:t xml:space="preserve">ORCID Works push and pull</w:t>
+      </w:r>
+    </w:p>
+    <w:p>
+      <w:pPr>
+        <w:pStyle w:val="FirstParagraph"/>
+      </w:pPr>
+      <w:r>
+        <w:t xml:space="preserve">The existing ORCID OAuth flow now supports two new operations:</w:t>
+      </w:r>
+    </w:p>
+    <w:p>
+      <w:pPr>
+        <w:numPr>
+          <w:ilvl w:val="0"/>
+          <w:numId w:val="1005"/>
+        </w:numPr>
+        <w:pStyle w:val="Compact"/>
+      </w:pPr>
+      <w:r>
+        <w:rPr>
+          <w:bCs/>
+          <w:b/>
+        </w:rPr>
+        <w:t xml:space="preserve">Pull works</w:t>
+      </w:r>
+      <w:r>
+        <w:t xml:space="preserve"> </w:t>
+      </w:r>
+      <w:r>
+        <w:t xml:space="preserve">— fetch the researcher’s complete works list from ORCID</w:t>
+      </w:r>
+      <w:r>
+        <w:t xml:space="preserve"> </w:t>
+      </w:r>
+      <w:r>
+        <w:t xml:space="preserve">with put-codes, titles, years, journals, DOIs, types.</w:t>
+      </w:r>
+    </w:p>
+    <w:p>
+      <w:pPr>
+        <w:numPr>
+          <w:ilvl w:val="0"/>
+          <w:numId w:val="1005"/>
+        </w:numPr>
+        <w:pStyle w:val="Compact"/>
+      </w:pPr>
+      <w:r>
+        <w:rPr>
+          <w:bCs/>
+          <w:b/>
+        </w:rPr>
+        <w:t xml:space="preserve">Push work</w:t>
+      </w:r>
+      <w:r>
+        <w:t xml:space="preserve"> </w:t>
+      </w:r>
+      <w:r>
+        <w:t xml:space="preserve">— create a new ORCID Work record from a local citation,</w:t>
+      </w:r>
+      <w:r>
+        <w:t xml:space="preserve"> </w:t>
+      </w:r>
+      <w:r>
+        <w:t xml:space="preserve">returning the new put-code.</w:t>
+      </w:r>
+    </w:p>
+    <w:p>
+      <w:pPr>
+        <w:pStyle w:val="FirstParagraph"/>
+      </w:pPr>
+      <w:r>
+        <w:t xml:space="preserve">Access tokens are persisted to</w:t>
+      </w:r>
+      <w:r>
+        <w:t xml:space="preserve"> </w:t>
+      </w:r>
+      <w:r>
+        <w:rPr>
+          <w:rStyle w:val="VerbatimChar"/>
+        </w:rPr>
+        <w:t xml:space="preserve">research_orcid_link</w:t>
+      </w:r>
+      <w:r>
+        <w:t xml:space="preserve"> </w:t>
+      </w:r>
+      <w:r>
+        <w:t xml:space="preserve">with AES-256-CBC</w:t>
+      </w:r>
+      <w:r>
+        <w:t xml:space="preserve"> </w:t>
+      </w:r>
+      <w:r>
+        <w:t xml:space="preserve">encryption keyed off</w:t>
+      </w:r>
+      <w:r>
+        <w:t xml:space="preserve"> </w:t>
+      </w:r>
+      <w:r>
+        <w:rPr>
+          <w:rStyle w:val="VerbatimChar"/>
+        </w:rPr>
+        <w:t xml:space="preserve">sf_app_secret</w:t>
+      </w:r>
+      <w:r>
+        <w:t xml:space="preserve">. The</w:t>
+      </w:r>
+      <w:r>
+        <w:t xml:space="preserve"> </w:t>
+      </w:r>
+      <w:r>
+        <w:t xml:space="preserve">“</w:t>
+      </w:r>
+      <w:r>
+        <w:t xml:space="preserve">Connect / linked / unlinked</w:t>
+      </w:r>
+      <w:r>
+        <w:t xml:space="preserve">”</w:t>
+      </w:r>
+      <w:r>
+        <w:t xml:space="preserve"> </w:t>
+      </w:r>
+      <w:r>
+        <w:t xml:space="preserve">status page mirrors the Laravel side.</w:t>
+      </w:r>
+    </w:p>
+    <w:bookmarkEnd w:id="45"/>
+    <w:bookmarkStart w:id="46" w:name="mobile-pwa-shell"/>
+    <w:p>
+      <w:pPr>
+        <w:pStyle w:val="Heading3"/>
+      </w:pPr>
+      <w:r>
+        <w:t xml:space="preserve">Mobile / PWA shell</w:t>
+      </w:r>
+    </w:p>
+    <w:p>
+      <w:pPr>
+        <w:pStyle w:val="FirstParagraph"/>
+      </w:pPr>
+      <w:r>
+        <w:t xml:space="preserve">A phone-first researcher home at</w:t>
+      </w:r>
+      <w:r>
+        <w:t xml:space="preserve"> </w:t>
+      </w:r>
+      <w:r>
+        <w:rPr>
+          <w:rStyle w:val="VerbatimChar"/>
+        </w:rPr>
+        <w:t xml:space="preserve">/research/mobile</w:t>
+      </w:r>
+      <w:r>
+        <w:t xml:space="preserve"> </w:t>
+      </w:r>
+      <w:r>
+        <w:t xml:space="preserve">with:</w:t>
+      </w:r>
+    </w:p>
+    <w:p>
+      <w:pPr>
+        <w:numPr>
+          <w:ilvl w:val="0"/>
+          <w:numId w:val="1006"/>
+        </w:numPr>
+        <w:pStyle w:val="Compact"/>
+      </w:pPr>
+      <w:r>
+        <w:rPr>
+          <w:bCs/>
+          <w:b/>
+        </w:rPr>
+        <w:t xml:space="preserve">Reading list</w:t>
+      </w:r>
+      <w:r>
+        <w:t xml:space="preserve"> </w:t>
+      </w:r>
+      <w:r>
+        <w:t xml:space="preserve">— most-recent 50 collection items</w:t>
+      </w:r>
+    </w:p>
+    <w:p>
+      <w:pPr>
+        <w:numPr>
+          <w:ilvl w:val="0"/>
+          <w:numId w:val="1006"/>
+        </w:numPr>
+        <w:pStyle w:val="Compact"/>
+      </w:pPr>
+      <w:r>
+        <w:rPr>
+          <w:bCs/>
+          <w:b/>
+        </w:rPr>
+        <w:t xml:space="preserve">4-button grid</w:t>
+      </w:r>
+      <w:r>
+        <w:t xml:space="preserve"> </w:t>
+      </w:r>
+      <w:r>
+        <w:t xml:space="preserve">— Search, Notebooks, Bibliographies, Journal</w:t>
+      </w:r>
+    </w:p>
+    <w:p>
+      <w:pPr>
+        <w:numPr>
+          <w:ilvl w:val="0"/>
+          <w:numId w:val="1006"/>
+        </w:numPr>
+        <w:pStyle w:val="Compact"/>
+      </w:pPr>
+      <w:r>
+        <w:rPr>
+          <w:bCs/>
+          <w:b/>
+        </w:rPr>
+        <w:t xml:space="preserve">Quick journal entry</w:t>
+      </w:r>
+      <w:r>
+        <w:t xml:space="preserve"> </w:t>
+      </w:r>
+      <w:r>
+        <w:t xml:space="preserve">form that works offline</w:t>
+      </w:r>
+    </w:p>
+    <w:p>
+      <w:pPr>
+        <w:numPr>
+          <w:ilvl w:val="0"/>
+          <w:numId w:val="1006"/>
+        </w:numPr>
+        <w:pStyle w:val="Compact"/>
+      </w:pPr>
+      <w:r>
+        <w:rPr>
+          <w:bCs/>
+          <w:b/>
+        </w:rPr>
+        <w:t xml:space="preserve">Online / offline badge</w:t>
+      </w:r>
+      <w:r>
+        <w:t xml:space="preserve"> </w:t>
+      </w:r>
+      <w:r>
+        <w:t xml:space="preserve">that reacts to</w:t>
+      </w:r>
+      <w:r>
+        <w:t xml:space="preserve"> </w:t>
+      </w:r>
+      <w:r>
+        <w:rPr>
+          <w:rStyle w:val="VerbatimChar"/>
+        </w:rPr>
+        <w:t xml:space="preserve">navigator.onLine</w:t>
+      </w:r>
+    </w:p>
+    <w:p>
+      <w:pPr>
+        <w:pStyle w:val="FirstParagraph"/>
+      </w:pPr>
+      <w:r>
+        <w:t xml:space="preserve">A new</w:t>
+      </w:r>
+      <w:r>
+        <w:t xml:space="preserve"> </w:t>
+      </w:r>
+      <w:r>
+        <w:rPr>
+          <w:rStyle w:val="VerbatimChar"/>
+        </w:rPr>
+        <w:t xml:space="preserve">manifest.webmanifest</w:t>
+      </w:r>
+      <w:r>
+        <w:t xml:space="preserve"> </w:t>
+      </w:r>
+      <w:r>
+        <w:t xml:space="preserve">+</w:t>
+      </w:r>
+      <w:r>
+        <w:t xml:space="preserve"> </w:t>
+      </w:r>
+      <w:r>
+        <w:rPr>
+          <w:rStyle w:val="VerbatimChar"/>
+        </w:rPr>
+        <w:t xml:space="preserve">sw.js</w:t>
+      </w:r>
+      <w:r>
+        <w:t xml:space="preserve"> </w:t>
+      </w:r>
+      <w:r>
+        <w:t xml:space="preserve">at the AtoM web root let the</w:t>
+      </w:r>
+      <w:r>
+        <w:t xml:space="preserve"> </w:t>
+      </w:r>
+      <w:r>
+        <w:t xml:space="preserve">researcher install the portal as a standalone app on their phone</w:t>
+      </w:r>
+      <w:r>
+        <w:t xml:space="preserve"> </w:t>
+      </w:r>
+      <w:r>
+        <w:t xml:space="preserve">(</w:t>
+      </w:r>
+      <w:r>
+        <w:t xml:space="preserve">“</w:t>
+      </w:r>
+      <w:r>
+        <w:t xml:space="preserve">Add to home screen</w:t>
+      </w:r>
+      <w:r>
+        <w:t xml:space="preserve">”</w:t>
+      </w:r>
+      <w:r>
+        <w:t xml:space="preserve"> </w:t>
+      </w:r>
+      <w:r>
+        <w:t xml:space="preserve">→ standalone mode).</w:t>
+      </w:r>
+    </w:p>
+    <w:bookmarkEnd w:id="46"/>
+    <w:bookmarkStart w:id="47" w:name="offline-mode-and-sync"/>
+    <w:p>
+      <w:pPr>
+        <w:pStyle w:val="Heading3"/>
+      </w:pPr>
+      <w:r>
+        <w:t xml:space="preserve">Offline mode and sync</w:t>
+      </w:r>
+    </w:p>
+    <w:p>
+      <w:pPr>
+        <w:pStyle w:val="FirstParagraph"/>
+      </w:pPr>
+      <w:r>
+        <w:t xml:space="preserve">When the device is offline, journal entries are buffered to</w:t>
+      </w:r>
+      <w:r>
+        <w:t xml:space="preserve"> </w:t>
+      </w:r>
+      <w:r>
+        <w:rPr>
+          <w:rStyle w:val="VerbatimChar"/>
+        </w:rPr>
+        <w:t xml:space="preserve">localStorage</w:t>
+      </w:r>
+      <w:r>
+        <w:t xml:space="preserve"> </w:t>
+      </w:r>
+      <w:r>
+        <w:t xml:space="preserve">under the key</w:t>
+      </w:r>
+      <w:r>
+        <w:t xml:space="preserve"> </w:t>
+      </w:r>
+      <w:r>
+        <w:rPr>
+          <w:rStyle w:val="VerbatimChar"/>
+        </w:rPr>
+        <w:t xml:space="preserve">heratio_offline_queue_v1</w:t>
+      </w:r>
+      <w:r>
+        <w:t xml:space="preserve">. When the</w:t>
+      </w:r>
+      <w:r>
+        <w:t xml:space="preserve"> </w:t>
+      </w:r>
+      <w:r>
+        <w:t xml:space="preserve">device comes back online, the queue is POSTed to</w:t>
+      </w:r>
+      <w:r>
+        <w:t xml:space="preserve"> </w:t>
+      </w:r>
+      <w:r>
+        <w:rPr>
+          <w:rStyle w:val="VerbatimChar"/>
+        </w:rPr>
+        <w:t xml:space="preserve">/research/sync/offline</w:t>
+      </w:r>
+      <w:r>
+        <w:t xml:space="preserve"> </w:t>
+      </w:r>
+      <w:r>
+        <w:t xml:space="preserve">and applied to either</w:t>
+      </w:r>
+      <w:r>
+        <w:t xml:space="preserve"> </w:t>
+      </w:r>
+      <w:r>
+        <w:rPr>
+          <w:rStyle w:val="VerbatimChar"/>
+        </w:rPr>
+        <w:t xml:space="preserve">research_journal_entry</w:t>
+      </w:r>
+      <w:r>
+        <w:t xml:space="preserve"> </w:t>
+      </w:r>
+      <w:r>
+        <w:t xml:space="preserve">or</w:t>
+      </w:r>
+      <w:r>
+        <w:t xml:space="preserve"> </w:t>
+      </w:r>
+      <w:r>
+        <w:rPr>
+          <w:rStyle w:val="VerbatimChar"/>
+        </w:rPr>
+        <w:t xml:space="preserve">research_annotation</w:t>
+      </w:r>
+      <w:r>
+        <w:t xml:space="preserve"> </w:t>
+      </w:r>
+      <w:r>
+        <w:t xml:space="preserve">depending on the</w:t>
+      </w:r>
+      <w:r>
+        <w:t xml:space="preserve"> </w:t>
+      </w:r>
+      <w:r>
+        <w:t xml:space="preserve">entry’s</w:t>
+      </w:r>
+      <w:r>
+        <w:t xml:space="preserve"> </w:t>
+      </w:r>
+      <w:r>
+        <w:rPr>
+          <w:rStyle w:val="VerbatimChar"/>
+        </w:rPr>
+        <w:t xml:space="preserve">kind</w:t>
+      </w:r>
+      <w:r>
+        <w:t xml:space="preserve">. Sync metadata (queued count, applied count,</w:t>
+      </w:r>
+      <w:r>
+        <w:t xml:space="preserve"> </w:t>
+      </w:r>
+      <w:r>
+        <w:t xml:space="preserve">conflicts, payload hash) is persisted to a new</w:t>
+      </w:r>
+      <w:r>
+        <w:t xml:space="preserve"> </w:t>
+      </w:r>
+      <w:r>
+        <w:rPr>
+          <w:rStyle w:val="VerbatimChar"/>
+        </w:rPr>
+        <w:t xml:space="preserve">research_offline_sync_log</w:t>
+      </w:r>
+      <w:r>
+        <w:t xml:space="preserve"> </w:t>
+      </w:r>
+      <w:r>
+        <w:t xml:space="preserve">table for audit.</w:t>
+      </w:r>
+    </w:p>
+    <w:bookmarkEnd w:id="47"/>
+    <w:bookmarkStart w:id="48" w:name="X14b34c8db5649ae6bed5c42c33100aa854608fc"/>
+    <w:p>
+      <w:pPr>
+        <w:pStyle w:val="Heading3"/>
+      </w:pPr>
+      <w:r>
+        <w:t xml:space="preserve">ResearcherView consolidated JSON endpoint</w:t>
+      </w:r>
+    </w:p>
+    <w:p>
+      <w:pPr>
+        <w:pStyle w:val="FirstParagraph"/>
+      </w:pPr>
+      <w:r>
+        <w:t xml:space="preserve">A single round-trip endpoint at</w:t>
+      </w:r>
+      <w:r>
+        <w:t xml:space="preserve"> </w:t>
+      </w:r>
+      <w:r>
+        <w:rPr>
+          <w:rStyle w:val="VerbatimChar"/>
+        </w:rPr>
+        <w:t xml:space="preserve">/research/researcher-view/:id</w:t>
+      </w:r>
+      <w:r>
+        <w:t xml:space="preserve"> </w:t>
+      </w:r>
+      <w:r>
+        <w:t xml:space="preserve">returns a researcher’s public projects, recent shared annotations,</w:t>
+      </w:r>
+      <w:r>
+        <w:t xml:space="preserve"> </w:t>
+      </w:r>
+      <w:r>
+        <w:t xml:space="preserve">and ORCID-link summary in one JSON document. Designed for external</w:t>
+      </w:r>
+      <w:r>
+        <w:t xml:space="preserve"> </w:t>
+      </w:r>
+      <w:r>
+        <w:t xml:space="preserve">tools (Zotero, Tropy, LMS) that need to compose a researcher</w:t>
+      </w:r>
+      <w:r>
+        <w:t xml:space="preserve"> </w:t>
+      </w:r>
+      <w:r>
+        <w:t xml:space="preserve">dashboard without making 5+ separate calls.</w:t>
+      </w:r>
+    </w:p>
+    <w:bookmarkEnd w:id="48"/>
+    <w:bookmarkStart w:id="49" w:name="schema-additions"/>
+    <w:p>
+      <w:pPr>
+        <w:pStyle w:val="Heading3"/>
+      </w:pPr>
+      <w:r>
+        <w:t xml:space="preserve">Schema additions</w:t>
+      </w:r>
+    </w:p>
+    <w:p>
+      <w:pPr>
+        <w:pStyle w:val="FirstParagraph"/>
+      </w:pPr>
+      <w:r>
+        <w:t xml:space="preserve">Eight new tables (all</w:t>
+      </w:r>
+      <w:r>
+        <w:t xml:space="preserve"> </w:t>
+      </w:r>
+      <w:r>
+        <w:rPr>
+          <w:rStyle w:val="VerbatimChar"/>
+        </w:rPr>
+        <w:t xml:space="preserve">IF NOT EXISTS</w:t>
+      </w:r>
+      <w:r>
+        <w:t xml:space="preserve">-idempotent in</w:t>
+      </w:r>
+      <w:r>
+        <w:t xml:space="preserve"> </w:t>
+      </w:r>
+      <w:r>
+        <w:rPr>
+          <w:rStyle w:val="VerbatimChar"/>
+        </w:rPr>
+        <w:t xml:space="preserve">database/migrations/2026_05_16_research_enhancements.sql</w:t>
+      </w:r>
+      <w:r>
+        <w:t xml:space="preserve">):</w:t>
+      </w:r>
+    </w:p>
+    <w:tbl>
+      <w:tblPr>
+        <w:tblStyle w:val="Table"/>
+        <w:tblW w:type="pct" w:w="5000"/>
+        <w:tblLook w:firstRow="1" w:lastRow="0" w:firstColumn="0" w:lastColumn="0" w:noHBand="0" w:noVBand="0" w:val="0020"/>
+        <w:jc w:val="start"/>
+      </w:tblPr>
+      <w:tblGrid>
+        <w:gridCol w:w="3960"/>
+        <w:gridCol w:w="3960"/>
+      </w:tblGrid>
+      <w:tr>
+        <w:trPr>
+          <w:tblHeader w:val="true"/>
+        </w:trPr>
+        <w:tc>
+          <w:tcPr/>
+          <w:p>
+            <w:pPr>
+              <w:pStyle w:val="Compact"/>
+              <w:jc w:val="left"/>
+            </w:pPr>
+            <w:r>
+              <w:t xml:space="preserve">Table</w:t>
+            </w:r>
+          </w:p>
+        </w:tc>
+        <w:tc>
+          <w:tcPr/>
+          <w:p>
+            <w:pPr>
+              <w:pStyle w:val="Compact"/>
+              <w:jc w:val="left"/>
+            </w:pPr>
+            <w:r>
+              <w:t xml:space="preserve">Purpose</w:t>
+            </w:r>
+          </w:p>
+        </w:tc>
+      </w:tr>
+      <w:tr>
+        <w:tc>
+          <w:tcPr/>
+          <w:p>
+            <w:pPr>
+              <w:pStyle w:val="Compact"/>
+              <w:jc w:val="left"/>
+            </w:pPr>
+            <w:r>
+              <w:rPr>
+                <w:rStyle w:val="VerbatimChar"/>
+              </w:rPr>
+              <w:t xml:space="preserve">research_studio_artefact</w:t>
+            </w:r>
+          </w:p>
+        </w:tc>
+        <w:tc>
+          <w:tcPr/>
+          <w:p>
+            <w:pPr>
+              <w:pStyle w:val="Compact"/>
+              <w:jc w:val="left"/>
+            </w:pPr>
+            <w:r>
+              <w:t xml:space="preserve">LLM-generated artefacts with body, citations JSON, model + tokens + timing</w:t>
+            </w:r>
+          </w:p>
+        </w:tc>
+      </w:tr>
+      <w:tr>
+        <w:tc>
+          <w:tcPr/>
+          <w:p>
+            <w:pPr>
+              <w:pStyle w:val="Compact"/>
+              <w:jc w:val="left"/>
+            </w:pPr>
+            <w:r>
+              <w:rPr>
+                <w:rStyle w:val="VerbatimChar"/>
+              </w:rPr>
+              <w:t xml:space="preserve">research_notebook</w:t>
+            </w:r>
+          </w:p>
+        </w:tc>
+        <w:tc>
+          <w:tcPr/>
+          <w:p>
+            <w:pPr>
+              <w:pStyle w:val="Compact"/>
+              <w:jc w:val="left"/>
+            </w:pPr>
+            <w:r>
+              <w:t xml:space="preserve">Researcher scratchpad metadata + promote-to-project tracking</w:t>
+            </w:r>
+          </w:p>
+        </w:tc>
+      </w:tr>
+      <w:tr>
+        <w:tc>
+          <w:tcPr/>
+          <w:p>
+            <w:pPr>
+              <w:pStyle w:val="Compact"/>
+              <w:jc w:val="left"/>
+            </w:pPr>
+            <w:r>
+              <w:rPr>
+                <w:rStyle w:val="VerbatimChar"/>
+              </w:rPr>
+              <w:t xml:space="preserve">research_notebook_item</w:t>
+            </w:r>
+          </w:p>
+        </w:tc>
+        <w:tc>
+          <w:tcPr/>
+          <w:p>
+            <w:pPr>
+              <w:pStyle w:val="Compact"/>
+              <w:jc w:val="left"/>
+            </w:pPr>
+            <w:r>
+              <w:t xml:space="preserve">Notebook items (saved_query, ai_output, source_pin, note)</w:t>
+            </w:r>
+          </w:p>
+        </w:tc>
+      </w:tr>
+      <w:tr>
+        <w:tc>
+          <w:tcPr/>
+          <w:p>
+            <w:pPr>
+              <w:pStyle w:val="Compact"/>
+              <w:jc w:val="left"/>
+            </w:pPr>
+            <w:r>
+              <w:rPr>
+                <w:rStyle w:val="VerbatimChar"/>
+              </w:rPr>
+              <w:t xml:space="preserve">research_cross_fonds_query</w:t>
+            </w:r>
+          </w:p>
+        </w:tc>
+        <w:tc>
+          <w:tcPr/>
+          <w:p>
+            <w:pPr>
+              <w:pStyle w:val="Compact"/>
+              <w:jc w:val="left"/>
+            </w:pPr>
+            <w:r>
+              <w:t xml:space="preserve">Cross-fonds query history with elapsed time + result count</w:t>
+            </w:r>
+          </w:p>
+        </w:tc>
+      </w:tr>
+      <w:tr>
+        <w:tc>
+          <w:tcPr/>
+          <w:p>
+            <w:pPr>
+              <w:pStyle w:val="Compact"/>
+              <w:jc w:val="left"/>
+            </w:pPr>
+            <w:r>
+              <w:rPr>
+                <w:rStyle w:val="VerbatimChar"/>
+              </w:rPr>
+              <w:t xml:space="preserve">research_collaboration_session</w:t>
+            </w:r>
+          </w:p>
+        </w:tc>
+        <w:tc>
+          <w:tcPr/>
+          <w:p>
+            <w:pPr>
+              <w:pStyle w:val="Compact"/>
+              <w:jc w:val="left"/>
+            </w:pPr>
+            <w:r>
+              <w:t xml:space="preserve">Live session bookkeeping (start/end times per project)</w:t>
+            </w:r>
+          </w:p>
+        </w:tc>
+      </w:tr>
+      <w:tr>
+        <w:tc>
+          <w:tcPr/>
+          <w:p>
+            <w:pPr>
+              <w:pStyle w:val="Compact"/>
+              <w:jc w:val="left"/>
+            </w:pPr>
+            <w:r>
+              <w:rPr>
+                <w:rStyle w:val="VerbatimChar"/>
+              </w:rPr>
+              <w:t xml:space="preserve">research_collaboration_presence</w:t>
+            </w:r>
+          </w:p>
+        </w:tc>
+        <w:tc>
+          <w:tcPr/>
+          <w:p>
+            <w:pPr>
+              <w:pStyle w:val="Compact"/>
+              <w:jc w:val="left"/>
+            </w:pPr>
+            <w:r>
+              <w:t xml:space="preserve">Per-researcher presence row with cursor target + colour + last-seen</w:t>
+            </w:r>
+          </w:p>
+        </w:tc>
+      </w:tr>
+      <w:tr>
+        <w:tc>
+          <w:tcPr/>
+          <w:p>
+            <w:pPr>
+              <w:pStyle w:val="Compact"/>
+              <w:jc w:val="left"/>
+            </w:pPr>
+            <w:r>
+              <w:rPr>
+                <w:rStyle w:val="VerbatimChar"/>
+              </w:rPr>
+              <w:t xml:space="preserve">research_orcid_link</w:t>
+            </w:r>
+          </w:p>
+        </w:tc>
+        <w:tc>
+          <w:tcPr/>
+          <w:p>
+            <w:pPr>
+              <w:pStyle w:val="Compact"/>
+              <w:jc w:val="left"/>
+            </w:pPr>
+            <w:r>
+              <w:t xml:space="preserve">Encrypted ORCID tokens + scope + last-sync metadata</w:t>
+            </w:r>
+          </w:p>
+        </w:tc>
+      </w:tr>
+      <w:tr>
+        <w:tc>
+          <w:tcPr/>
+          <w:p>
+            <w:pPr>
+              <w:pStyle w:val="Compact"/>
+              <w:jc w:val="left"/>
+            </w:pPr>
+            <w:r>
+              <w:rPr>
+                <w:rStyle w:val="VerbatimChar"/>
+              </w:rPr>
+              <w:t xml:space="preserve">research_offline_sync_log</w:t>
+            </w:r>
+          </w:p>
+        </w:tc>
+        <w:tc>
+          <w:tcPr/>
+          <w:p>
+            <w:pPr>
+              <w:pStyle w:val="Compact"/>
+              <w:jc w:val="left"/>
+            </w:pPr>
+            <w:r>
+              <w:t xml:space="preserve">Sync run audit (queued / applied / conflicts / payload hash)</w:t>
+            </w:r>
+          </w:p>
+        </w:tc>
+      </w:tr>
+    </w:tbl>
+    <w:p>
+      <w:pPr>
+        <w:pStyle w:val="BodyText"/>
+      </w:pPr>
+      <w:r>
+        <w:t xml:space="preserve">The polymorphic</w:t>
+      </w:r>
+      <w:r>
+        <w:t xml:space="preserve"> </w:t>
+      </w:r>
+      <w:r>
+        <w:rPr>
+          <w:rStyle w:val="VerbatimChar"/>
+        </w:rPr>
+        <w:t xml:space="preserve">research_comment</w:t>
+      </w:r>
+      <w:r>
+        <w:t xml:space="preserve"> </w:t>
+      </w:r>
+      <w:r>
+        <w:t xml:space="preserve">and</w:t>
+      </w:r>
+      <w:r>
+        <w:t xml:space="preserve"> </w:t>
+      </w:r>
+      <w:r>
+        <w:rPr>
+          <w:rStyle w:val="VerbatimChar"/>
+        </w:rPr>
+        <w:t xml:space="preserve">research_annotation</w:t>
+      </w:r>
+      <w:r>
+        <w:t xml:space="preserve"> </w:t>
+      </w:r>
+      <w:r>
+        <w:t xml:space="preserve">tables</w:t>
+      </w:r>
+      <w:r>
+        <w:t xml:space="preserve"> </w:t>
+      </w:r>
+      <w:r>
+        <w:t xml:space="preserve">already had the columns needed for collaboration and shared</w:t>
+      </w:r>
+      <w:r>
+        <w:t xml:space="preserve"> </w:t>
+      </w:r>
+      <w:r>
+        <w:t xml:space="preserve">annotations, so no new comment or annotation tables were added.</w:t>
+      </w:r>
+    </w:p>
+    <w:bookmarkEnd w:id="49"/>
+    <w:bookmarkStart w:id="50" w:name="operational-notes"/>
+    <w:p>
+      <w:pPr>
+        <w:pStyle w:val="Heading3"/>
+      </w:pPr>
+      <w:r>
+        <w:t xml:space="preserve">Operational notes</w:t>
+      </w:r>
+    </w:p>
+    <w:p>
+      <w:pPr>
+        <w:numPr>
+          <w:ilvl w:val="0"/>
+          <w:numId w:val="1007"/>
+        </w:numPr>
+        <w:pStyle w:val="Compact"/>
+      </w:pPr>
+      <w:r>
+        <w:rPr>
+          <w:bCs/>
+          <w:b/>
+        </w:rPr>
+        <w:t xml:space="preserve">TTS endpoint</w:t>
+      </w:r>
+      <w:r>
+        <w:t xml:space="preserve"> </w:t>
+      </w:r>
+      <w:r>
+        <w:t xml:space="preserve">is operator-configurable via</w:t>
+      </w:r>
+      <w:r>
+        <w:t xml:space="preserve"> </w:t>
+      </w:r>
+      <w:r>
+        <w:rPr>
+          <w:rStyle w:val="VerbatimChar"/>
+        </w:rPr>
+        <w:t xml:space="preserve">app_ahg_tts_endpoint</w:t>
+      </w:r>
+      <w:r>
+        <w:t xml:space="preserve"> </w:t>
+      </w:r>
+      <w:r>
+        <w:t xml:space="preserve">in</w:t>
+      </w:r>
+      <w:r>
+        <w:t xml:space="preserve"> </w:t>
+      </w:r>
+      <w:r>
+        <w:rPr>
+          <w:rStyle w:val="VerbatimChar"/>
+        </w:rPr>
+        <w:t xml:space="preserve">apps/qubit/config/app.yml</w:t>
+      </w:r>
+      <w:r>
+        <w:t xml:space="preserve">. When unset, audio artefacts fall</w:t>
+      </w:r>
+      <w:r>
+        <w:t xml:space="preserve"> </w:t>
+      </w:r>
+      <w:r>
+        <w:t xml:space="preserve">back to script-only with the transcript persisted for manual TTS</w:t>
+      </w:r>
+      <w:r>
+        <w:t xml:space="preserve"> </w:t>
+      </w:r>
+      <w:r>
+        <w:t xml:space="preserve">hand-off — never a 500.</w:t>
+      </w:r>
+    </w:p>
+    <w:p>
+      <w:pPr>
+        <w:numPr>
+          <w:ilvl w:val="0"/>
+          <w:numId w:val="1007"/>
+        </w:numPr>
+        <w:pStyle w:val="Compact"/>
+      </w:pPr>
+      <w:r>
+        <w:rPr>
+          <w:bCs/>
+          <w:b/>
+        </w:rPr>
+        <w:t xml:space="preserve">ORCID</w:t>
+      </w:r>
+      <w:r>
+        <w:t xml:space="preserve"> </w:t>
+      </w:r>
+      <w:r>
+        <w:t xml:space="preserve">is operator-configurable via</w:t>
+      </w:r>
+      <w:r>
+        <w:t xml:space="preserve"> </w:t>
+      </w:r>
+      <w:r>
+        <w:rPr>
+          <w:rStyle w:val="VerbatimChar"/>
+        </w:rPr>
+        <w:t xml:space="preserve">app_orcid_client_id</w:t>
+      </w:r>
+      <w:r>
+        <w:t xml:space="preserve"> </w:t>
+      </w:r>
+      <w:r>
+        <w:t xml:space="preserve">/</w:t>
+      </w:r>
+      <w:r>
+        <w:t xml:space="preserve"> </w:t>
+      </w:r>
+      <w:r>
+        <w:rPr>
+          <w:rStyle w:val="VerbatimChar"/>
+        </w:rPr>
+        <w:t xml:space="preserve">app_orcid_client_secret</w:t>
+      </w:r>
+      <w:r>
+        <w:t xml:space="preserve"> </w:t>
+      </w:r>
+      <w:r>
+        <w:t xml:space="preserve">/</w:t>
+      </w:r>
+      <w:r>
+        <w:t xml:space="preserve"> </w:t>
+      </w:r>
+      <w:r>
+        <w:rPr>
+          <w:rStyle w:val="VerbatimChar"/>
+        </w:rPr>
+        <w:t xml:space="preserve">app_orcid_redirect_uri</w:t>
+      </w:r>
+      <w:r>
+        <w:t xml:space="preserve">. When unset,</w:t>
+      </w:r>
+      <w:r>
+        <w:t xml:space="preserve"> </w:t>
+      </w:r>
+      <w:r>
+        <w:t xml:space="preserve">the ORCID page shows a clean</w:t>
+      </w:r>
+      <w:r>
+        <w:t xml:space="preserve"> </w:t>
+      </w:r>
+      <w:r>
+        <w:t xml:space="preserve">“</w:t>
+      </w:r>
+      <w:r>
+        <w:t xml:space="preserve">not configured</w:t>
+      </w:r>
+      <w:r>
+        <w:t xml:space="preserve">”</w:t>
+      </w:r>
+      <w:r>
+        <w:t xml:space="preserve"> </w:t>
+      </w:r>
+      <w:r>
+        <w:t xml:space="preserve">alert listing the</w:t>
+      </w:r>
+      <w:r>
+        <w:t xml:space="preserve"> </w:t>
+      </w:r>
+      <w:r>
+        <w:t xml:space="preserve">exact ENV keys.</w:t>
+      </w:r>
+    </w:p>
+    <w:p>
+      <w:pPr>
+        <w:numPr>
+          <w:ilvl w:val="0"/>
+          <w:numId w:val="1007"/>
+        </w:numPr>
+        <w:pStyle w:val="Compact"/>
+      </w:pPr>
+      <w:r>
+        <w:rPr>
+          <w:bCs/>
+          <w:b/>
+        </w:rPr>
+        <w:t xml:space="preserve">php-fpm</w:t>
+      </w:r>
+      <w:r>
+        <w:t xml:space="preserve"> </w:t>
+      </w:r>
+      <w:r>
+        <w:t xml:space="preserve">must include</w:t>
+      </w:r>
+      <w:r>
+        <w:t xml:space="preserve"> </w:t>
+      </w:r>
+      <w:r>
+        <w:rPr>
+          <w:rStyle w:val="VerbatimChar"/>
+        </w:rPr>
+        <w:t xml:space="preserve">ReadWritePaths=/usr/share/nginx/archive/cache</w:t>
+      </w:r>
+      <w:r>
+        <w:t xml:space="preserve"> </w:t>
+      </w:r>
+      <w:r>
+        <w:t xml:space="preserve">and</w:t>
+      </w:r>
+      <w:r>
+        <w:t xml:space="preserve"> </w:t>
+      </w:r>
+      <w:r>
+        <w:rPr>
+          <w:rStyle w:val="VerbatimChar"/>
+        </w:rPr>
+        <w:t xml:space="preserve">ReadWritePaths=/usr/share/nginx/archive/log</w:t>
+      </w:r>
+      <w:r>
+        <w:t xml:space="preserve"> </w:t>
+      </w:r>
+      <w:r>
+        <w:t xml:space="preserve">in its drop-in</w:t>
+      </w:r>
+      <w:r>
+        <w:t xml:space="preserve"> </w:t>
+      </w:r>
+      <w:r>
+        <w:t xml:space="preserve">when</w:t>
+      </w:r>
+      <w:r>
+        <w:t xml:space="preserve"> </w:t>
+      </w:r>
+      <w:r>
+        <w:rPr>
+          <w:rStyle w:val="VerbatimChar"/>
+        </w:rPr>
+        <w:t xml:space="preserve">ProtectSystem=full</w:t>
+      </w:r>
+      <w:r>
+        <w:t xml:space="preserve"> </w:t>
+      </w:r>
+      <w:r>
+        <w:t xml:space="preserve">is set (the host-level requirement is</w:t>
+      </w:r>
+      <w:r>
+        <w:t xml:space="preserve"> </w:t>
+      </w:r>
+      <w:r>
+        <w:t xml:space="preserve">documented in the project CLAUDE.md).</w:t>
+      </w:r>
+    </w:p>
     <w:p>
       <w:r>
         <w:pict>
@@ -4166,14 +6332,15 @@
         </w:pict>
       </w:r>
     </w:p>
-    <w:bookmarkEnd w:id="40"/>
-    <w:bookmarkStart w:id="41" w:name="database-footprint"/>
+    <w:bookmarkEnd w:id="50"/>
+    <w:bookmarkEnd w:id="51"/>
+    <w:bookmarkStart w:id="52" w:name="accessibility-wcag-2.1-aa"/>
     <w:p>
       <w:pPr>
         <w:pStyle w:val="Heading2"/>
       </w:pPr>
       <w:r>
-        <w:t xml:space="preserve">Database Footprint</w:t>
+        <w:t xml:space="preserve">Accessibility (WCAG 2.1 AA)</w:t>
       </w:r>
     </w:p>
     <w:p>
@@ -4181,163 +6348,170 @@
         <w:pStyle w:val="FirstParagraph"/>
       </w:pPr>
       <w:r>
-        <w:t xml:space="preserve">The Research Portal uses 80+ dedicated database tables (no modifications to core AtoM tables). Key tables include:</w:t>
+        <w:t xml:space="preserve">The Research Portal is designed for accessibility compliance across all screens:</w:t>
       </w:r>
     </w:p>
     <w:p>
       <w:pPr>
         <w:numPr>
           <w:ilvl w:val="0"/>
-          <w:numId w:val="1002"/>
+          <w:numId w:val="1008"/>
         </w:numPr>
         <w:pStyle w:val="Compact"/>
       </w:pPr>
       <w:r>
-        <w:t xml:space="preserve">Researcher management (registration, types, audit)</w:t>
+        <w:rPr>
+          <w:bCs/>
+          <w:b/>
+        </w:rPr>
+        <w:t xml:space="preserve">Skip navigation</w:t>
+      </w:r>
+      <w:r>
+        <w:t xml:space="preserve"> </w:t>
+      </w:r>
+      <w:r>
+        <w:t xml:space="preserve">on every page for keyboard and screen reader users</w:t>
       </w:r>
     </w:p>
     <w:p>
       <w:pPr>
         <w:numPr>
           <w:ilvl w:val="0"/>
-          <w:numId w:val="1002"/>
+          <w:numId w:val="1008"/>
         </w:numPr>
         <w:pStyle w:val="Compact"/>
       </w:pPr>
       <w:r>
-        <w:t xml:space="preserve">Reading room configuration (rooms, seats, bookings, equipment, equipment maintenance)</w:t>
+        <w:rPr>
+          <w:bCs/>
+          <w:b/>
+        </w:rPr>
+        <w:t xml:space="preserve">ARIA live regions</w:t>
+      </w:r>
+      <w:r>
+        <w:t xml:space="preserve"> </w:t>
+      </w:r>
+      <w:r>
+        <w:t xml:space="preserve">announce dynamic content changes to screen readers</w:t>
       </w:r>
     </w:p>
     <w:p>
       <w:pPr>
         <w:numPr>
           <w:ilvl w:val="0"/>
-          <w:numId w:val="1002"/>
+          <w:numId w:val="1008"/>
         </w:numPr>
         <w:pStyle w:val="Compact"/>
       </w:pPr>
       <w:r>
-        <w:t xml:space="preserve">Material requests (retrieval queue, scheduling, status history)</w:t>
+        <w:rPr>
+          <w:bCs/>
+          <w:b/>
+        </w:rPr>
+        <w:t xml:space="preserve">Data tables</w:t>
+      </w:r>
+      <w:r>
+        <w:t xml:space="preserve"> </w:t>
+      </w:r>
+      <w:r>
+        <w:t xml:space="preserve">with proper headers, captions, and scope attributes</w:t>
       </w:r>
     </w:p>
     <w:p>
       <w:pPr>
         <w:numPr>
           <w:ilvl w:val="0"/>
-          <w:numId w:val="1002"/>
+          <w:numId w:val="1008"/>
         </w:numPr>
         <w:pStyle w:val="Compact"/>
       </w:pPr>
       <w:r>
-        <w:t xml:space="preserve">Custody tracking (handoff records, Spectrum movement integration)</w:t>
+        <w:rPr>
+          <w:bCs/>
+          <w:b/>
+        </w:rPr>
+        <w:t xml:space="preserve">Status badges</w:t>
+      </w:r>
+      <w:r>
+        <w:t xml:space="preserve"> </w:t>
+      </w:r>
+      <w:r>
+        <w:t xml:space="preserve">use icons and text alongside colour (never colour alone)</w:t>
       </w:r>
     </w:p>
     <w:p>
       <w:pPr>
         <w:numPr>
           <w:ilvl w:val="0"/>
-          <w:numId w:val="1002"/>
+          <w:numId w:val="1008"/>
         </w:numPr>
         <w:pStyle w:val="Compact"/>
       </w:pPr>
       <w:r>
-        <w:t xml:space="preserve">Reproduction workflow (requests, items, files, invoices)</w:t>
+        <w:rPr>
+          <w:bCs/>
+          <w:b/>
+        </w:rPr>
+        <w:t xml:space="preserve">Keyboard navigation</w:t>
+      </w:r>
+      <w:r>
+        <w:t xml:space="preserve"> </w:t>
+      </w:r>
+      <w:r>
+        <w:t xml:space="preserve">for all interactive elements with visible focus indicators</w:t>
       </w:r>
     </w:p>
     <w:p>
       <w:pPr>
         <w:numPr>
           <w:ilvl w:val="0"/>
-          <w:numId w:val="1002"/>
+          <w:numId w:val="1008"/>
         </w:numPr>
         <w:pStyle w:val="Compact"/>
       </w:pPr>
       <w:r>
-        <w:t xml:space="preserve">Correspondence (threaded messaging with internal notes)</w:t>
+        <w:rPr>
+          <w:bCs/>
+          <w:b/>
+        </w:rPr>
+        <w:t xml:space="preserve">Form validation</w:t>
+      </w:r>
+      <w:r>
+        <w:t xml:space="preserve"> </w:t>
+      </w:r>
+      <w:r>
+        <w:t xml:space="preserve">with programmatic error association and alert roles</w:t>
       </w:r>
     </w:p>
     <w:p>
       <w:pPr>
         <w:numPr>
           <w:ilvl w:val="0"/>
-          <w:numId w:val="1002"/>
+          <w:numId w:val="1008"/>
         </w:numPr>
         <w:pStyle w:val="Compact"/>
       </w:pPr>
       <w:r>
-        <w:t xml:space="preserve">Collections, annotations, projects, workspaces</w:t>
-      </w:r>
-    </w:p>
-    <w:p>
-      <w:pPr>
-        <w:numPr>
-          <w:ilvl w:val="0"/>
-          <w:numId w:val="1002"/>
-        </w:numPr>
-        <w:pStyle w:val="Compact"/>
-      </w:pPr>
-      <w:r>
-        <w:t xml:space="preserve">AI extraction, validation, entity resolution</w:t>
-      </w:r>
-    </w:p>
-    <w:p>
-      <w:pPr>
-        <w:numPr>
-          <w:ilvl w:val="0"/>
-          <w:numId w:val="1002"/>
-        </w:numPr>
-        <w:pStyle w:val="Compact"/>
-      </w:pPr>
-      <w:r>
-        <w:t xml:space="preserve">Reports, snapshots, bibliographies</w:t>
-      </w:r>
-    </w:p>
-    <w:p>
-      <w:pPr>
-        <w:numPr>
-          <w:ilvl w:val="0"/>
-          <w:numId w:val="1002"/>
-        </w:numPr>
-        <w:pStyle w:val="Compact"/>
-      </w:pPr>
-      <w:r>
-        <w:t xml:space="preserve">ODRL policies and access decisions (enforcement audit trail)</w:t>
-      </w:r>
-    </w:p>
-    <w:p>
-      <w:pPr>
-        <w:numPr>
-          <w:ilvl w:val="0"/>
-          <w:numId w:val="1002"/>
-        </w:numPr>
-        <w:pStyle w:val="Compact"/>
-      </w:pPr>
-      <w:r>
-        <w:t xml:space="preserve">API keys (integrated with central ahg_api_key table)</w:t>
-      </w:r>
-    </w:p>
-    <w:p>
-      <w:pPr>
-        <w:numPr>
-          <w:ilvl w:val="0"/>
-          <w:numId w:val="1002"/>
-        </w:numPr>
-        <w:pStyle w:val="Compact"/>
-      </w:pPr>
-      <w:r>
-        <w:t xml:space="preserve">Notification preferences and activity log</w:t>
-      </w:r>
-    </w:p>
-    <w:p>
-      <w:pPr>
-        <w:numPr>
-          <w:ilvl w:val="0"/>
-          <w:numId w:val="1002"/>
-        </w:numPr>
-        <w:pStyle w:val="Compact"/>
-      </w:pPr>
-      <w:r>
-        <w:t xml:space="preserve">Dropdown Manager seed data (7 taxonomies: seat_type, booking_status, researcher_status, researcher_type, material_request_status, reproduction_type, reproduction_request_status, equipment_type)</w:t>
+        <w:rPr>
+          <w:bCs/>
+          <w:b/>
+        </w:rPr>
+        <w:t xml:space="preserve">Decorative icons</w:t>
+      </w:r>
+      <w:r>
+        <w:t xml:space="preserve"> </w:t>
+      </w:r>
+      <w:r>
+        <w:t xml:space="preserve">hidden from screen readers via</w:t>
+      </w:r>
+      <w:r>
+        <w:t xml:space="preserve"> </w:t>
+      </w:r>
+      <w:r>
+        <w:rPr>
+          <w:rStyle w:val="VerbatimChar"/>
+        </w:rPr>
+        <w:t xml:space="preserve">aria-hidden</w:t>
       </w:r>
     </w:p>
     <w:p>
@@ -4347,164 +6521,239 @@
         </w:pict>
       </w:r>
     </w:p>
-    <w:bookmarkEnd w:id="41"/>
-    <w:bookmarkStart w:id="42" w:name="getting-started"/>
+    <w:bookmarkEnd w:id="52"/>
+    <w:bookmarkStart w:id="53" w:name="compliance-and-standards"/>
     <w:p>
       <w:pPr>
         <w:pStyle w:val="Heading2"/>
       </w:pPr>
       <w:r>
-        <w:t xml:space="preserve">Getting Started</w:t>
-      </w:r>
-    </w:p>
-    <w:p>
-      <w:pPr>
-        <w:numPr>
-          <w:ilvl w:val="0"/>
-          <w:numId w:val="1003"/>
-        </w:numPr>
-        <w:pStyle w:val="Compact"/>
-      </w:pPr>
-      <w:r>
-        <w:rPr>
-          <w:bCs/>
-          <w:b/>
-        </w:rPr>
-        <w:t xml:space="preserve">Install</w:t>
-      </w:r>
-      <w:r>
-        <w:t xml:space="preserve"> </w:t>
-      </w:r>
-      <w:r>
-        <w:t xml:space="preserve">the ahgResearchPlugin via the AtoM Heratio Extension Manager</w:t>
-      </w:r>
-    </w:p>
-    <w:p>
-      <w:pPr>
-        <w:numPr>
-          <w:ilvl w:val="0"/>
-          <w:numId w:val="1003"/>
-        </w:numPr>
-        <w:pStyle w:val="Compact"/>
-      </w:pPr>
-      <w:r>
-        <w:rPr>
-          <w:bCs/>
-          <w:b/>
-        </w:rPr>
-        <w:t xml:space="preserve">Run</w:t>
-      </w:r>
-      <w:r>
-        <w:t xml:space="preserve"> </w:t>
-      </w:r>
-      <w:r>
-        <w:t xml:space="preserve">the database migration (</w:t>
-      </w:r>
-      <w:r>
-        <w:rPr>
-          <w:rStyle w:val="VerbatimChar"/>
-        </w:rPr>
-        <w:t xml:space="preserve">database/install.sql</w:t>
-      </w:r>
-      <w:r>
-        <w:t xml:space="preserve"> </w:t>
-      </w:r>
-      <w:r>
-        <w:t xml:space="preserve">+ migration files)</w:t>
-      </w:r>
-    </w:p>
-    <w:p>
-      <w:pPr>
-        <w:numPr>
-          <w:ilvl w:val="0"/>
-          <w:numId w:val="1003"/>
-        </w:numPr>
-        <w:pStyle w:val="Compact"/>
-      </w:pPr>
-      <w:r>
-        <w:rPr>
-          <w:bCs/>
-          <w:b/>
-        </w:rPr>
-        <w:t xml:space="preserve">Configure</w:t>
-      </w:r>
-      <w:r>
-        <w:t xml:space="preserve"> </w:t>
-      </w:r>
-      <w:r>
-        <w:t xml:space="preserve">reading rooms, researcher types, and SLA policies via Admin &gt; AHG Settings</w:t>
-      </w:r>
-    </w:p>
-    <w:p>
-      <w:pPr>
-        <w:numPr>
-          <w:ilvl w:val="0"/>
-          <w:numId w:val="1003"/>
-        </w:numPr>
-        <w:pStyle w:val="Compact"/>
-      </w:pPr>
-      <w:r>
-        <w:rPr>
-          <w:bCs/>
-          <w:b/>
-        </w:rPr>
-        <w:t xml:space="preserve">Enable</w:t>
-      </w:r>
-      <w:r>
-        <w:t xml:space="preserve"> </w:t>
-      </w:r>
-      <w:r>
-        <w:t xml:space="preserve">the</w:t>
-      </w:r>
-      <w:r>
-        <w:t xml:space="preserve"> </w:t>
-      </w:r>
-      <w:r>
-        <w:t xml:space="preserve">“</w:t>
-      </w:r>
-      <w:r>
-        <w:t xml:space="preserve">Research</w:t>
-      </w:r>
-      <w:r>
-        <w:t xml:space="preserve">”</w:t>
-      </w:r>
-      <w:r>
-        <w:t xml:space="preserve"> </w:t>
-      </w:r>
-      <w:r>
-        <w:t xml:space="preserve">menu in Admin &gt; Menus</w:t>
-      </w:r>
-    </w:p>
-    <w:p>
-      <w:pPr>
-        <w:numPr>
-          <w:ilvl w:val="0"/>
-          <w:numId w:val="1003"/>
-        </w:numPr>
-        <w:pStyle w:val="Compact"/>
-      </w:pPr>
-      <w:r>
-        <w:rPr>
-          <w:bCs/>
-          <w:b/>
-        </w:rPr>
-        <w:t xml:space="preserve">Test</w:t>
-      </w:r>
-      <w:r>
-        <w:t xml:space="preserve"> </w:t>
-      </w:r>
-      <w:r>
-        <w:t xml:space="preserve">by registering a researcher account and creating a booking</w:t>
-      </w:r>
-    </w:p>
-    <w:p>
-      <w:pPr>
-        <w:pStyle w:val="FirstParagraph"/>
-      </w:pPr>
-      <w:r>
-        <w:t xml:space="preserve">For detailed setup instructions, see the full Training Manual (included).</w:t>
-      </w:r>
-    </w:p>
+        <w:t xml:space="preserve">Compliance and Standards</w:t>
+      </w:r>
+    </w:p>
+    <w:tbl>
+      <w:tblPr>
+        <w:tblStyle w:val="Table"/>
+        <w:tblW w:type="pct" w:w="5000"/>
+        <w:tblLook w:firstRow="1" w:lastRow="0" w:firstColumn="0" w:lastColumn="0" w:noHBand="0" w:noVBand="0" w:val="0020"/>
+        <w:jc w:val="start"/>
+      </w:tblPr>
+      <w:tblGrid>
+        <w:gridCol w:w="3960"/>
+        <w:gridCol w:w="3960"/>
+      </w:tblGrid>
+      <w:tr>
+        <w:trPr>
+          <w:tblHeader w:val="true"/>
+        </w:trPr>
+        <w:tc>
+          <w:tcPr/>
+          <w:p>
+            <w:pPr>
+              <w:pStyle w:val="Compact"/>
+              <w:jc w:val="left"/>
+            </w:pPr>
+            <w:r>
+              <w:t xml:space="preserve">Standard</w:t>
+            </w:r>
+          </w:p>
+        </w:tc>
+        <w:tc>
+          <w:tcPr/>
+          <w:p>
+            <w:pPr>
+              <w:pStyle w:val="Compact"/>
+              <w:jc w:val="left"/>
+            </w:pPr>
+            <w:r>
+              <w:t xml:space="preserve">Coverage</w:t>
+            </w:r>
+          </w:p>
+        </w:tc>
+      </w:tr>
+      <w:tr>
+        <w:tc>
+          <w:tcPr/>
+          <w:p>
+            <w:pPr>
+              <w:pStyle w:val="Compact"/>
+              <w:jc w:val="left"/>
+            </w:pPr>
+            <w:r>
+              <w:t xml:space="preserve">WCAG 2.1 Level AA</w:t>
+            </w:r>
+          </w:p>
+        </w:tc>
+        <w:tc>
+          <w:tcPr/>
+          <w:p>
+            <w:pPr>
+              <w:pStyle w:val="Compact"/>
+              <w:jc w:val="left"/>
+            </w:pPr>
+            <w:r>
+              <w:t xml:space="preserve">All screens</w:t>
+            </w:r>
+          </w:p>
+        </w:tc>
+      </w:tr>
+      <w:tr>
+        <w:tc>
+          <w:tcPr/>
+          <w:p>
+            <w:pPr>
+              <w:pStyle w:val="Compact"/>
+              <w:jc w:val="left"/>
+            </w:pPr>
+            <w:r>
+              <w:t xml:space="preserve">Spectrum 5.1</w:t>
+            </w:r>
+          </w:p>
+        </w:tc>
+        <w:tc>
+          <w:tcPr/>
+          <w:p>
+            <w:pPr>
+              <w:pStyle w:val="Compact"/>
+              <w:jc w:val="left"/>
+            </w:pPr>
+            <w:r>
+              <w:t xml:space="preserve">Object Location and Movement Control (via custody/movement integration)</w:t>
+            </w:r>
+          </w:p>
+        </w:tc>
+      </w:tr>
+      <w:tr>
+        <w:tc>
+          <w:tcPr/>
+          <w:p>
+            <w:pPr>
+              <w:pStyle w:val="Compact"/>
+              <w:jc w:val="left"/>
+            </w:pPr>
+            <w:r>
+              <w:t xml:space="preserve">W3C Web Annotation</w:t>
+            </w:r>
+          </w:p>
+        </w:tc>
+        <w:tc>
+          <w:tcPr/>
+          <w:p>
+            <w:pPr>
+              <w:pStyle w:val="Compact"/>
+              <w:jc w:val="left"/>
+            </w:pPr>
+            <w:r>
+              <w:t xml:space="preserve">Annotation data model</w:t>
+            </w:r>
+          </w:p>
+        </w:tc>
+      </w:tr>
+      <w:tr>
+        <w:tc>
+          <w:tcPr/>
+          <w:p>
+            <w:pPr>
+              <w:pStyle w:val="Compact"/>
+              <w:jc w:val="left"/>
+            </w:pPr>
+            <w:r>
+              <w:t xml:space="preserve">IIIF</w:t>
+            </w:r>
+          </w:p>
+        </w:tc>
+        <w:tc>
+          <w:tcPr/>
+          <w:p>
+            <w:pPr>
+              <w:pStyle w:val="Compact"/>
+              <w:jc w:val="left"/>
+            </w:pPr>
+            <w:r>
+              <w:t xml:space="preserve">Manifest and annotation interoperability</w:t>
+            </w:r>
+          </w:p>
+        </w:tc>
+      </w:tr>
+      <w:tr>
+        <w:tc>
+          <w:tcPr/>
+          <w:p>
+            <w:pPr>
+              <w:pStyle w:val="Compact"/>
+              <w:jc w:val="left"/>
+            </w:pPr>
+            <w:r>
+              <w:t xml:space="preserve">RO-Crate</w:t>
+            </w:r>
+          </w:p>
+        </w:tc>
+        <w:tc>
+          <w:tcPr/>
+          <w:p>
+            <w:pPr>
+              <w:pStyle w:val="Compact"/>
+              <w:jc w:val="left"/>
+            </w:pPr>
+            <w:r>
+              <w:t xml:space="preserve">Research object packaging</w:t>
+            </w:r>
+          </w:p>
+        </w:tc>
+      </w:tr>
+      <w:tr>
+        <w:tc>
+          <w:tcPr/>
+          <w:p>
+            <w:pPr>
+              <w:pStyle w:val="Compact"/>
+              <w:jc w:val="left"/>
+            </w:pPr>
+            <w:r>
+              <w:t xml:space="preserve">DataCite</w:t>
+            </w:r>
+          </w:p>
+        </w:tc>
+        <w:tc>
+          <w:tcPr/>
+          <w:p>
+            <w:pPr>
+              <w:pStyle w:val="Compact"/>
+              <w:jc w:val="left"/>
+            </w:pPr>
+            <w:r>
+              <w:t xml:space="preserve">DOI minting</w:t>
+            </w:r>
+          </w:p>
+        </w:tc>
+      </w:tr>
+      <w:tr>
+        <w:tc>
+          <w:tcPr/>
+          <w:p>
+            <w:pPr>
+              <w:pStyle w:val="Compact"/>
+              <w:jc w:val="left"/>
+            </w:pPr>
+            <w:r>
+              <w:t xml:space="preserve">ODRL</w:t>
+            </w:r>
+          </w:p>
+        </w:tc>
+        <w:tc>
+          <w:tcPr/>
+          <w:p>
+            <w:pPr>
+              <w:pStyle w:val="Compact"/>
+              <w:jc w:val="left"/>
+            </w:pPr>
+            <w:r>
+              <w:t xml:space="preserve">Digital rights policy language</w:t>
+            </w:r>
+          </w:p>
+        </w:tc>
+      </w:tr>
+    </w:tbl>
     <w:p>
       <w:r>
         <w:pict>
@@ -4512,6 +6761,540 @@
         </w:pict>
       </w:r>
     </w:p>
+    <w:bookmarkEnd w:id="53"/>
+    <w:bookmarkStart w:id="54" w:name="technical-requirements"/>
+    <w:p>
+      <w:pPr>
+        <w:pStyle w:val="Heading2"/>
+      </w:pPr>
+      <w:r>
+        <w:t xml:space="preserve">Technical Requirements</w:t>
+      </w:r>
+    </w:p>
+    <w:tbl>
+      <w:tblPr>
+        <w:tblStyle w:val="Table"/>
+        <w:tblW w:type="auto" w:w="0"/>
+        <w:tblLook w:firstRow="1" w:lastRow="0" w:firstColumn="0" w:lastColumn="0" w:noHBand="0" w:noVBand="0" w:val="0020"/>
+        <w:jc w:val="start"/>
+      </w:tblPr>
+      <w:tblGrid>
+        <w:gridCol w:w="3960"/>
+        <w:gridCol w:w="3960"/>
+      </w:tblGrid>
+      <w:tr>
+        <w:trPr>
+          <w:tblHeader w:val="true"/>
+        </w:trPr>
+        <w:tc>
+          <w:tcPr/>
+          <w:p>
+            <w:pPr>
+              <w:pStyle w:val="Compact"/>
+              <w:jc w:val="left"/>
+            </w:pPr>
+            <w:r>
+              <w:t xml:space="preserve">Requirement</w:t>
+            </w:r>
+          </w:p>
+        </w:tc>
+        <w:tc>
+          <w:tcPr/>
+          <w:p>
+            <w:pPr>
+              <w:pStyle w:val="Compact"/>
+              <w:jc w:val="left"/>
+            </w:pPr>
+            <w:r>
+              <w:t xml:space="preserve">Specification</w:t>
+            </w:r>
+          </w:p>
+        </w:tc>
+      </w:tr>
+      <w:tr>
+        <w:tc>
+          <w:tcPr/>
+          <w:p>
+            <w:pPr>
+              <w:pStyle w:val="Compact"/>
+              <w:jc w:val="left"/>
+            </w:pPr>
+            <w:r>
+              <w:t xml:space="preserve">Platform</w:t>
+            </w:r>
+          </w:p>
+        </w:tc>
+        <w:tc>
+          <w:tcPr/>
+          <w:p>
+            <w:pPr>
+              <w:pStyle w:val="Compact"/>
+              <w:jc w:val="left"/>
+            </w:pPr>
+            <w:r>
+              <w:t xml:space="preserve">AtoM 2.10 with AtoM Heratio Framework v2.8.2+</w:t>
+            </w:r>
+          </w:p>
+        </w:tc>
+      </w:tr>
+      <w:tr>
+        <w:tc>
+          <w:tcPr/>
+          <w:p>
+            <w:pPr>
+              <w:pStyle w:val="Compact"/>
+              <w:jc w:val="left"/>
+            </w:pPr>
+            <w:r>
+              <w:t xml:space="preserve">PHP</w:t>
+            </w:r>
+          </w:p>
+        </w:tc>
+        <w:tc>
+          <w:tcPr/>
+          <w:p>
+            <w:pPr>
+              <w:pStyle w:val="Compact"/>
+              <w:jc w:val="left"/>
+            </w:pPr>
+            <w:r>
+              <w:t xml:space="preserve">8.3+</w:t>
+            </w:r>
+          </w:p>
+        </w:tc>
+      </w:tr>
+      <w:tr>
+        <w:tc>
+          <w:tcPr/>
+          <w:p>
+            <w:pPr>
+              <w:pStyle w:val="Compact"/>
+              <w:jc w:val="left"/>
+            </w:pPr>
+            <w:r>
+              <w:t xml:space="preserve">Database</w:t>
+            </w:r>
+          </w:p>
+        </w:tc>
+        <w:tc>
+          <w:tcPr/>
+          <w:p>
+            <w:pPr>
+              <w:pStyle w:val="Compact"/>
+              <w:jc w:val="left"/>
+            </w:pPr>
+            <w:r>
+              <w:t xml:space="preserve">MySQL 8.0+</w:t>
+            </w:r>
+          </w:p>
+        </w:tc>
+      </w:tr>
+      <w:tr>
+        <w:tc>
+          <w:tcPr/>
+          <w:p>
+            <w:pPr>
+              <w:pStyle w:val="Compact"/>
+              <w:jc w:val="left"/>
+            </w:pPr>
+            <w:r>
+              <w:t xml:space="preserve">Browser</w:t>
+            </w:r>
+          </w:p>
+        </w:tc>
+        <w:tc>
+          <w:tcPr/>
+          <w:p>
+            <w:pPr>
+              <w:pStyle w:val="Compact"/>
+              <w:jc w:val="left"/>
+            </w:pPr>
+            <w:r>
+              <w:t xml:space="preserve">Chrome 90+, Firefox 90+, Safari 14+, Edge 90+</w:t>
+            </w:r>
+          </w:p>
+        </w:tc>
+      </w:tr>
+      <w:tr>
+        <w:tc>
+          <w:tcPr/>
+          <w:p>
+            <w:pPr>
+              <w:pStyle w:val="Compact"/>
+              <w:jc w:val="left"/>
+            </w:pPr>
+            <w:r>
+              <w:t xml:space="preserve">Dependencies</w:t>
+            </w:r>
+          </w:p>
+        </w:tc>
+        <w:tc>
+          <w:tcPr/>
+          <w:p>
+            <w:pPr>
+              <w:pStyle w:val="Compact"/>
+              <w:jc w:val="left"/>
+            </w:pPr>
+            <w:r>
+              <w:t xml:space="preserve">Bootstrap 5 (included), Font Awesome 6 (included)</w:t>
+            </w:r>
+          </w:p>
+        </w:tc>
+      </w:tr>
+    </w:tbl>
+    <w:p>
+      <w:r>
+        <w:pict>
+          <v:rect style="width:0;height:1.5pt" o:hralign="center" o:hrstd="t" o:hr="t"/>
+        </w:pict>
+      </w:r>
+    </w:p>
+    <w:bookmarkEnd w:id="54"/>
+    <w:bookmarkStart w:id="55" w:name="database-footprint"/>
+    <w:p>
+      <w:pPr>
+        <w:pStyle w:val="Heading2"/>
+      </w:pPr>
+      <w:r>
+        <w:t xml:space="preserve">Database Footprint</w:t>
+      </w:r>
+    </w:p>
+    <w:p>
+      <w:pPr>
+        <w:pStyle w:val="FirstParagraph"/>
+      </w:pPr>
+      <w:r>
+        <w:t xml:space="preserve">The Research Portal uses 80+ dedicated database tables (no modifications to core AtoM tables). Key tables include:</w:t>
+      </w:r>
+    </w:p>
+    <w:p>
+      <w:pPr>
+        <w:numPr>
+          <w:ilvl w:val="0"/>
+          <w:numId w:val="1009"/>
+        </w:numPr>
+        <w:pStyle w:val="Compact"/>
+      </w:pPr>
+      <w:r>
+        <w:t xml:space="preserve">Researcher management (registration, types, audit)</w:t>
+      </w:r>
+    </w:p>
+    <w:p>
+      <w:pPr>
+        <w:numPr>
+          <w:ilvl w:val="0"/>
+          <w:numId w:val="1009"/>
+        </w:numPr>
+        <w:pStyle w:val="Compact"/>
+      </w:pPr>
+      <w:r>
+        <w:t xml:space="preserve">Reading room configuration (rooms, seats, bookings, equipment, equipment maintenance)</w:t>
+      </w:r>
+    </w:p>
+    <w:p>
+      <w:pPr>
+        <w:numPr>
+          <w:ilvl w:val="0"/>
+          <w:numId w:val="1009"/>
+        </w:numPr>
+        <w:pStyle w:val="Compact"/>
+      </w:pPr>
+      <w:r>
+        <w:t xml:space="preserve">Material requests (retrieval queue, scheduling, status history)</w:t>
+      </w:r>
+    </w:p>
+    <w:p>
+      <w:pPr>
+        <w:numPr>
+          <w:ilvl w:val="0"/>
+          <w:numId w:val="1009"/>
+        </w:numPr>
+        <w:pStyle w:val="Compact"/>
+      </w:pPr>
+      <w:r>
+        <w:t xml:space="preserve">Custody tracking (handoff records, Spectrum movement integration)</w:t>
+      </w:r>
+    </w:p>
+    <w:p>
+      <w:pPr>
+        <w:numPr>
+          <w:ilvl w:val="0"/>
+          <w:numId w:val="1009"/>
+        </w:numPr>
+        <w:pStyle w:val="Compact"/>
+      </w:pPr>
+      <w:r>
+        <w:t xml:space="preserve">Reproduction workflow (requests, items, files, invoices)</w:t>
+      </w:r>
+    </w:p>
+    <w:p>
+      <w:pPr>
+        <w:numPr>
+          <w:ilvl w:val="0"/>
+          <w:numId w:val="1009"/>
+        </w:numPr>
+        <w:pStyle w:val="Compact"/>
+      </w:pPr>
+      <w:r>
+        <w:t xml:space="preserve">Correspondence (threaded messaging with internal notes)</w:t>
+      </w:r>
+    </w:p>
+    <w:p>
+      <w:pPr>
+        <w:numPr>
+          <w:ilvl w:val="0"/>
+          <w:numId w:val="1009"/>
+        </w:numPr>
+        <w:pStyle w:val="Compact"/>
+      </w:pPr>
+      <w:r>
+        <w:t xml:space="preserve">Collections, annotations, projects, workspaces</w:t>
+      </w:r>
+    </w:p>
+    <w:p>
+      <w:pPr>
+        <w:numPr>
+          <w:ilvl w:val="0"/>
+          <w:numId w:val="1009"/>
+        </w:numPr>
+        <w:pStyle w:val="Compact"/>
+      </w:pPr>
+      <w:r>
+        <w:t xml:space="preserve">AI extraction, validation, entity resolution</w:t>
+      </w:r>
+    </w:p>
+    <w:p>
+      <w:pPr>
+        <w:numPr>
+          <w:ilvl w:val="0"/>
+          <w:numId w:val="1009"/>
+        </w:numPr>
+        <w:pStyle w:val="Compact"/>
+      </w:pPr>
+      <w:r>
+        <w:t xml:space="preserve">Reports, snapshots, bibliographies</w:t>
+      </w:r>
+    </w:p>
+    <w:p>
+      <w:pPr>
+        <w:numPr>
+          <w:ilvl w:val="0"/>
+          <w:numId w:val="1009"/>
+        </w:numPr>
+        <w:pStyle w:val="Compact"/>
+      </w:pPr>
+      <w:r>
+        <w:t xml:space="preserve">ODRL policies and access decisions (enforcement audit trail)</w:t>
+      </w:r>
+    </w:p>
+    <w:p>
+      <w:pPr>
+        <w:numPr>
+          <w:ilvl w:val="0"/>
+          <w:numId w:val="1009"/>
+        </w:numPr>
+        <w:pStyle w:val="Compact"/>
+      </w:pPr>
+      <w:r>
+        <w:t xml:space="preserve">API keys (integrated with central ahg_api_key table)</w:t>
+      </w:r>
+    </w:p>
+    <w:p>
+      <w:pPr>
+        <w:numPr>
+          <w:ilvl w:val="0"/>
+          <w:numId w:val="1009"/>
+        </w:numPr>
+        <w:pStyle w:val="Compact"/>
+      </w:pPr>
+      <w:r>
+        <w:t xml:space="preserve">Notification preferences and activity log</w:t>
+      </w:r>
+    </w:p>
+    <w:p>
+      <w:pPr>
+        <w:numPr>
+          <w:ilvl w:val="0"/>
+          <w:numId w:val="1009"/>
+        </w:numPr>
+        <w:pStyle w:val="Compact"/>
+      </w:pPr>
+      <w:r>
+        <w:t xml:space="preserve">Dropdown Manager seed data (7 taxonomies: seat_type, booking_status, researcher_status, researcher_type, material_request_status, reproduction_type, reproduction_request_status, equipment_type)</w:t>
+      </w:r>
+    </w:p>
+    <w:p>
+      <w:r>
+        <w:pict>
+          <v:rect style="width:0;height:1.5pt" o:hralign="center" o:hrstd="t" o:hr="t"/>
+        </w:pict>
+      </w:r>
+    </w:p>
+    <w:bookmarkEnd w:id="55"/>
+    <w:bookmarkStart w:id="56" w:name="getting-started"/>
+    <w:p>
+      <w:pPr>
+        <w:pStyle w:val="Heading2"/>
+      </w:pPr>
+      <w:r>
+        <w:t xml:space="preserve">Getting Started</w:t>
+      </w:r>
+    </w:p>
+    <w:p>
+      <w:pPr>
+        <w:numPr>
+          <w:ilvl w:val="0"/>
+          <w:numId w:val="1010"/>
+        </w:numPr>
+        <w:pStyle w:val="Compact"/>
+      </w:pPr>
+      <w:r>
+        <w:rPr>
+          <w:bCs/>
+          <w:b/>
+        </w:rPr>
+        <w:t xml:space="preserve">Install</w:t>
+      </w:r>
+      <w:r>
+        <w:t xml:space="preserve"> </w:t>
+      </w:r>
+      <w:r>
+        <w:t xml:space="preserve">the ahgResearchPlugin via the AtoM Heratio Extension Manager</w:t>
+      </w:r>
+    </w:p>
+    <w:p>
+      <w:pPr>
+        <w:numPr>
+          <w:ilvl w:val="0"/>
+          <w:numId w:val="1010"/>
+        </w:numPr>
+        <w:pStyle w:val="Compact"/>
+      </w:pPr>
+      <w:r>
+        <w:rPr>
+          <w:bCs/>
+          <w:b/>
+        </w:rPr>
+        <w:t xml:space="preserve">Run</w:t>
+      </w:r>
+      <w:r>
+        <w:t xml:space="preserve"> </w:t>
+      </w:r>
+      <w:r>
+        <w:t xml:space="preserve">the database migration (</w:t>
+      </w:r>
+      <w:r>
+        <w:rPr>
+          <w:rStyle w:val="VerbatimChar"/>
+        </w:rPr>
+        <w:t xml:space="preserve">database/install.sql</w:t>
+      </w:r>
+      <w:r>
+        <w:t xml:space="preserve"> </w:t>
+      </w:r>
+      <w:r>
+        <w:t xml:space="preserve">+ migration files)</w:t>
+      </w:r>
+    </w:p>
+    <w:p>
+      <w:pPr>
+        <w:numPr>
+          <w:ilvl w:val="0"/>
+          <w:numId w:val="1010"/>
+        </w:numPr>
+        <w:pStyle w:val="Compact"/>
+      </w:pPr>
+      <w:r>
+        <w:rPr>
+          <w:bCs/>
+          <w:b/>
+        </w:rPr>
+        <w:t xml:space="preserve">Configure</w:t>
+      </w:r>
+      <w:r>
+        <w:t xml:space="preserve"> </w:t>
+      </w:r>
+      <w:r>
+        <w:t xml:space="preserve">reading rooms, researcher types, and SLA policies via Admin &gt; AHG Settings</w:t>
+      </w:r>
+    </w:p>
+    <w:p>
+      <w:pPr>
+        <w:numPr>
+          <w:ilvl w:val="0"/>
+          <w:numId w:val="1010"/>
+        </w:numPr>
+        <w:pStyle w:val="Compact"/>
+      </w:pPr>
+      <w:r>
+        <w:rPr>
+          <w:bCs/>
+          <w:b/>
+        </w:rPr>
+        <w:t xml:space="preserve">Enable</w:t>
+      </w:r>
+      <w:r>
+        <w:t xml:space="preserve"> </w:t>
+      </w:r>
+      <w:r>
+        <w:t xml:space="preserve">the</w:t>
+      </w:r>
+      <w:r>
+        <w:t xml:space="preserve"> </w:t>
+      </w:r>
+      <w:r>
+        <w:t xml:space="preserve">“</w:t>
+      </w:r>
+      <w:r>
+        <w:t xml:space="preserve">Research</w:t>
+      </w:r>
+      <w:r>
+        <w:t xml:space="preserve">”</w:t>
+      </w:r>
+      <w:r>
+        <w:t xml:space="preserve"> </w:t>
+      </w:r>
+      <w:r>
+        <w:t xml:space="preserve">menu in Admin &gt; Menus</w:t>
+      </w:r>
+    </w:p>
+    <w:p>
+      <w:pPr>
+        <w:numPr>
+          <w:ilvl w:val="0"/>
+          <w:numId w:val="1010"/>
+        </w:numPr>
+        <w:pStyle w:val="Compact"/>
+      </w:pPr>
+      <w:r>
+        <w:rPr>
+          <w:bCs/>
+          <w:b/>
+        </w:rPr>
+        <w:t xml:space="preserve">Test</w:t>
+      </w:r>
+      <w:r>
+        <w:t xml:space="preserve"> </w:t>
+      </w:r>
+      <w:r>
+        <w:t xml:space="preserve">by registering a researcher account and creating a booking</w:t>
+      </w:r>
+    </w:p>
+    <w:p>
+      <w:pPr>
+        <w:pStyle w:val="FirstParagraph"/>
+      </w:pPr>
+      <w:r>
+        <w:t xml:space="preserve">For detailed setup instructions, see the full Training Manual (included).</w:t>
+      </w:r>
+    </w:p>
+    <w:p>
+      <w:r>
+        <w:pict>
+          <v:rect style="width:0;height:1.5pt" o:hralign="center" o:hrstd="t" o:hr="t"/>
+        </w:pict>
+      </w:r>
+    </w:p>
     <w:p>
       <w:pPr>
         <w:pStyle w:val="FirstParagraph"/>
@@ -4534,8 +7317,8 @@
         <w:t xml:space="preserve">https://theahg.co.za</w:t>
       </w:r>
     </w:p>
-    <w:bookmarkEnd w:id="42"/>
-    <w:bookmarkEnd w:id="43"/>
+    <w:bookmarkEnd w:id="56"/>
+    <w:bookmarkEnd w:id="57"/>
     <w:sectPr/>
   </w:body>
 </w:document>
@@ -4813,6 +7596,27 @@
     <w:abstractNumId w:val="991"/>
   </w:num>
   <w:num w:numId="1003">
+    <w:abstractNumId w:val="991"/>
+  </w:num>
+  <w:num w:numId="1004">
+    <w:abstractNumId w:val="991"/>
+  </w:num>
+  <w:num w:numId="1005">
+    <w:abstractNumId w:val="991"/>
+  </w:num>
+  <w:num w:numId="1006">
+    <w:abstractNumId w:val="991"/>
+  </w:num>
+  <w:num w:numId="1007">
+    <w:abstractNumId w:val="991"/>
+  </w:num>
+  <w:num w:numId="1008">
+    <w:abstractNumId w:val="991"/>
+  </w:num>
+  <w:num w:numId="1009">
+    <w:abstractNumId w:val="991"/>
+  </w:num>
+  <w:num w:numId="1010">
     <w:abstractNumId w:val="99411"/>
     <w:lvlOverride w:ilvl="0">
       <w:startOverride w:val="1"/>

</xml_diff>